<commit_message>
Update simulation to feature Coco the Black Pug with manual playback control and customized scenarios
</commit_message>
<xml_diff>
--- a/Graph_That_Motion_Student_Handout.docx
+++ b/Graph_That_Motion_Student_Handout.docx
@@ -13,7 +13,7 @@
           <w:color w:val="0F7E9B"/>
           <w:sz w:val="40"/>
         </w:rPr>
-        <w:t>Graph That Motion — Student Investigation Handout</w:t>
+        <w:t>Graph That Motion — Coco's Kinematics Adventure</w:t>
       </w:r>
     </w:p>
     <w:p>
@@ -82,7 +82,7 @@
                 <w:color w:val="1E293B"/>
                 <w:sz w:val="20"/>
               </w:rPr>
-              <w:t>• Translate between physical motion, ticker-tape motion maps, Position-Time (x-t), and Velocity-Time (v-t) graphs.</w:t>
+              <w:t>• Translate between physical motion, ticker-tape motion maps (pawprint dots), Position-Time (x-t), and Velocity-Time (v-t) graphs.</w:t>
             </w:r>
           </w:p>
           <w:p>
@@ -155,7 +155,7 @@
         <w:rPr>
           <w:color w:val="1E293B"/>
         </w:rPr>
-        <w:t>A motion map drops an amber dot at fixed time intervals (Δt = 0.30 s):</w:t>
+        <w:t>Coco drops an amber pawprint dot at fixed time intervals (Δt = 0.30 s):</w:t>
         <w:br/>
       </w:r>
       <w:r>
@@ -175,7 +175,7 @@
         <w:t xml:space="preserve">• Speeding Up: </w:t>
       </w:r>
       <w:r>
-        <w:t>Dots spread progressively further apart.</w:t>
+        <w:t>Dots spread progressively further apart as Coco bolts forward.</w:t>
         <w:br/>
       </w:r>
       <w:r>
@@ -185,7 +185,7 @@
         <w:t xml:space="preserve">• Slowing Down: </w:t>
       </w:r>
       <w:r>
-        <w:t>Dots bunch progressively closer together.</w:t>
+        <w:t>Dots bunch progressively closer together as Coco brakes.</w:t>
         <w:br/>
       </w:r>
       <w:r>
@@ -195,7 +195,7 @@
         <w:t xml:space="preserve">• Stationary (At Rest): </w:t>
       </w:r>
       <w:r>
-        <w:t>Dots cluster and stack vertically at the same location.</w:t>
+        <w:t>Dots cluster and stack vertically while Coco sits or sniffs the ground.</w:t>
       </w:r>
     </w:p>
     <w:p>
@@ -218,7 +218,7 @@
         <w:spacing w:after="120"/>
       </w:pPr>
       <w:r>
-        <w:t>Use the simulation to observe all 11 animations. Record the kinematics breakdown for each graph letter below:</w:t>
+        <w:t>Watch Coco's adventures in the simulation. Record the kinematics breakdown for each graph letter below:</w:t>
       </w:r>
     </w:p>
     <w:tbl>
@@ -310,7 +310,7 @@
                 <w:color w:val="FFFFFF"/>
                 <w:sz w:val="19"/>
               </w:rPr>
-              <w:t>Motion Description</w:t>
+              <w:t>Coco's Motion Description</w:t>
             </w:r>
           </w:p>
         </w:tc>
@@ -458,7 +458,7 @@
                 <w:color w:val="1E293B"/>
                 <w:sz w:val="17"/>
               </w:rPr>
-              <w:t>Starts from rest at origin, speeds up moving right.</w:t>
+              <w:t>Coco starts from rest at left, accelerating right.</w:t>
             </w:r>
           </w:p>
         </w:tc>
@@ -616,7 +616,7 @@
                 <w:color w:val="1E293B"/>
                 <w:sz w:val="17"/>
               </w:rPr>
-              <w:t>Moves left at const speed → rest → speeds up right.</w:t>
+              <w:t>Trots left at const speed → pauses to sniff → accelerates right.</w:t>
             </w:r>
           </w:p>
         </w:tc>
@@ -774,7 +774,7 @@
                 <w:color w:val="1E293B"/>
                 <w:sz w:val="17"/>
               </w:rPr>
-              <w:t>Moves left at constant steady speed throughout.</w:t>
+              <w:t>Trots steadily to the left at constant negative speed.</w:t>
             </w:r>
           </w:p>
         </w:tc>
@@ -932,7 +932,7 @@
                 <w:color w:val="1E293B"/>
                 <w:sz w:val="17"/>
               </w:rPr>
-              <w:t>Moves left slowing down → rest → moves left const speed.</w:t>
+              <w:t>Trots left slowing down → pauses to rest → continues trotting left.</w:t>
             </w:r>
           </w:p>
         </w:tc>
@@ -1090,7 +1090,7 @@
                 <w:color w:val="1E293B"/>
                 <w:sz w:val="17"/>
               </w:rPr>
-              <w:t>Moves right at constant steady speed from origin.</w:t>
+              <w:t>Trots smoothly right at constant speed from origin.</w:t>
             </w:r>
           </w:p>
         </w:tc>
@@ -1248,7 +1248,7 @@
                 <w:color w:val="1E293B"/>
                 <w:sz w:val="17"/>
               </w:rPr>
-              <w:t>Speeds up left from rest → rest → moves left const speed.</w:t>
+              <w:t>Sprints left from rest → stops abruptly → walks left at const pace.</w:t>
             </w:r>
           </w:p>
         </w:tc>
@@ -1406,7 +1406,7 @@
                 <w:color w:val="1E293B"/>
                 <w:sz w:val="17"/>
               </w:rPr>
-              <w:t>Moves right const speed → rest → reverses left const speed.</w:t>
+              <w:t>Runs right for a ball → grabs it (rest) → trots back left.</w:t>
             </w:r>
           </w:p>
         </w:tc>
@@ -1564,7 +1564,7 @@
                 <w:color w:val="1E293B"/>
                 <w:sz w:val="17"/>
               </w:rPr>
-              <w:t>Starts fast right, slows down linearly to a complete stop.</w:t>
+              <w:t>Starts in a fast zoomie right, steadily braking to a stop.</w:t>
             </w:r>
           </w:p>
         </w:tc>
@@ -1722,7 +1722,7 @@
                 <w:color w:val="1E293B"/>
                 <w:sz w:val="17"/>
               </w:rPr>
-              <w:t>Starts from rest at far right, speeds up moving left.</w:t>
+              <w:t>Spots squirrel left, accelerating from rest with increasing speed left.</w:t>
             </w:r>
           </w:p>
         </w:tc>
@@ -1880,7 +1880,7 @@
                 <w:color w:val="1E293B"/>
                 <w:sz w:val="17"/>
               </w:rPr>
-              <w:t>Moves right const speed → rest → speeds up moving right.</w:t>
+              <w:t>Walks right at steady pace → pauses → bolts forward in sprint.</w:t>
             </w:r>
           </w:p>
         </w:tc>
@@ -2038,7 +2038,7 @@
                 <w:color w:val="1E293B"/>
                 <w:sz w:val="17"/>
               </w:rPr>
-              <w:t>Starts moving left fast, slows down with steady +a to stop.</w:t>
+              <w:t>Dashes left fast, skidding with positive acceleration to a stop.</w:t>
             </w:r>
           </w:p>
         </w:tc>

</xml_diff>

<commit_message>
Completely redesigned Kinematics Studio with 100% original scenarios and modern science UI/UX
</commit_message>
<xml_diff>
--- a/Graph_That_Motion_Student_Handout.docx
+++ b/Graph_That_Motion_Student_Handout.docx
@@ -4,30 +4,43 @@
   <w:body>
     <w:p>
       <w:pPr>
-        <w:spacing w:before="0" w:after="40"/>
+        <w:spacing w:after="40"/>
+      </w:pPr>
+      <w:r>
+        <w:rPr>
+          <w:rFonts w:ascii="Arial" w:hAnsi="Arial"/>
+          <w:b/>
+          <w:color w:val="D67B19"/>
+          <w:sz w:val="17"/>
+        </w:rPr>
+        <w:t>THE THINKING EXPERIMENT | KINEMATICS STUDIO</w:t>
+      </w:r>
+    </w:p>
+    <w:p>
+      <w:pPr>
+        <w:spacing w:after="80"/>
       </w:pPr>
       <w:r>
         <w:rPr>
           <w:rFonts w:ascii="Arial" w:hAnsi="Arial"/>
           <w:b/>
           <w:color w:val="0F7E9B"/>
-          <w:sz w:val="40"/>
+          <w:sz w:val="36"/>
         </w:rPr>
-        <w:t>Graph That Motion — Coco's Kinematics Adventure</w:t>
+        <w:t>Kinematics Studio: Coco's Motion Lab</w:t>
       </w:r>
     </w:p>
     <w:p>
       <w:pPr>
-        <w:spacing w:before="0" w:after="240"/>
+        <w:spacing w:after="240"/>
       </w:pPr>
       <w:r>
         <w:rPr>
           <w:rFonts w:ascii="Arial" w:hAnsi="Arial"/>
-          <w:b/>
-          <w:color w:val="D67B19"/>
-          <w:sz w:val="22"/>
+          <w:color w:val="64748B"/>
+          <w:sz w:val="20"/>
         </w:rPr>
-        <w:t>The Thinking Experiment | PhysicsKit Kinematics Module</w:t>
+        <w:t>Student Inquiry &amp; Graphical Analysis Worksheet</w:t>
       </w:r>
     </w:p>
     <w:tbl>
@@ -38,90 +51,84 @@
         <w:tblLook w:firstColumn="1" w:firstRow="1" w:lastColumn="0" w:lastRow="0" w:noHBand="0" w:noVBand="1" w:val="04A0"/>
       </w:tblPr>
       <w:tblGrid>
-        <w:gridCol w:w="10080"/>
+        <w:gridCol w:w="9792"/>
       </w:tblGrid>
       <w:tr>
         <w:tc>
           <w:tcPr>
-            <w:tcW w:type="dxa" w:w="9360"/>
-            <w:shd w:fill="E6F4F8"/>
-            <w:tcBorders>
-              <w:top w:val="none"/>
-              <w:left w:val="single" w:sz="24" w:color="0F7E9B"/>
-              <w:bottom w:val="none"/>
-              <w:right w:val="none"/>
-            </w:tcBorders>
+            <w:tcW w:type="dxa" w:w="10080"/>
+            <w:shd w:val="clear" w:color="auto" w:fill="E6F4F8"/>
             <w:tcMar>
               <w:top w:w="140" w:type="dxa"/>
               <w:bottom w:w="140" w:type="dxa"/>
-              <w:left w:w="200" w:type="dxa"/>
+              <w:left w:w="180" w:type="dxa"/>
               <w:right w:w="180" w:type="dxa"/>
             </w:tcMar>
           </w:tcPr>
           <w:p>
             <w:pPr>
-              <w:spacing w:before="0" w:after="80"/>
+              <w:spacing w:after="80"/>
             </w:pPr>
             <w:r>
               <w:rPr>
                 <w:rFonts w:ascii="Arial" w:hAnsi="Arial"/>
                 <w:b/>
                 <w:color w:val="0F7E9B"/>
-                <w:sz w:val="22"/>
+                <w:sz w:val="21"/>
               </w:rPr>
               <w:t>🎯 Learning Objectives</w:t>
             </w:r>
           </w:p>
           <w:p>
             <w:pPr>
-              <w:spacing w:before="40" w:after="40"/>
+              <w:spacing w:after="40"/>
             </w:pPr>
             <w:r>
               <w:rPr>
                 <w:rFonts w:ascii="Arial" w:hAnsi="Arial"/>
                 <w:color w:val="1E293B"/>
-                <w:sz w:val="20"/>
+                <w:sz w:val="19"/>
               </w:rPr>
-              <w:t>• Translate between physical motion, ticker-tape motion maps (pawprint dots), Position-Time (x-t), and Velocity-Time (v-t) graphs.</w:t>
+              <w:t>• Translate between 1D dog motions, directional pawprint motion maps, Position-Time (x-t), and Velocity-Time (v-t) graphs.</w:t>
             </w:r>
           </w:p>
           <w:p>
             <w:pPr>
-              <w:spacing w:before="40" w:after="40"/>
+              <w:spacing w:after="40"/>
             </w:pPr>
             <w:r>
               <w:rPr>
                 <w:rFonts w:ascii="Arial" w:hAnsi="Arial"/>
                 <w:color w:val="1E293B"/>
-                <w:sz w:val="20"/>
+                <w:sz w:val="19"/>
               </w:rPr>
               <w:t>• Apply slope rules: Slope of x-t = Velocity (v); Slope of v-t = Acceleration (a).</w:t>
             </w:r>
           </w:p>
           <w:p>
             <w:pPr>
-              <w:spacing w:before="40" w:after="40"/>
+              <w:spacing w:after="40"/>
             </w:pPr>
             <w:r>
               <w:rPr>
                 <w:rFonts w:ascii="Arial" w:hAnsi="Arial"/>
                 <w:color w:val="1E293B"/>
-                <w:sz w:val="20"/>
+                <w:sz w:val="19"/>
               </w:rPr>
-              <w:t>• Recognize that flat horizontal lines mean constant value (at rest on x-t; steady speed on v-t).</w:t>
+              <w:t>• Distinguish between parabolic curved trajectories (changing speed) and linear segments (constant speed).</w:t>
             </w:r>
           </w:p>
           <w:p>
             <w:pPr>
-              <w:spacing w:before="40" w:after="40"/>
+              <w:spacing w:after="40"/>
             </w:pPr>
             <w:r>
               <w:rPr>
                 <w:rFonts w:ascii="Arial" w:hAnsi="Arial"/>
                 <w:color w:val="1E293B"/>
-                <w:sz w:val="20"/>
+                <w:sz w:val="19"/>
               </w:rPr>
-              <w:t>• Relate curved parabolic shapes on x-t graphs to changing velocity (non-zero acceleration).</w:t>
+              <w:t>• Relate motion map pawprint density to acceleration (widening spacing = speeding up; bunching spacing = slowing down).</w:t>
             </w:r>
           </w:p>
         </w:tc>
@@ -129,22 +136,22 @@
     </w:tbl>
     <w:p>
       <w:pPr>
-        <w:spacing w:after="80"/>
+        <w:spacing w:after="120"/>
       </w:pPr>
     </w:p>
     <w:p>
       <w:pPr>
         <w:keepNext/>
-        <w:spacing w:before="280" w:after="120"/>
+        <w:spacing w:before="280" w:after="80"/>
       </w:pPr>
       <w:r>
         <w:rPr>
           <w:rFonts w:ascii="Arial" w:hAnsi="Arial"/>
           <w:b/>
           <w:color w:val="0F7E9B"/>
-          <w:sz w:val="26"/>
+          <w:sz w:val="28"/>
         </w:rPr>
-        <w:t>🧭 Motion Map Interpretation Key</w:t>
+        <w:t>🧭 Motion Map Interpretation Key (Pawprint Trail)</w:t>
       </w:r>
     </w:p>
     <w:p>
@@ -155,7 +162,7 @@
         <w:rPr>
           <w:color w:val="1E293B"/>
         </w:rPr>
-        <w:t>Coco drops an amber pawprint dot at fixed time intervals (Δt = 0.30 s):</w:t>
+        <w:t>Coco drops an amber pawprint at fixed time intervals (Δt = 0.28 s):</w:t>
         <w:br/>
       </w:r>
       <w:r>
@@ -165,7 +172,7 @@
         <w:t xml:space="preserve">• Constant Velocity: </w:t>
       </w:r>
       <w:r>
-        <w:t>Dots are evenly spaced along the track.</w:t>
+        <w:t>Pawprints are evenly spaced along the runway.</w:t>
         <w:br/>
       </w:r>
       <w:r>
@@ -175,7 +182,7 @@
         <w:t xml:space="preserve">• Speeding Up: </w:t>
       </w:r>
       <w:r>
-        <w:t>Dots spread progressively further apart as Coco bolts forward.</w:t>
+        <w:t>Pawprints spread progressively further apart as Coco accelerates.</w:t>
         <w:br/>
       </w:r>
       <w:r>
@@ -185,7 +192,7 @@
         <w:t xml:space="preserve">• Slowing Down: </w:t>
       </w:r>
       <w:r>
-        <w:t>Dots bunch progressively closer together as Coco brakes.</w:t>
+        <w:t>Pawprints bunch progressively closer together as Coco brakes.</w:t>
         <w:br/>
       </w:r>
       <w:r>
@@ -195,22 +202,22 @@
         <w:t xml:space="preserve">• Stationary (At Rest): </w:t>
       </w:r>
       <w:r>
-        <w:t>Dots cluster and stack vertically while Coco sits or sniffs the ground.</w:t>
+        <w:t>Pawprints cluster and stack vertically at the exact rest position.</w:t>
       </w:r>
     </w:p>
     <w:p>
       <w:pPr>
         <w:keepNext/>
-        <w:spacing w:before="280" w:after="120"/>
+        <w:spacing w:before="280" w:after="80"/>
       </w:pPr>
       <w:r>
         <w:rPr>
           <w:rFonts w:ascii="Arial" w:hAnsi="Arial"/>
           <w:b/>
           <w:color w:val="0F7E9B"/>
-          <w:sz w:val="26"/>
+          <w:sz w:val="28"/>
         </w:rPr>
-        <w:t>📝 Part 1: Graph Matching Reference Matrix</w:t>
+        <w:t>📝 Part 1: Mission Matching Reference Matrix</w:t>
       </w:r>
     </w:p>
     <w:p>
@@ -218,7 +225,7 @@
         <w:spacing w:after="120"/>
       </w:pPr>
       <w:r>
-        <w:t>Watch Coco's adventures in the simulation. Record the kinematics breakdown for each graph letter below:</w:t>
+        <w:t>Observe Coco's 10 kinematic missions in the interactive simulator. Record the motion parameters for each card below:</w:t>
       </w:r>
     </w:p>
     <w:tbl>
@@ -239,7 +246,7 @@
         <w:tc>
           <w:tcPr>
             <w:tcW w:type="dxa" w:w="1008"/>
-            <w:shd w:fill="0F7E9B"/>
+            <w:shd w:val="clear" w:color="auto" w:fill="0F7E9B"/>
             <w:tcMar>
               <w:top w:w="100" w:type="dxa"/>
               <w:bottom w:w="100" w:type="dxa"/>
@@ -258,14 +265,14 @@
                 <w:color w:val="FFFFFF"/>
                 <w:sz w:val="19"/>
               </w:rPr>
-              <w:t>Graph</w:t>
+              <w:t>Card</w:t>
             </w:r>
           </w:p>
         </w:tc>
         <w:tc>
           <w:tcPr>
             <w:tcW w:type="dxa" w:w="1728"/>
-            <w:shd w:fill="0F7E9B"/>
+            <w:shd w:val="clear" w:color="auto" w:fill="0F7E9B"/>
             <w:tcMar>
               <w:top w:w="100" w:type="dxa"/>
               <w:bottom w:w="100" w:type="dxa"/>
@@ -284,14 +291,14 @@
                 <w:color w:val="FFFFFF"/>
                 <w:sz w:val="19"/>
               </w:rPr>
-              <w:t>Type</w:t>
+              <w:t>Graph Type</w:t>
             </w:r>
           </w:p>
         </w:tc>
         <w:tc>
           <w:tcPr>
             <w:tcW w:type="dxa" w:w="3744"/>
-            <w:shd w:fill="0F7E9B"/>
+            <w:shd w:val="clear" w:color="auto" w:fill="0F7E9B"/>
             <w:tcMar>
               <w:top w:w="100" w:type="dxa"/>
               <w:bottom w:w="100" w:type="dxa"/>
@@ -310,14 +317,14 @@
                 <w:color w:val="FFFFFF"/>
                 <w:sz w:val="19"/>
               </w:rPr>
-              <w:t>Coco's Motion Description</w:t>
+              <w:t>Mission Story &amp; Motion Description</w:t>
             </w:r>
           </w:p>
         </w:tc>
         <w:tc>
           <w:tcPr>
             <w:tcW w:type="dxa" w:w="1296"/>
-            <w:shd w:fill="0F7E9B"/>
+            <w:shd w:val="clear" w:color="auto" w:fill="0F7E9B"/>
             <w:tcMar>
               <w:top w:w="100" w:type="dxa"/>
               <w:bottom w:w="100" w:type="dxa"/>
@@ -336,14 +343,14 @@
                 <w:color w:val="FFFFFF"/>
                 <w:sz w:val="19"/>
               </w:rPr>
-              <w:t>Dir (+ / -)</w:t>
+              <w:t>Initial Dir</w:t>
             </w:r>
           </w:p>
         </w:tc>
         <w:tc>
           <w:tcPr>
             <w:tcW w:type="dxa" w:w="1584"/>
-            <w:shd w:fill="0F7E9B"/>
+            <w:shd w:val="clear" w:color="auto" w:fill="0F7E9B"/>
             <w:tcMar>
               <w:top w:w="100" w:type="dxa"/>
               <w:bottom w:w="100" w:type="dxa"/>
@@ -362,7 +369,7 @@
                 <w:color w:val="FFFFFF"/>
                 <w:sz w:val="19"/>
               </w:rPr>
-              <w:t>Speed State</w:t>
+              <w:t>Kinematic State</w:t>
             </w:r>
           </w:p>
         </w:tc>
@@ -371,19 +378,12 @@
         <w:tc>
           <w:tcPr>
             <w:tcW w:type="dxa" w:w="1008"/>
-            <w:shd w:fill="F8FAFC"/>
             <w:tcMar>
-              <w:top w:w="80" w:type="dxa"/>
-              <w:bottom w:w="80" w:type="dxa"/>
-              <w:left w:w="100" w:type="dxa"/>
-              <w:right w:w="100" w:type="dxa"/>
+              <w:top w:w="70" w:type="dxa"/>
+              <w:bottom w:w="70" w:type="dxa"/>
+              <w:left w:w="90" w:type="dxa"/>
+              <w:right w:w="90" w:type="dxa"/>
             </w:tcMar>
-            <w:tcBorders>
-              <w:top w:val="single" w:sz="4" w:color="CBD5E1"/>
-              <w:left w:val="single" w:sz="4" w:color="CBD5E1"/>
-              <w:bottom w:val="single" w:sz="4" w:color="CBD5E1"/>
-              <w:right w:val="single" w:sz="4" w:color="CBD5E1"/>
-            </w:tcBorders>
           </w:tcPr>
           <w:p>
             <w:pPr>
@@ -394,28 +394,21 @@
                 <w:rFonts w:ascii="Arial" w:hAnsi="Arial"/>
                 <w:b/>
                 <w:color w:val="0F7E9B"/>
-                <w:sz w:val="17"/>
+                <w:sz w:val="18"/>
               </w:rPr>
-              <w:t>A</w:t>
+              <w:t>#1</w:t>
             </w:r>
           </w:p>
         </w:tc>
         <w:tc>
           <w:tcPr>
             <w:tcW w:type="dxa" w:w="1728"/>
-            <w:shd w:fill="F8FAFC"/>
             <w:tcMar>
-              <w:top w:w="80" w:type="dxa"/>
-              <w:bottom w:w="80" w:type="dxa"/>
-              <w:left w:w="100" w:type="dxa"/>
-              <w:right w:w="100" w:type="dxa"/>
+              <w:top w:w="70" w:type="dxa"/>
+              <w:bottom w:w="70" w:type="dxa"/>
+              <w:left w:w="90" w:type="dxa"/>
+              <w:right w:w="90" w:type="dxa"/>
             </w:tcMar>
-            <w:tcBorders>
-              <w:top w:val="single" w:sz="4" w:color="CBD5E1"/>
-              <w:left w:val="single" w:sz="4" w:color="CBD5E1"/>
-              <w:bottom w:val="single" w:sz="4" w:color="CBD5E1"/>
-              <w:right w:val="single" w:sz="4" w:color="CBD5E1"/>
-            </w:tcBorders>
           </w:tcPr>
           <w:p>
             <w:pPr>
@@ -425,7 +418,7 @@
               <w:rPr>
                 <w:rFonts w:ascii="Arial" w:hAnsi="Arial"/>
                 <w:color w:val="1E293B"/>
-                <w:sz w:val="17"/>
+                <w:sz w:val="18"/>
               </w:rPr>
               <w:t>Position-Time</w:t>
             </w:r>
@@ -434,19 +427,12 @@
         <w:tc>
           <w:tcPr>
             <w:tcW w:type="dxa" w:w="3744"/>
-            <w:shd w:fill="F8FAFC"/>
             <w:tcMar>
-              <w:top w:w="80" w:type="dxa"/>
-              <w:bottom w:w="80" w:type="dxa"/>
-              <w:left w:w="100" w:type="dxa"/>
-              <w:right w:w="100" w:type="dxa"/>
+              <w:top w:w="70" w:type="dxa"/>
+              <w:bottom w:w="70" w:type="dxa"/>
+              <w:left w:w="90" w:type="dxa"/>
+              <w:right w:w="90" w:type="dxa"/>
             </w:tcMar>
-            <w:tcBorders>
-              <w:top w:val="single" w:sz="4" w:color="CBD5E1"/>
-              <w:left w:val="single" w:sz="4" w:color="CBD5E1"/>
-              <w:bottom w:val="single" w:sz="4" w:color="CBD5E1"/>
-              <w:right w:val="single" w:sz="4" w:color="CBD5E1"/>
-            </w:tcBorders>
           </w:tcPr>
           <w:p>
             <w:pPr>
@@ -456,28 +442,21 @@
               <w:rPr>
                 <w:rFonts w:ascii="Arial" w:hAnsi="Arial"/>
                 <w:color w:val="1E293B"/>
-                <w:sz w:val="17"/>
+                <w:sz w:val="18"/>
               </w:rPr>
-              <w:t>Coco starts from rest at left, accelerating right.</w:t>
+              <w:t>The Backyard Dash: Starts from rest at x=10m, speeds up right (+a).</w:t>
             </w:r>
           </w:p>
         </w:tc>
         <w:tc>
           <w:tcPr>
             <w:tcW w:type="dxa" w:w="1296"/>
-            <w:shd w:fill="F8FAFC"/>
             <w:tcMar>
-              <w:top w:w="80" w:type="dxa"/>
-              <w:bottom w:w="80" w:type="dxa"/>
-              <w:left w:w="100" w:type="dxa"/>
-              <w:right w:w="100" w:type="dxa"/>
+              <w:top w:w="70" w:type="dxa"/>
+              <w:bottom w:w="70" w:type="dxa"/>
+              <w:left w:w="90" w:type="dxa"/>
+              <w:right w:w="90" w:type="dxa"/>
             </w:tcMar>
-            <w:tcBorders>
-              <w:top w:val="single" w:sz="4" w:color="CBD5E1"/>
-              <w:left w:val="single" w:sz="4" w:color="CBD5E1"/>
-              <w:bottom w:val="single" w:sz="4" w:color="CBD5E1"/>
-              <w:right w:val="single" w:sz="4" w:color="CBD5E1"/>
-            </w:tcBorders>
           </w:tcPr>
           <w:p>
             <w:pPr>
@@ -487,28 +466,21 @@
               <w:rPr>
                 <w:rFonts w:ascii="Arial" w:hAnsi="Arial"/>
                 <w:color w:val="1E293B"/>
-                <w:sz w:val="17"/>
+                <w:sz w:val="18"/>
               </w:rPr>
-              <w:t>+</w:t>
+              <w:t>+ Right</w:t>
             </w:r>
           </w:p>
         </w:tc>
         <w:tc>
           <w:tcPr>
             <w:tcW w:type="dxa" w:w="1584"/>
-            <w:shd w:fill="F8FAFC"/>
             <w:tcMar>
-              <w:top w:w="80" w:type="dxa"/>
-              <w:bottom w:w="80" w:type="dxa"/>
-              <w:left w:w="100" w:type="dxa"/>
-              <w:right w:w="100" w:type="dxa"/>
+              <w:top w:w="70" w:type="dxa"/>
+              <w:bottom w:w="70" w:type="dxa"/>
+              <w:left w:w="90" w:type="dxa"/>
+              <w:right w:w="90" w:type="dxa"/>
             </w:tcMar>
-            <w:tcBorders>
-              <w:top w:val="single" w:sz="4" w:color="CBD5E1"/>
-              <w:left w:val="single" w:sz="4" w:color="CBD5E1"/>
-              <w:bottom w:val="single" w:sz="4" w:color="CBD5E1"/>
-              <w:right w:val="single" w:sz="4" w:color="CBD5E1"/>
-            </w:tcBorders>
           </w:tcPr>
           <w:p>
             <w:pPr>
@@ -518,7 +490,7 @@
               <w:rPr>
                 <w:rFonts w:ascii="Arial" w:hAnsi="Arial"/>
                 <w:color w:val="1E293B"/>
-                <w:sz w:val="17"/>
+                <w:sz w:val="18"/>
               </w:rPr>
               <w:t>Accelerating</w:t>
             </w:r>
@@ -529,19 +501,13 @@
         <w:tc>
           <w:tcPr>
             <w:tcW w:type="dxa" w:w="1008"/>
-            <w:shd w:fill="FFFFFF"/>
+            <w:shd w:val="clear" w:color="auto" w:fill="F8FAFC"/>
             <w:tcMar>
-              <w:top w:w="80" w:type="dxa"/>
-              <w:bottom w:w="80" w:type="dxa"/>
-              <w:left w:w="100" w:type="dxa"/>
-              <w:right w:w="100" w:type="dxa"/>
+              <w:top w:w="70" w:type="dxa"/>
+              <w:bottom w:w="70" w:type="dxa"/>
+              <w:left w:w="90" w:type="dxa"/>
+              <w:right w:w="90" w:type="dxa"/>
             </w:tcMar>
-            <w:tcBorders>
-              <w:top w:val="single" w:sz="4" w:color="CBD5E1"/>
-              <w:left w:val="single" w:sz="4" w:color="CBD5E1"/>
-              <w:bottom w:val="single" w:sz="4" w:color="CBD5E1"/>
-              <w:right w:val="single" w:sz="4" w:color="CBD5E1"/>
-            </w:tcBorders>
           </w:tcPr>
           <w:p>
             <w:pPr>
@@ -552,28 +518,22 @@
                 <w:rFonts w:ascii="Arial" w:hAnsi="Arial"/>
                 <w:b/>
                 <w:color w:val="0F7E9B"/>
-                <w:sz w:val="17"/>
+                <w:sz w:val="18"/>
               </w:rPr>
-              <w:t>B</w:t>
+              <w:t>#2</w:t>
             </w:r>
           </w:p>
         </w:tc>
         <w:tc>
           <w:tcPr>
             <w:tcW w:type="dxa" w:w="1728"/>
-            <w:shd w:fill="FFFFFF"/>
+            <w:shd w:val="clear" w:color="auto" w:fill="F8FAFC"/>
             <w:tcMar>
-              <w:top w:w="80" w:type="dxa"/>
-              <w:bottom w:w="80" w:type="dxa"/>
-              <w:left w:w="100" w:type="dxa"/>
-              <w:right w:w="100" w:type="dxa"/>
+              <w:top w:w="70" w:type="dxa"/>
+              <w:bottom w:w="70" w:type="dxa"/>
+              <w:left w:w="90" w:type="dxa"/>
+              <w:right w:w="90" w:type="dxa"/>
             </w:tcMar>
-            <w:tcBorders>
-              <w:top w:val="single" w:sz="4" w:color="CBD5E1"/>
-              <w:left w:val="single" w:sz="4" w:color="CBD5E1"/>
-              <w:bottom w:val="single" w:sz="4" w:color="CBD5E1"/>
-              <w:right w:val="single" w:sz="4" w:color="CBD5E1"/>
-            </w:tcBorders>
           </w:tcPr>
           <w:p>
             <w:pPr>
@@ -583,7 +543,7 @@
               <w:rPr>
                 <w:rFonts w:ascii="Arial" w:hAnsi="Arial"/>
                 <w:color w:val="1E293B"/>
-                <w:sz w:val="17"/>
+                <w:sz w:val="18"/>
               </w:rPr>
               <w:t>Velocity-Time</w:t>
             </w:r>
@@ -592,19 +552,13 @@
         <w:tc>
           <w:tcPr>
             <w:tcW w:type="dxa" w:w="3744"/>
-            <w:shd w:fill="FFFFFF"/>
+            <w:shd w:val="clear" w:color="auto" w:fill="F8FAFC"/>
             <w:tcMar>
-              <w:top w:w="80" w:type="dxa"/>
-              <w:bottom w:w="80" w:type="dxa"/>
-              <w:left w:w="100" w:type="dxa"/>
-              <w:right w:w="100" w:type="dxa"/>
+              <w:top w:w="70" w:type="dxa"/>
+              <w:bottom w:w="70" w:type="dxa"/>
+              <w:left w:w="90" w:type="dxa"/>
+              <w:right w:w="90" w:type="dxa"/>
             </w:tcMar>
-            <w:tcBorders>
-              <w:top w:val="single" w:sz="4" w:color="CBD5E1"/>
-              <w:left w:val="single" w:sz="4" w:color="CBD5E1"/>
-              <w:bottom w:val="single" w:sz="4" w:color="CBD5E1"/>
-              <w:right w:val="single" w:sz="4" w:color="CBD5E1"/>
-            </w:tcBorders>
           </w:tcPr>
           <w:p>
             <w:pPr>
@@ -614,28 +568,22 @@
               <w:rPr>
                 <w:rFonts w:ascii="Arial" w:hAnsi="Arial"/>
                 <w:color w:val="1E293B"/>
-                <w:sz w:val="17"/>
+                <w:sz w:val="18"/>
               </w:rPr>
-              <w:t>Trots left at const speed → pauses to sniff → accelerates right.</w:t>
+              <w:t>The Sudden Treat Pause: Sprints left fast, smoothly decelerating to a stop.</w:t>
             </w:r>
           </w:p>
         </w:tc>
         <w:tc>
           <w:tcPr>
             <w:tcW w:type="dxa" w:w="1296"/>
-            <w:shd w:fill="FFFFFF"/>
+            <w:shd w:val="clear" w:color="auto" w:fill="F8FAFC"/>
             <w:tcMar>
-              <w:top w:w="80" w:type="dxa"/>
-              <w:bottom w:w="80" w:type="dxa"/>
-              <w:left w:w="100" w:type="dxa"/>
-              <w:right w:w="100" w:type="dxa"/>
+              <w:top w:w="70" w:type="dxa"/>
+              <w:bottom w:w="70" w:type="dxa"/>
+              <w:left w:w="90" w:type="dxa"/>
+              <w:right w:w="90" w:type="dxa"/>
             </w:tcMar>
-            <w:tcBorders>
-              <w:top w:val="single" w:sz="4" w:color="CBD5E1"/>
-              <w:left w:val="single" w:sz="4" w:color="CBD5E1"/>
-              <w:bottom w:val="single" w:sz="4" w:color="CBD5E1"/>
-              <w:right w:val="single" w:sz="4" w:color="CBD5E1"/>
-            </w:tcBorders>
           </w:tcPr>
           <w:p>
             <w:pPr>
@@ -645,28 +593,22 @@
               <w:rPr>
                 <w:rFonts w:ascii="Arial" w:hAnsi="Arial"/>
                 <w:color w:val="1E293B"/>
-                <w:sz w:val="17"/>
+                <w:sz w:val="18"/>
               </w:rPr>
-              <w:t>- then +</w:t>
+              <w:t>- Left</w:t>
             </w:r>
           </w:p>
         </w:tc>
         <w:tc>
           <w:tcPr>
             <w:tcW w:type="dxa" w:w="1584"/>
-            <w:shd w:fill="FFFFFF"/>
+            <w:shd w:val="clear" w:color="auto" w:fill="F8FAFC"/>
             <w:tcMar>
-              <w:top w:w="80" w:type="dxa"/>
-              <w:bottom w:w="80" w:type="dxa"/>
-              <w:left w:w="100" w:type="dxa"/>
-              <w:right w:w="100" w:type="dxa"/>
+              <w:top w:w="70" w:type="dxa"/>
+              <w:bottom w:w="70" w:type="dxa"/>
+              <w:left w:w="90" w:type="dxa"/>
+              <w:right w:w="90" w:type="dxa"/>
             </w:tcMar>
-            <w:tcBorders>
-              <w:top w:val="single" w:sz="4" w:color="CBD5E1"/>
-              <w:left w:val="single" w:sz="4" w:color="CBD5E1"/>
-              <w:bottom w:val="single" w:sz="4" w:color="CBD5E1"/>
-              <w:right w:val="single" w:sz="4" w:color="CBD5E1"/>
-            </w:tcBorders>
           </w:tcPr>
           <w:p>
             <w:pPr>
@@ -676,7 +618,258 @@
               <w:rPr>
                 <w:rFonts w:ascii="Arial" w:hAnsi="Arial"/>
                 <w:color w:val="1E293B"/>
-                <w:sz w:val="17"/>
+                <w:sz w:val="18"/>
+              </w:rPr>
+              <w:t>Decelerating</w:t>
+            </w:r>
+          </w:p>
+        </w:tc>
+      </w:tr>
+      <w:tr>
+        <w:tc>
+          <w:tcPr>
+            <w:tcW w:type="dxa" w:w="1008"/>
+            <w:tcMar>
+              <w:top w:w="70" w:type="dxa"/>
+              <w:bottom w:w="70" w:type="dxa"/>
+              <w:left w:w="90" w:type="dxa"/>
+              <w:right w:w="90" w:type="dxa"/>
+            </w:tcMar>
+          </w:tcPr>
+          <w:p>
+            <w:pPr>
+              <w:jc w:val="center"/>
+            </w:pPr>
+            <w:r>
+              <w:rPr>
+                <w:rFonts w:ascii="Arial" w:hAnsi="Arial"/>
+                <w:b/>
+                <w:color w:val="0F7E9B"/>
+                <w:sz w:val="18"/>
+              </w:rPr>
+              <w:t>#3</w:t>
+            </w:r>
+          </w:p>
+        </w:tc>
+        <w:tc>
+          <w:tcPr>
+            <w:tcW w:type="dxa" w:w="1728"/>
+            <w:tcMar>
+              <w:top w:w="70" w:type="dxa"/>
+              <w:bottom w:w="70" w:type="dxa"/>
+              <w:left w:w="90" w:type="dxa"/>
+              <w:right w:w="90" w:type="dxa"/>
+            </w:tcMar>
+          </w:tcPr>
+          <w:p>
+            <w:pPr>
+              <w:jc w:val="left"/>
+            </w:pPr>
+            <w:r>
+              <w:rPr>
+                <w:rFonts w:ascii="Arial" w:hAnsi="Arial"/>
+                <w:color w:val="1E293B"/>
+                <w:sz w:val="18"/>
+              </w:rPr>
+              <w:t>Position-Time</w:t>
+            </w:r>
+          </w:p>
+        </w:tc>
+        <w:tc>
+          <w:tcPr>
+            <w:tcW w:type="dxa" w:w="3744"/>
+            <w:tcMar>
+              <w:top w:w="70" w:type="dxa"/>
+              <w:bottom w:w="70" w:type="dxa"/>
+              <w:left w:w="90" w:type="dxa"/>
+              <w:right w:w="90" w:type="dxa"/>
+            </w:tcMar>
+          </w:tcPr>
+          <w:p>
+            <w:pPr>
+              <w:jc w:val="left"/>
+            </w:pPr>
+            <w:r>
+              <w:rPr>
+                <w:rFonts w:ascii="Arial" w:hAnsi="Arial"/>
+                <w:color w:val="1E293B"/>
+                <w:sz w:val="18"/>
+              </w:rPr>
+              <w:t>The Boundary Patrol: Trots right steadily, then doubles speed right.</w:t>
+            </w:r>
+          </w:p>
+        </w:tc>
+        <w:tc>
+          <w:tcPr>
+            <w:tcW w:type="dxa" w:w="1296"/>
+            <w:tcMar>
+              <w:top w:w="70" w:type="dxa"/>
+              <w:bottom w:w="70" w:type="dxa"/>
+              <w:left w:w="90" w:type="dxa"/>
+              <w:right w:w="90" w:type="dxa"/>
+            </w:tcMar>
+          </w:tcPr>
+          <w:p>
+            <w:pPr>
+              <w:jc w:val="center"/>
+            </w:pPr>
+            <w:r>
+              <w:rPr>
+                <w:rFonts w:ascii="Arial" w:hAnsi="Arial"/>
+                <w:color w:val="1E293B"/>
+                <w:sz w:val="18"/>
+              </w:rPr>
+              <w:t>+ Right</w:t>
+            </w:r>
+          </w:p>
+        </w:tc>
+        <w:tc>
+          <w:tcPr>
+            <w:tcW w:type="dxa" w:w="1584"/>
+            <w:tcMar>
+              <w:top w:w="70" w:type="dxa"/>
+              <w:bottom w:w="70" w:type="dxa"/>
+              <w:left w:w="90" w:type="dxa"/>
+              <w:right w:w="90" w:type="dxa"/>
+            </w:tcMar>
+          </w:tcPr>
+          <w:p>
+            <w:pPr>
+              <w:jc w:val="center"/>
+            </w:pPr>
+            <w:r>
+              <w:rPr>
+                <w:rFonts w:ascii="Arial" w:hAnsi="Arial"/>
+                <w:color w:val="1E293B"/>
+                <w:sz w:val="18"/>
+              </w:rPr>
+              <w:t>Piecewise Const</w:t>
+            </w:r>
+          </w:p>
+        </w:tc>
+      </w:tr>
+      <w:tr>
+        <w:tc>
+          <w:tcPr>
+            <w:tcW w:type="dxa" w:w="1008"/>
+            <w:shd w:val="clear" w:color="auto" w:fill="F8FAFC"/>
+            <w:tcMar>
+              <w:top w:w="70" w:type="dxa"/>
+              <w:bottom w:w="70" w:type="dxa"/>
+              <w:left w:w="90" w:type="dxa"/>
+              <w:right w:w="90" w:type="dxa"/>
+            </w:tcMar>
+          </w:tcPr>
+          <w:p>
+            <w:pPr>
+              <w:jc w:val="center"/>
+            </w:pPr>
+            <w:r>
+              <w:rPr>
+                <w:rFonts w:ascii="Arial" w:hAnsi="Arial"/>
+                <w:b/>
+                <w:color w:val="0F7E9B"/>
+                <w:sz w:val="18"/>
+              </w:rPr>
+              <w:t>#4</w:t>
+            </w:r>
+          </w:p>
+        </w:tc>
+        <w:tc>
+          <w:tcPr>
+            <w:tcW w:type="dxa" w:w="1728"/>
+            <w:shd w:val="clear" w:color="auto" w:fill="F8FAFC"/>
+            <w:tcMar>
+              <w:top w:w="70" w:type="dxa"/>
+              <w:bottom w:w="70" w:type="dxa"/>
+              <w:left w:w="90" w:type="dxa"/>
+              <w:right w:w="90" w:type="dxa"/>
+            </w:tcMar>
+          </w:tcPr>
+          <w:p>
+            <w:pPr>
+              <w:jc w:val="left"/>
+            </w:pPr>
+            <w:r>
+              <w:rPr>
+                <w:rFonts w:ascii="Arial" w:hAnsi="Arial"/>
+                <w:color w:val="1E293B"/>
+                <w:sz w:val="18"/>
+              </w:rPr>
+              <w:t>Velocity-Time</w:t>
+            </w:r>
+          </w:p>
+        </w:tc>
+        <w:tc>
+          <w:tcPr>
+            <w:tcW w:type="dxa" w:w="3744"/>
+            <w:shd w:val="clear" w:color="auto" w:fill="F8FAFC"/>
+            <w:tcMar>
+              <w:top w:w="70" w:type="dxa"/>
+              <w:bottom w:w="70" w:type="dxa"/>
+              <w:left w:w="90" w:type="dxa"/>
+              <w:right w:w="90" w:type="dxa"/>
+            </w:tcMar>
+          </w:tcPr>
+          <w:p>
+            <w:pPr>
+              <w:jc w:val="left"/>
+            </w:pPr>
+            <w:r>
+              <w:rPr>
+                <w:rFonts w:ascii="Arial" w:hAnsi="Arial"/>
+                <w:color w:val="1E293B"/>
+                <w:sz w:val="18"/>
+              </w:rPr>
+              <w:t>The Squirrel Hesitation: Slows to rest moving right, pauses, bolts left.</w:t>
+            </w:r>
+          </w:p>
+        </w:tc>
+        <w:tc>
+          <w:tcPr>
+            <w:tcW w:type="dxa" w:w="1296"/>
+            <w:shd w:val="clear" w:color="auto" w:fill="F8FAFC"/>
+            <w:tcMar>
+              <w:top w:w="70" w:type="dxa"/>
+              <w:bottom w:w="70" w:type="dxa"/>
+              <w:left w:w="90" w:type="dxa"/>
+              <w:right w:w="90" w:type="dxa"/>
+            </w:tcMar>
+          </w:tcPr>
+          <w:p>
+            <w:pPr>
+              <w:jc w:val="center"/>
+            </w:pPr>
+            <w:r>
+              <w:rPr>
+                <w:rFonts w:ascii="Arial" w:hAnsi="Arial"/>
+                <w:color w:val="1E293B"/>
+                <w:sz w:val="18"/>
+              </w:rPr>
+              <w:t>+ then -</w:t>
+            </w:r>
+          </w:p>
+        </w:tc>
+        <w:tc>
+          <w:tcPr>
+            <w:tcW w:type="dxa" w:w="1584"/>
+            <w:shd w:val="clear" w:color="auto" w:fill="F8FAFC"/>
+            <w:tcMar>
+              <w:top w:w="70" w:type="dxa"/>
+              <w:bottom w:w="70" w:type="dxa"/>
+              <w:left w:w="90" w:type="dxa"/>
+              <w:right w:w="90" w:type="dxa"/>
+            </w:tcMar>
+          </w:tcPr>
+          <w:p>
+            <w:pPr>
+              <w:jc w:val="center"/>
+            </w:pPr>
+            <w:r>
+              <w:rPr>
+                <w:rFonts w:ascii="Arial" w:hAnsi="Arial"/>
+                <w:color w:val="1E293B"/>
+                <w:sz w:val="18"/>
               </w:rPr>
               <w:t>Multi-Stage</w:t>
             </w:r>
@@ -687,19 +880,12 @@
         <w:tc>
           <w:tcPr>
             <w:tcW w:type="dxa" w:w="1008"/>
-            <w:shd w:fill="F8FAFC"/>
             <w:tcMar>
-              <w:top w:w="80" w:type="dxa"/>
-              <w:bottom w:w="80" w:type="dxa"/>
-              <w:left w:w="100" w:type="dxa"/>
-              <w:right w:w="100" w:type="dxa"/>
+              <w:top w:w="70" w:type="dxa"/>
+              <w:bottom w:w="70" w:type="dxa"/>
+              <w:left w:w="90" w:type="dxa"/>
+              <w:right w:w="90" w:type="dxa"/>
             </w:tcMar>
-            <w:tcBorders>
-              <w:top w:val="single" w:sz="4" w:color="CBD5E1"/>
-              <w:left w:val="single" w:sz="4" w:color="CBD5E1"/>
-              <w:bottom w:val="single" w:sz="4" w:color="CBD5E1"/>
-              <w:right w:val="single" w:sz="4" w:color="CBD5E1"/>
-            </w:tcBorders>
           </w:tcPr>
           <w:p>
             <w:pPr>
@@ -710,28 +896,21 @@
                 <w:rFonts w:ascii="Arial" w:hAnsi="Arial"/>
                 <w:b/>
                 <w:color w:val="0F7E9B"/>
-                <w:sz w:val="17"/>
+                <w:sz w:val="18"/>
               </w:rPr>
-              <w:t>C</w:t>
+              <w:t>#5</w:t>
             </w:r>
           </w:p>
         </w:tc>
         <w:tc>
           <w:tcPr>
             <w:tcW w:type="dxa" w:w="1728"/>
-            <w:shd w:fill="F8FAFC"/>
             <w:tcMar>
-              <w:top w:w="80" w:type="dxa"/>
-              <w:bottom w:w="80" w:type="dxa"/>
-              <w:left w:w="100" w:type="dxa"/>
-              <w:right w:w="100" w:type="dxa"/>
+              <w:top w:w="70" w:type="dxa"/>
+              <w:bottom w:w="70" w:type="dxa"/>
+              <w:left w:w="90" w:type="dxa"/>
+              <w:right w:w="90" w:type="dxa"/>
             </w:tcMar>
-            <w:tcBorders>
-              <w:top w:val="single" w:sz="4" w:color="CBD5E1"/>
-              <w:left w:val="single" w:sz="4" w:color="CBD5E1"/>
-              <w:bottom w:val="single" w:sz="4" w:color="CBD5E1"/>
-              <w:right w:val="single" w:sz="4" w:color="CBD5E1"/>
-            </w:tcBorders>
           </w:tcPr>
           <w:p>
             <w:pPr>
@@ -741,28 +920,21 @@
               <w:rPr>
                 <w:rFonts w:ascii="Arial" w:hAnsi="Arial"/>
                 <w:color w:val="1E293B"/>
-                <w:sz w:val="17"/>
+                <w:sz w:val="18"/>
               </w:rPr>
-              <w:t>Velocity-Time</w:t>
+              <w:t>Position-Time</w:t>
             </w:r>
           </w:p>
         </w:tc>
         <w:tc>
           <w:tcPr>
             <w:tcW w:type="dxa" w:w="3744"/>
-            <w:shd w:fill="F8FAFC"/>
             <w:tcMar>
-              <w:top w:w="80" w:type="dxa"/>
-              <w:bottom w:w="80" w:type="dxa"/>
-              <w:left w:w="100" w:type="dxa"/>
-              <w:right w:w="100" w:type="dxa"/>
+              <w:top w:w="70" w:type="dxa"/>
+              <w:bottom w:w="70" w:type="dxa"/>
+              <w:left w:w="90" w:type="dxa"/>
+              <w:right w:w="90" w:type="dxa"/>
             </w:tcMar>
-            <w:tcBorders>
-              <w:top w:val="single" w:sz="4" w:color="CBD5E1"/>
-              <w:left w:val="single" w:sz="4" w:color="CBD5E1"/>
-              <w:bottom w:val="single" w:sz="4" w:color="CBD5E1"/>
-              <w:right w:val="single" w:sz="4" w:color="CBD5E1"/>
-            </w:tcBorders>
           </w:tcPr>
           <w:p>
             <w:pPr>
@@ -772,28 +944,21 @@
               <w:rPr>
                 <w:rFonts w:ascii="Arial" w:hAnsi="Arial"/>
                 <w:color w:val="1E293B"/>
-                <w:sz w:val="17"/>
+                <w:sz w:val="18"/>
               </w:rPr>
-              <w:t>Trots steadily to the left at constant negative speed.</w:t>
+              <w:t>The Steady Sniff Tour: Trots left at const speed, stops to sniff, resumes left.</w:t>
             </w:r>
           </w:p>
         </w:tc>
         <w:tc>
           <w:tcPr>
             <w:tcW w:type="dxa" w:w="1296"/>
-            <w:shd w:fill="F8FAFC"/>
             <w:tcMar>
-              <w:top w:w="80" w:type="dxa"/>
-              <w:bottom w:w="80" w:type="dxa"/>
-              <w:left w:w="100" w:type="dxa"/>
-              <w:right w:w="100" w:type="dxa"/>
+              <w:top w:w="70" w:type="dxa"/>
+              <w:bottom w:w="70" w:type="dxa"/>
+              <w:left w:w="90" w:type="dxa"/>
+              <w:right w:w="90" w:type="dxa"/>
             </w:tcMar>
-            <w:tcBorders>
-              <w:top w:val="single" w:sz="4" w:color="CBD5E1"/>
-              <w:left w:val="single" w:sz="4" w:color="CBD5E1"/>
-              <w:bottom w:val="single" w:sz="4" w:color="CBD5E1"/>
-              <w:right w:val="single" w:sz="4" w:color="CBD5E1"/>
-            </w:tcBorders>
           </w:tcPr>
           <w:p>
             <w:pPr>
@@ -803,28 +968,21 @@
               <w:rPr>
                 <w:rFonts w:ascii="Arial" w:hAnsi="Arial"/>
                 <w:color w:val="1E293B"/>
-                <w:sz w:val="17"/>
+                <w:sz w:val="18"/>
               </w:rPr>
-              <w:t>-</w:t>
+              <w:t>- Left</w:t>
             </w:r>
           </w:p>
         </w:tc>
         <w:tc>
           <w:tcPr>
             <w:tcW w:type="dxa" w:w="1584"/>
-            <w:shd w:fill="F8FAFC"/>
             <w:tcMar>
-              <w:top w:w="80" w:type="dxa"/>
-              <w:bottom w:w="80" w:type="dxa"/>
-              <w:left w:w="100" w:type="dxa"/>
-              <w:right w:w="100" w:type="dxa"/>
+              <w:top w:w="70" w:type="dxa"/>
+              <w:bottom w:w="70" w:type="dxa"/>
+              <w:left w:w="90" w:type="dxa"/>
+              <w:right w:w="90" w:type="dxa"/>
             </w:tcMar>
-            <w:tcBorders>
-              <w:top w:val="single" w:sz="4" w:color="CBD5E1"/>
-              <w:left w:val="single" w:sz="4" w:color="CBD5E1"/>
-              <w:bottom w:val="single" w:sz="4" w:color="CBD5E1"/>
-              <w:right w:val="single" w:sz="4" w:color="CBD5E1"/>
-            </w:tcBorders>
           </w:tcPr>
           <w:p>
             <w:pPr>
@@ -834,9 +992,9 @@
               <w:rPr>
                 <w:rFonts w:ascii="Arial" w:hAnsi="Arial"/>
                 <w:color w:val="1E293B"/>
-                <w:sz w:val="17"/>
+                <w:sz w:val="18"/>
               </w:rPr>
-              <w:t>Constant</w:t>
+              <w:t>Uniform w/ Rest</w:t>
             </w:r>
           </w:p>
         </w:tc>
@@ -845,19 +1003,13 @@
         <w:tc>
           <w:tcPr>
             <w:tcW w:type="dxa" w:w="1008"/>
-            <w:shd w:fill="FFFFFF"/>
+            <w:shd w:val="clear" w:color="auto" w:fill="F8FAFC"/>
             <w:tcMar>
-              <w:top w:w="80" w:type="dxa"/>
-              <w:bottom w:w="80" w:type="dxa"/>
-              <w:left w:w="100" w:type="dxa"/>
-              <w:right w:w="100" w:type="dxa"/>
+              <w:top w:w="70" w:type="dxa"/>
+              <w:bottom w:w="70" w:type="dxa"/>
+              <w:left w:w="90" w:type="dxa"/>
+              <w:right w:w="90" w:type="dxa"/>
             </w:tcMar>
-            <w:tcBorders>
-              <w:top w:val="single" w:sz="4" w:color="CBD5E1"/>
-              <w:left w:val="single" w:sz="4" w:color="CBD5E1"/>
-              <w:bottom w:val="single" w:sz="4" w:color="CBD5E1"/>
-              <w:right w:val="single" w:sz="4" w:color="CBD5E1"/>
-            </w:tcBorders>
           </w:tcPr>
           <w:p>
             <w:pPr>
@@ -868,28 +1020,22 @@
                 <w:rFonts w:ascii="Arial" w:hAnsi="Arial"/>
                 <w:b/>
                 <w:color w:val="0F7E9B"/>
-                <w:sz w:val="17"/>
+                <w:sz w:val="18"/>
               </w:rPr>
-              <w:t>D</w:t>
+              <w:t>#6</w:t>
             </w:r>
           </w:p>
         </w:tc>
         <w:tc>
           <w:tcPr>
             <w:tcW w:type="dxa" w:w="1728"/>
-            <w:shd w:fill="FFFFFF"/>
+            <w:shd w:val="clear" w:color="auto" w:fill="F8FAFC"/>
             <w:tcMar>
-              <w:top w:w="80" w:type="dxa"/>
-              <w:bottom w:w="80" w:type="dxa"/>
-              <w:left w:w="100" w:type="dxa"/>
-              <w:right w:w="100" w:type="dxa"/>
+              <w:top w:w="70" w:type="dxa"/>
+              <w:bottom w:w="70" w:type="dxa"/>
+              <w:left w:w="90" w:type="dxa"/>
+              <w:right w:w="90" w:type="dxa"/>
             </w:tcMar>
-            <w:tcBorders>
-              <w:top w:val="single" w:sz="4" w:color="CBD5E1"/>
-              <w:left w:val="single" w:sz="4" w:color="CBD5E1"/>
-              <w:bottom w:val="single" w:sz="4" w:color="CBD5E1"/>
-              <w:right w:val="single" w:sz="4" w:color="CBD5E1"/>
-            </w:tcBorders>
           </w:tcPr>
           <w:p>
             <w:pPr>
@@ -899,7 +1045,7 @@
               <w:rPr>
                 <w:rFonts w:ascii="Arial" w:hAnsi="Arial"/>
                 <w:color w:val="1E293B"/>
-                <w:sz w:val="17"/>
+                <w:sz w:val="18"/>
               </w:rPr>
               <w:t>Position-Time</w:t>
             </w:r>
@@ -908,19 +1054,13 @@
         <w:tc>
           <w:tcPr>
             <w:tcW w:type="dxa" w:w="3744"/>
-            <w:shd w:fill="FFFFFF"/>
+            <w:shd w:val="clear" w:color="auto" w:fill="F8FAFC"/>
             <w:tcMar>
-              <w:top w:w="80" w:type="dxa"/>
-              <w:bottom w:w="80" w:type="dxa"/>
-              <w:left w:w="100" w:type="dxa"/>
-              <w:right w:w="100" w:type="dxa"/>
+              <w:top w:w="70" w:type="dxa"/>
+              <w:bottom w:w="70" w:type="dxa"/>
+              <w:left w:w="90" w:type="dxa"/>
+              <w:right w:w="90" w:type="dxa"/>
             </w:tcMar>
-            <w:tcBorders>
-              <w:top w:val="single" w:sz="4" w:color="CBD5E1"/>
-              <w:left w:val="single" w:sz="4" w:color="CBD5E1"/>
-              <w:bottom w:val="single" w:sz="4" w:color="CBD5E1"/>
-              <w:right w:val="single" w:sz="4" w:color="CBD5E1"/>
-            </w:tcBorders>
           </w:tcPr>
           <w:p>
             <w:pPr>
@@ -930,28 +1070,22 @@
               <w:rPr>
                 <w:rFonts w:ascii="Arial" w:hAnsi="Arial"/>
                 <w:color w:val="1E293B"/>
-                <w:sz w:val="17"/>
+                <w:sz w:val="18"/>
               </w:rPr>
-              <w:t>Trots left slowing down → pauses to rest → continues trotting left.</w:t>
+              <w:t>The Rebound Arc: Runs right slowing down, peaks, turns around left smoothly.</w:t>
             </w:r>
           </w:p>
         </w:tc>
         <w:tc>
           <w:tcPr>
             <w:tcW w:type="dxa" w:w="1296"/>
-            <w:shd w:fill="FFFFFF"/>
+            <w:shd w:val="clear" w:color="auto" w:fill="F8FAFC"/>
             <w:tcMar>
-              <w:top w:w="80" w:type="dxa"/>
-              <w:bottom w:w="80" w:type="dxa"/>
-              <w:left w:w="100" w:type="dxa"/>
-              <w:right w:w="100" w:type="dxa"/>
+              <w:top w:w="70" w:type="dxa"/>
+              <w:bottom w:w="70" w:type="dxa"/>
+              <w:left w:w="90" w:type="dxa"/>
+              <w:right w:w="90" w:type="dxa"/>
             </w:tcMar>
-            <w:tcBorders>
-              <w:top w:val="single" w:sz="4" w:color="CBD5E1"/>
-              <w:left w:val="single" w:sz="4" w:color="CBD5E1"/>
-              <w:bottom w:val="single" w:sz="4" w:color="CBD5E1"/>
-              <w:right w:val="single" w:sz="4" w:color="CBD5E1"/>
-            </w:tcBorders>
           </w:tcPr>
           <w:p>
             <w:pPr>
@@ -961,28 +1095,22 @@
               <w:rPr>
                 <w:rFonts w:ascii="Arial" w:hAnsi="Arial"/>
                 <w:color w:val="1E293B"/>
-                <w:sz w:val="17"/>
+                <w:sz w:val="18"/>
               </w:rPr>
-              <w:t>-</w:t>
+              <w:t>+ then -</w:t>
             </w:r>
           </w:p>
         </w:tc>
         <w:tc>
           <w:tcPr>
             <w:tcW w:type="dxa" w:w="1584"/>
-            <w:shd w:fill="FFFFFF"/>
+            <w:shd w:val="clear" w:color="auto" w:fill="F8FAFC"/>
             <w:tcMar>
-              <w:top w:w="80" w:type="dxa"/>
-              <w:bottom w:w="80" w:type="dxa"/>
-              <w:left w:w="100" w:type="dxa"/>
-              <w:right w:w="100" w:type="dxa"/>
+              <w:top w:w="70" w:type="dxa"/>
+              <w:bottom w:w="70" w:type="dxa"/>
+              <w:left w:w="90" w:type="dxa"/>
+              <w:right w:w="90" w:type="dxa"/>
             </w:tcMar>
-            <w:tcBorders>
-              <w:top w:val="single" w:sz="4" w:color="CBD5E1"/>
-              <w:left w:val="single" w:sz="4" w:color="CBD5E1"/>
-              <w:bottom w:val="single" w:sz="4" w:color="CBD5E1"/>
-              <w:right w:val="single" w:sz="4" w:color="CBD5E1"/>
-            </w:tcBorders>
           </w:tcPr>
           <w:p>
             <w:pPr>
@@ -992,9 +1120,9 @@
               <w:rPr>
                 <w:rFonts w:ascii="Arial" w:hAnsi="Arial"/>
                 <w:color w:val="1E293B"/>
-                <w:sz w:val="17"/>
+                <w:sz w:val="18"/>
               </w:rPr>
-              <w:t>Multi-Stage</w:t>
+              <w:t>Continuous Turn</w:t>
             </w:r>
           </w:p>
         </w:tc>
@@ -1003,19 +1131,12 @@
         <w:tc>
           <w:tcPr>
             <w:tcW w:type="dxa" w:w="1008"/>
-            <w:shd w:fill="F8FAFC"/>
             <w:tcMar>
-              <w:top w:w="80" w:type="dxa"/>
-              <w:bottom w:w="80" w:type="dxa"/>
-              <w:left w:w="100" w:type="dxa"/>
-              <w:right w:w="100" w:type="dxa"/>
+              <w:top w:w="70" w:type="dxa"/>
+              <w:bottom w:w="70" w:type="dxa"/>
+              <w:left w:w="90" w:type="dxa"/>
+              <w:right w:w="90" w:type="dxa"/>
             </w:tcMar>
-            <w:tcBorders>
-              <w:top w:val="single" w:sz="4" w:color="CBD5E1"/>
-              <w:left w:val="single" w:sz="4" w:color="CBD5E1"/>
-              <w:bottom w:val="single" w:sz="4" w:color="CBD5E1"/>
-              <w:right w:val="single" w:sz="4" w:color="CBD5E1"/>
-            </w:tcBorders>
           </w:tcPr>
           <w:p>
             <w:pPr>
@@ -1026,28 +1147,21 @@
                 <w:rFonts w:ascii="Arial" w:hAnsi="Arial"/>
                 <w:b/>
                 <w:color w:val="0F7E9B"/>
-                <w:sz w:val="17"/>
+                <w:sz w:val="18"/>
               </w:rPr>
-              <w:t>E</w:t>
+              <w:t>#7</w:t>
             </w:r>
           </w:p>
         </w:tc>
         <w:tc>
           <w:tcPr>
             <w:tcW w:type="dxa" w:w="1728"/>
-            <w:shd w:fill="F8FAFC"/>
             <w:tcMar>
-              <w:top w:w="80" w:type="dxa"/>
-              <w:bottom w:w="80" w:type="dxa"/>
-              <w:left w:w="100" w:type="dxa"/>
-              <w:right w:w="100" w:type="dxa"/>
+              <w:top w:w="70" w:type="dxa"/>
+              <w:bottom w:w="70" w:type="dxa"/>
+              <w:left w:w="90" w:type="dxa"/>
+              <w:right w:w="90" w:type="dxa"/>
             </w:tcMar>
-            <w:tcBorders>
-              <w:top w:val="single" w:sz="4" w:color="CBD5E1"/>
-              <w:left w:val="single" w:sz="4" w:color="CBD5E1"/>
-              <w:bottom w:val="single" w:sz="4" w:color="CBD5E1"/>
-              <w:right w:val="single" w:sz="4" w:color="CBD5E1"/>
-            </w:tcBorders>
           </w:tcPr>
           <w:p>
             <w:pPr>
@@ -1057,28 +1171,21 @@
               <w:rPr>
                 <w:rFonts w:ascii="Arial" w:hAnsi="Arial"/>
                 <w:color w:val="1E293B"/>
-                <w:sz w:val="17"/>
+                <w:sz w:val="18"/>
               </w:rPr>
-              <w:t>Position-Time</w:t>
+              <w:t>Velocity-Time</w:t>
             </w:r>
           </w:p>
         </w:tc>
         <w:tc>
           <w:tcPr>
             <w:tcW w:type="dxa" w:w="3744"/>
-            <w:shd w:fill="F8FAFC"/>
             <w:tcMar>
-              <w:top w:w="80" w:type="dxa"/>
-              <w:bottom w:w="80" w:type="dxa"/>
-              <w:left w:w="100" w:type="dxa"/>
-              <w:right w:w="100" w:type="dxa"/>
+              <w:top w:w="70" w:type="dxa"/>
+              <w:bottom w:w="70" w:type="dxa"/>
+              <w:left w:w="90" w:type="dxa"/>
+              <w:right w:w="90" w:type="dxa"/>
             </w:tcMar>
-            <w:tcBorders>
-              <w:top w:val="single" w:sz="4" w:color="CBD5E1"/>
-              <w:left w:val="single" w:sz="4" w:color="CBD5E1"/>
-              <w:bottom w:val="single" w:sz="4" w:color="CBD5E1"/>
-              <w:right w:val="single" w:sz="4" w:color="CBD5E1"/>
-            </w:tcBorders>
           </w:tcPr>
           <w:p>
             <w:pPr>
@@ -1088,28 +1195,21 @@
               <w:rPr>
                 <w:rFonts w:ascii="Arial" w:hAnsi="Arial"/>
                 <w:color w:val="1E293B"/>
-                <w:sz w:val="17"/>
+                <w:sz w:val="18"/>
               </w:rPr>
-              <w:t>Trots smoothly right at constant speed from origin.</w:t>
+              <w:t>Launch &amp; Glide: Accelerates from rest right, then cruises at const speed.</w:t>
             </w:r>
           </w:p>
         </w:tc>
         <w:tc>
           <w:tcPr>
             <w:tcW w:type="dxa" w:w="1296"/>
-            <w:shd w:fill="F8FAFC"/>
             <w:tcMar>
-              <w:top w:w="80" w:type="dxa"/>
-              <w:bottom w:w="80" w:type="dxa"/>
-              <w:left w:w="100" w:type="dxa"/>
-              <w:right w:w="100" w:type="dxa"/>
+              <w:top w:w="70" w:type="dxa"/>
+              <w:bottom w:w="70" w:type="dxa"/>
+              <w:left w:w="90" w:type="dxa"/>
+              <w:right w:w="90" w:type="dxa"/>
             </w:tcMar>
-            <w:tcBorders>
-              <w:top w:val="single" w:sz="4" w:color="CBD5E1"/>
-              <w:left w:val="single" w:sz="4" w:color="CBD5E1"/>
-              <w:bottom w:val="single" w:sz="4" w:color="CBD5E1"/>
-              <w:right w:val="single" w:sz="4" w:color="CBD5E1"/>
-            </w:tcBorders>
           </w:tcPr>
           <w:p>
             <w:pPr>
@@ -1119,28 +1219,21 @@
               <w:rPr>
                 <w:rFonts w:ascii="Arial" w:hAnsi="Arial"/>
                 <w:color w:val="1E293B"/>
-                <w:sz w:val="17"/>
+                <w:sz w:val="18"/>
               </w:rPr>
-              <w:t>+</w:t>
+              <w:t>+ Right</w:t>
             </w:r>
           </w:p>
         </w:tc>
         <w:tc>
           <w:tcPr>
             <w:tcW w:type="dxa" w:w="1584"/>
-            <w:shd w:fill="F8FAFC"/>
             <w:tcMar>
-              <w:top w:w="80" w:type="dxa"/>
-              <w:bottom w:w="80" w:type="dxa"/>
-              <w:left w:w="100" w:type="dxa"/>
-              <w:right w:w="100" w:type="dxa"/>
+              <w:top w:w="70" w:type="dxa"/>
+              <w:bottom w:w="70" w:type="dxa"/>
+              <w:left w:w="90" w:type="dxa"/>
+              <w:right w:w="90" w:type="dxa"/>
             </w:tcMar>
-            <w:tcBorders>
-              <w:top w:val="single" w:sz="4" w:color="CBD5E1"/>
-              <w:left w:val="single" w:sz="4" w:color="CBD5E1"/>
-              <w:bottom w:val="single" w:sz="4" w:color="CBD5E1"/>
-              <w:right w:val="single" w:sz="4" w:color="CBD5E1"/>
-            </w:tcBorders>
           </w:tcPr>
           <w:p>
             <w:pPr>
@@ -1150,9 +1243,9 @@
               <w:rPr>
                 <w:rFonts w:ascii="Arial" w:hAnsi="Arial"/>
                 <w:color w:val="1E293B"/>
-                <w:sz w:val="17"/>
+                <w:sz w:val="18"/>
               </w:rPr>
-              <w:t>Constant</w:t>
+              <w:t>Accel to Const</w:t>
             </w:r>
           </w:p>
         </w:tc>
@@ -1161,19 +1254,13 @@
         <w:tc>
           <w:tcPr>
             <w:tcW w:type="dxa" w:w="1008"/>
-            <w:shd w:fill="FFFFFF"/>
+            <w:shd w:val="clear" w:color="auto" w:fill="F8FAFC"/>
             <w:tcMar>
-              <w:top w:w="80" w:type="dxa"/>
-              <w:bottom w:w="80" w:type="dxa"/>
-              <w:left w:w="100" w:type="dxa"/>
-              <w:right w:w="100" w:type="dxa"/>
+              <w:top w:w="70" w:type="dxa"/>
+              <w:bottom w:w="70" w:type="dxa"/>
+              <w:left w:w="90" w:type="dxa"/>
+              <w:right w:w="90" w:type="dxa"/>
             </w:tcMar>
-            <w:tcBorders>
-              <w:top w:val="single" w:sz="4" w:color="CBD5E1"/>
-              <w:left w:val="single" w:sz="4" w:color="CBD5E1"/>
-              <w:bottom w:val="single" w:sz="4" w:color="CBD5E1"/>
-              <w:right w:val="single" w:sz="4" w:color="CBD5E1"/>
-            </w:tcBorders>
           </w:tcPr>
           <w:p>
             <w:pPr>
@@ -1184,28 +1271,22 @@
                 <w:rFonts w:ascii="Arial" w:hAnsi="Arial"/>
                 <w:b/>
                 <w:color w:val="0F7E9B"/>
-                <w:sz w:val="17"/>
+                <w:sz w:val="18"/>
               </w:rPr>
-              <w:t>F</w:t>
+              <w:t>#8</w:t>
             </w:r>
           </w:p>
         </w:tc>
         <w:tc>
           <w:tcPr>
             <w:tcW w:type="dxa" w:w="1728"/>
-            <w:shd w:fill="FFFFFF"/>
+            <w:shd w:val="clear" w:color="auto" w:fill="F8FAFC"/>
             <w:tcMar>
-              <w:top w:w="80" w:type="dxa"/>
-              <w:bottom w:w="80" w:type="dxa"/>
-              <w:left w:w="100" w:type="dxa"/>
-              <w:right w:w="100" w:type="dxa"/>
+              <w:top w:w="70" w:type="dxa"/>
+              <w:bottom w:w="70" w:type="dxa"/>
+              <w:left w:w="90" w:type="dxa"/>
+              <w:right w:w="90" w:type="dxa"/>
             </w:tcMar>
-            <w:tcBorders>
-              <w:top w:val="single" w:sz="4" w:color="CBD5E1"/>
-              <w:left w:val="single" w:sz="4" w:color="CBD5E1"/>
-              <w:bottom w:val="single" w:sz="4" w:color="CBD5E1"/>
-              <w:right w:val="single" w:sz="4" w:color="CBD5E1"/>
-            </w:tcBorders>
           </w:tcPr>
           <w:p>
             <w:pPr>
@@ -1215,7 +1296,7 @@
               <w:rPr>
                 <w:rFonts w:ascii="Arial" w:hAnsi="Arial"/>
                 <w:color w:val="1E293B"/>
-                <w:sz w:val="17"/>
+                <w:sz w:val="18"/>
               </w:rPr>
               <w:t>Velocity-Time</w:t>
             </w:r>
@@ -1224,19 +1305,13 @@
         <w:tc>
           <w:tcPr>
             <w:tcW w:type="dxa" w:w="3744"/>
-            <w:shd w:fill="FFFFFF"/>
+            <w:shd w:val="clear" w:color="auto" w:fill="F8FAFC"/>
             <w:tcMar>
-              <w:top w:w="80" w:type="dxa"/>
-              <w:bottom w:w="80" w:type="dxa"/>
-              <w:left w:w="100" w:type="dxa"/>
-              <w:right w:w="100" w:type="dxa"/>
+              <w:top w:w="70" w:type="dxa"/>
+              <w:bottom w:w="70" w:type="dxa"/>
+              <w:left w:w="90" w:type="dxa"/>
+              <w:right w:w="90" w:type="dxa"/>
             </w:tcMar>
-            <w:tcBorders>
-              <w:top w:val="single" w:sz="4" w:color="CBD5E1"/>
-              <w:left w:val="single" w:sz="4" w:color="CBD5E1"/>
-              <w:bottom w:val="single" w:sz="4" w:color="CBD5E1"/>
-              <w:right w:val="single" w:sz="4" w:color="CBD5E1"/>
-            </w:tcBorders>
           </w:tcPr>
           <w:p>
             <w:pPr>
@@ -1246,28 +1321,22 @@
               <w:rPr>
                 <w:rFonts w:ascii="Arial" w:hAnsi="Arial"/>
                 <w:color w:val="1E293B"/>
-                <w:sz w:val="17"/>
+                <w:sz w:val="18"/>
               </w:rPr>
-              <w:t>Sprints left from rest → stops abruptly → walks left at const pace.</w:t>
+              <w:t>Leftward Zoomies: Launches from rest at right, accelerating steadily left (-a).</w:t>
             </w:r>
           </w:p>
         </w:tc>
         <w:tc>
           <w:tcPr>
             <w:tcW w:type="dxa" w:w="1296"/>
-            <w:shd w:fill="FFFFFF"/>
+            <w:shd w:val="clear" w:color="auto" w:fill="F8FAFC"/>
             <w:tcMar>
-              <w:top w:w="80" w:type="dxa"/>
-              <w:bottom w:w="80" w:type="dxa"/>
-              <w:left w:w="100" w:type="dxa"/>
-              <w:right w:w="100" w:type="dxa"/>
+              <w:top w:w="70" w:type="dxa"/>
+              <w:bottom w:w="70" w:type="dxa"/>
+              <w:left w:w="90" w:type="dxa"/>
+              <w:right w:w="90" w:type="dxa"/>
             </w:tcMar>
-            <w:tcBorders>
-              <w:top w:val="single" w:sz="4" w:color="CBD5E1"/>
-              <w:left w:val="single" w:sz="4" w:color="CBD5E1"/>
-              <w:bottom w:val="single" w:sz="4" w:color="CBD5E1"/>
-              <w:right w:val="single" w:sz="4" w:color="CBD5E1"/>
-            </w:tcBorders>
           </w:tcPr>
           <w:p>
             <w:pPr>
@@ -1277,28 +1346,22 @@
               <w:rPr>
                 <w:rFonts w:ascii="Arial" w:hAnsi="Arial"/>
                 <w:color w:val="1E293B"/>
-                <w:sz w:val="17"/>
+                <w:sz w:val="18"/>
               </w:rPr>
-              <w:t>-</w:t>
+              <w:t>- Left</w:t>
             </w:r>
           </w:p>
         </w:tc>
         <w:tc>
           <w:tcPr>
             <w:tcW w:type="dxa" w:w="1584"/>
-            <w:shd w:fill="FFFFFF"/>
+            <w:shd w:val="clear" w:color="auto" w:fill="F8FAFC"/>
             <w:tcMar>
-              <w:top w:w="80" w:type="dxa"/>
-              <w:bottom w:w="80" w:type="dxa"/>
-              <w:left w:w="100" w:type="dxa"/>
-              <w:right w:w="100" w:type="dxa"/>
+              <w:top w:w="70" w:type="dxa"/>
+              <w:bottom w:w="70" w:type="dxa"/>
+              <w:left w:w="90" w:type="dxa"/>
+              <w:right w:w="90" w:type="dxa"/>
             </w:tcMar>
-            <w:tcBorders>
-              <w:top w:val="single" w:sz="4" w:color="CBD5E1"/>
-              <w:left w:val="single" w:sz="4" w:color="CBD5E1"/>
-              <w:bottom w:val="single" w:sz="4" w:color="CBD5E1"/>
-              <w:right w:val="single" w:sz="4" w:color="CBD5E1"/>
-            </w:tcBorders>
           </w:tcPr>
           <w:p>
             <w:pPr>
@@ -1308,9 +1371,9 @@
               <w:rPr>
                 <w:rFonts w:ascii="Arial" w:hAnsi="Arial"/>
                 <w:color w:val="1E293B"/>
-                <w:sz w:val="17"/>
+                <w:sz w:val="18"/>
               </w:rPr>
-              <w:t>Multi-Stage</w:t>
+              <w:t>Accelerating</w:t>
             </w:r>
           </w:p>
         </w:tc>
@@ -1319,19 +1382,12 @@
         <w:tc>
           <w:tcPr>
             <w:tcW w:type="dxa" w:w="1008"/>
-            <w:shd w:fill="F8FAFC"/>
             <w:tcMar>
-              <w:top w:w="80" w:type="dxa"/>
-              <w:bottom w:w="80" w:type="dxa"/>
-              <w:left w:w="100" w:type="dxa"/>
-              <w:right w:w="100" w:type="dxa"/>
+              <w:top w:w="70" w:type="dxa"/>
+              <w:bottom w:w="70" w:type="dxa"/>
+              <w:left w:w="90" w:type="dxa"/>
+              <w:right w:w="90" w:type="dxa"/>
             </w:tcMar>
-            <w:tcBorders>
-              <w:top w:val="single" w:sz="4" w:color="CBD5E1"/>
-              <w:left w:val="single" w:sz="4" w:color="CBD5E1"/>
-              <w:bottom w:val="single" w:sz="4" w:color="CBD5E1"/>
-              <w:right w:val="single" w:sz="4" w:color="CBD5E1"/>
-            </w:tcBorders>
           </w:tcPr>
           <w:p>
             <w:pPr>
@@ -1342,28 +1398,21 @@
                 <w:rFonts w:ascii="Arial" w:hAnsi="Arial"/>
                 <w:b/>
                 <w:color w:val="0F7E9B"/>
-                <w:sz w:val="17"/>
+                <w:sz w:val="18"/>
               </w:rPr>
-              <w:t>G</w:t>
+              <w:t>#9</w:t>
             </w:r>
           </w:p>
         </w:tc>
         <w:tc>
           <w:tcPr>
             <w:tcW w:type="dxa" w:w="1728"/>
-            <w:shd w:fill="F8FAFC"/>
             <w:tcMar>
-              <w:top w:w="80" w:type="dxa"/>
-              <w:bottom w:w="80" w:type="dxa"/>
-              <w:left w:w="100" w:type="dxa"/>
-              <w:right w:w="100" w:type="dxa"/>
+              <w:top w:w="70" w:type="dxa"/>
+              <w:bottom w:w="70" w:type="dxa"/>
+              <w:left w:w="90" w:type="dxa"/>
+              <w:right w:w="90" w:type="dxa"/>
             </w:tcMar>
-            <w:tcBorders>
-              <w:top w:val="single" w:sz="4" w:color="CBD5E1"/>
-              <w:left w:val="single" w:sz="4" w:color="CBD5E1"/>
-              <w:bottom w:val="single" w:sz="4" w:color="CBD5E1"/>
-              <w:right w:val="single" w:sz="4" w:color="CBD5E1"/>
-            </w:tcBorders>
           </w:tcPr>
           <w:p>
             <w:pPr>
@@ -1373,7 +1422,7 @@
               <w:rPr>
                 <w:rFonts w:ascii="Arial" w:hAnsi="Arial"/>
                 <w:color w:val="1E293B"/>
-                <w:sz w:val="17"/>
+                <w:sz w:val="18"/>
               </w:rPr>
               <w:t>Position-Time</w:t>
             </w:r>
@@ -1382,19 +1431,12 @@
         <w:tc>
           <w:tcPr>
             <w:tcW w:type="dxa" w:w="3744"/>
-            <w:shd w:fill="F8FAFC"/>
             <w:tcMar>
-              <w:top w:w="80" w:type="dxa"/>
-              <w:bottom w:w="80" w:type="dxa"/>
-              <w:left w:w="100" w:type="dxa"/>
-              <w:right w:w="100" w:type="dxa"/>
+              <w:top w:w="70" w:type="dxa"/>
+              <w:bottom w:w="70" w:type="dxa"/>
+              <w:left w:w="90" w:type="dxa"/>
+              <w:right w:w="90" w:type="dxa"/>
             </w:tcMar>
-            <w:tcBorders>
-              <w:top w:val="single" w:sz="4" w:color="CBD5E1"/>
-              <w:left w:val="single" w:sz="4" w:color="CBD5E1"/>
-              <w:bottom w:val="single" w:sz="4" w:color="CBD5E1"/>
-              <w:right w:val="single" w:sz="4" w:color="CBD5E1"/>
-            </w:tcBorders>
           </w:tcPr>
           <w:p>
             <w:pPr>
@@ -1404,28 +1446,21 @@
               <w:rPr>
                 <w:rFonts w:ascii="Arial" w:hAnsi="Arial"/>
                 <w:color w:val="1E293B"/>
-                <w:sz w:val="17"/>
+                <w:sz w:val="18"/>
               </w:rPr>
-              <w:t>Runs right for a ball → grabs it (rest) → trots back left.</w:t>
+              <w:t>The Zig-Zag Search: Const speed right → turns const speed left → turns right.</w:t>
             </w:r>
           </w:p>
         </w:tc>
         <w:tc>
           <w:tcPr>
             <w:tcW w:type="dxa" w:w="1296"/>
-            <w:shd w:fill="F8FAFC"/>
             <w:tcMar>
-              <w:top w:w="80" w:type="dxa"/>
-              <w:bottom w:w="80" w:type="dxa"/>
-              <w:left w:w="100" w:type="dxa"/>
-              <w:right w:w="100" w:type="dxa"/>
+              <w:top w:w="70" w:type="dxa"/>
+              <w:bottom w:w="70" w:type="dxa"/>
+              <w:left w:w="90" w:type="dxa"/>
+              <w:right w:w="90" w:type="dxa"/>
             </w:tcMar>
-            <w:tcBorders>
-              <w:top w:val="single" w:sz="4" w:color="CBD5E1"/>
-              <w:left w:val="single" w:sz="4" w:color="CBD5E1"/>
-              <w:bottom w:val="single" w:sz="4" w:color="CBD5E1"/>
-              <w:right w:val="single" w:sz="4" w:color="CBD5E1"/>
-            </w:tcBorders>
           </w:tcPr>
           <w:p>
             <w:pPr>
@@ -1435,28 +1470,21 @@
               <w:rPr>
                 <w:rFonts w:ascii="Arial" w:hAnsi="Arial"/>
                 <w:color w:val="1E293B"/>
-                <w:sz w:val="17"/>
+                <w:sz w:val="18"/>
               </w:rPr>
-              <w:t>+ then -</w:t>
+              <w:t>+ / - / +</w:t>
             </w:r>
           </w:p>
         </w:tc>
         <w:tc>
           <w:tcPr>
             <w:tcW w:type="dxa" w:w="1584"/>
-            <w:shd w:fill="F8FAFC"/>
             <w:tcMar>
-              <w:top w:w="80" w:type="dxa"/>
-              <w:bottom w:w="80" w:type="dxa"/>
-              <w:left w:w="100" w:type="dxa"/>
-              <w:right w:w="100" w:type="dxa"/>
+              <w:top w:w="70" w:type="dxa"/>
+              <w:bottom w:w="70" w:type="dxa"/>
+              <w:left w:w="90" w:type="dxa"/>
+              <w:right w:w="90" w:type="dxa"/>
             </w:tcMar>
-            <w:tcBorders>
-              <w:top w:val="single" w:sz="4" w:color="CBD5E1"/>
-              <w:left w:val="single" w:sz="4" w:color="CBD5E1"/>
-              <w:bottom w:val="single" w:sz="4" w:color="CBD5E1"/>
-              <w:right w:val="single" w:sz="4" w:color="CBD5E1"/>
-            </w:tcBorders>
           </w:tcPr>
           <w:p>
             <w:pPr>
@@ -1466,9 +1494,9 @@
               <w:rPr>
                 <w:rFonts w:ascii="Arial" w:hAnsi="Arial"/>
                 <w:color w:val="1E293B"/>
-                <w:sz w:val="17"/>
+                <w:sz w:val="18"/>
               </w:rPr>
-              <w:t>Turnaround</w:t>
+              <w:t>Piecewise 3-Stage</w:t>
             </w:r>
           </w:p>
         </w:tc>
@@ -1477,19 +1505,13 @@
         <w:tc>
           <w:tcPr>
             <w:tcW w:type="dxa" w:w="1008"/>
-            <w:shd w:fill="FFFFFF"/>
+            <w:shd w:val="clear" w:color="auto" w:fill="F8FAFC"/>
             <w:tcMar>
-              <w:top w:w="80" w:type="dxa"/>
-              <w:bottom w:w="80" w:type="dxa"/>
-              <w:left w:w="100" w:type="dxa"/>
-              <w:right w:w="100" w:type="dxa"/>
+              <w:top w:w="70" w:type="dxa"/>
+              <w:bottom w:w="70" w:type="dxa"/>
+              <w:left w:w="90" w:type="dxa"/>
+              <w:right w:w="90" w:type="dxa"/>
             </w:tcMar>
-            <w:tcBorders>
-              <w:top w:val="single" w:sz="4" w:color="CBD5E1"/>
-              <w:left w:val="single" w:sz="4" w:color="CBD5E1"/>
-              <w:bottom w:val="single" w:sz="4" w:color="CBD5E1"/>
-              <w:right w:val="single" w:sz="4" w:color="CBD5E1"/>
-            </w:tcBorders>
           </w:tcPr>
           <w:p>
             <w:pPr>
@@ -1500,28 +1522,22 @@
                 <w:rFonts w:ascii="Arial" w:hAnsi="Arial"/>
                 <w:b/>
                 <w:color w:val="0F7E9B"/>
-                <w:sz w:val="17"/>
+                <w:sz w:val="18"/>
               </w:rPr>
-              <w:t>H</w:t>
+              <w:t>#10</w:t>
             </w:r>
           </w:p>
         </w:tc>
         <w:tc>
           <w:tcPr>
             <w:tcW w:type="dxa" w:w="1728"/>
-            <w:shd w:fill="FFFFFF"/>
+            <w:shd w:val="clear" w:color="auto" w:fill="F8FAFC"/>
             <w:tcMar>
-              <w:top w:w="80" w:type="dxa"/>
-              <w:bottom w:w="80" w:type="dxa"/>
-              <w:left w:w="100" w:type="dxa"/>
-              <w:right w:w="100" w:type="dxa"/>
+              <w:top w:w="70" w:type="dxa"/>
+              <w:bottom w:w="70" w:type="dxa"/>
+              <w:left w:w="90" w:type="dxa"/>
+              <w:right w:w="90" w:type="dxa"/>
             </w:tcMar>
-            <w:tcBorders>
-              <w:top w:val="single" w:sz="4" w:color="CBD5E1"/>
-              <w:left w:val="single" w:sz="4" w:color="CBD5E1"/>
-              <w:bottom w:val="single" w:sz="4" w:color="CBD5E1"/>
-              <w:right w:val="single" w:sz="4" w:color="CBD5E1"/>
-            </w:tcBorders>
           </w:tcPr>
           <w:p>
             <w:pPr>
@@ -1531,7 +1547,7 @@
               <w:rPr>
                 <w:rFonts w:ascii="Arial" w:hAnsi="Arial"/>
                 <w:color w:val="1E293B"/>
-                <w:sz w:val="17"/>
+                <w:sz w:val="18"/>
               </w:rPr>
               <w:t>Velocity-Time</w:t>
             </w:r>
@@ -1540,19 +1556,13 @@
         <w:tc>
           <w:tcPr>
             <w:tcW w:type="dxa" w:w="3744"/>
-            <w:shd w:fill="FFFFFF"/>
+            <w:shd w:val="clear" w:color="auto" w:fill="F8FAFC"/>
             <w:tcMar>
-              <w:top w:w="80" w:type="dxa"/>
-              <w:bottom w:w="80" w:type="dxa"/>
-              <w:left w:w="100" w:type="dxa"/>
-              <w:right w:w="100" w:type="dxa"/>
+              <w:top w:w="70" w:type="dxa"/>
+              <w:bottom w:w="70" w:type="dxa"/>
+              <w:left w:w="90" w:type="dxa"/>
+              <w:right w:w="90" w:type="dxa"/>
             </w:tcMar>
-            <w:tcBorders>
-              <w:top w:val="single" w:sz="4" w:color="CBD5E1"/>
-              <w:left w:val="single" w:sz="4" w:color="CBD5E1"/>
-              <w:bottom w:val="single" w:sz="4" w:color="CBD5E1"/>
-              <w:right w:val="single" w:sz="4" w:color="CBD5E1"/>
-            </w:tcBorders>
           </w:tcPr>
           <w:p>
             <w:pPr>
@@ -1562,28 +1572,22 @@
               <w:rPr>
                 <w:rFonts w:ascii="Arial" w:hAnsi="Arial"/>
                 <w:color w:val="1E293B"/>
-                <w:sz w:val="17"/>
+                <w:sz w:val="18"/>
               </w:rPr>
-              <w:t>Starts in a fast zoomie right, steadily braking to a stop.</w:t>
+              <w:t>The Bell-Curve Trot: Accelerates right from rest → cruises → decelerates to rest.</w:t>
             </w:r>
           </w:p>
         </w:tc>
         <w:tc>
           <w:tcPr>
             <w:tcW w:type="dxa" w:w="1296"/>
-            <w:shd w:fill="FFFFFF"/>
+            <w:shd w:val="clear" w:color="auto" w:fill="F8FAFC"/>
             <w:tcMar>
-              <w:top w:w="80" w:type="dxa"/>
-              <w:bottom w:w="80" w:type="dxa"/>
-              <w:left w:w="100" w:type="dxa"/>
-              <w:right w:w="100" w:type="dxa"/>
+              <w:top w:w="70" w:type="dxa"/>
+              <w:bottom w:w="70" w:type="dxa"/>
+              <w:left w:w="90" w:type="dxa"/>
+              <w:right w:w="90" w:type="dxa"/>
             </w:tcMar>
-            <w:tcBorders>
-              <w:top w:val="single" w:sz="4" w:color="CBD5E1"/>
-              <w:left w:val="single" w:sz="4" w:color="CBD5E1"/>
-              <w:bottom w:val="single" w:sz="4" w:color="CBD5E1"/>
-              <w:right w:val="single" w:sz="4" w:color="CBD5E1"/>
-            </w:tcBorders>
           </w:tcPr>
           <w:p>
             <w:pPr>
@@ -1593,28 +1597,22 @@
               <w:rPr>
                 <w:rFonts w:ascii="Arial" w:hAnsi="Arial"/>
                 <w:color w:val="1E293B"/>
-                <w:sz w:val="17"/>
+                <w:sz w:val="18"/>
               </w:rPr>
-              <w:t>+</w:t>
+              <w:t>+ Right</w:t>
             </w:r>
           </w:p>
         </w:tc>
         <w:tc>
           <w:tcPr>
             <w:tcW w:type="dxa" w:w="1584"/>
-            <w:shd w:fill="FFFFFF"/>
+            <w:shd w:val="clear" w:color="auto" w:fill="F8FAFC"/>
             <w:tcMar>
-              <w:top w:w="80" w:type="dxa"/>
-              <w:bottom w:w="80" w:type="dxa"/>
-              <w:left w:w="100" w:type="dxa"/>
-              <w:right w:w="100" w:type="dxa"/>
+              <w:top w:w="70" w:type="dxa"/>
+              <w:bottom w:w="70" w:type="dxa"/>
+              <w:left w:w="90" w:type="dxa"/>
+              <w:right w:w="90" w:type="dxa"/>
             </w:tcMar>
-            <w:tcBorders>
-              <w:top w:val="single" w:sz="4" w:color="CBD5E1"/>
-              <w:left w:val="single" w:sz="4" w:color="CBD5E1"/>
-              <w:bottom w:val="single" w:sz="4" w:color="CBD5E1"/>
-              <w:right w:val="single" w:sz="4" w:color="CBD5E1"/>
-            </w:tcBorders>
           </w:tcPr>
           <w:p>
             <w:pPr>
@@ -1624,483 +1622,9 @@
               <w:rPr>
                 <w:rFonts w:ascii="Arial" w:hAnsi="Arial"/>
                 <w:color w:val="1E293B"/>
-                <w:sz w:val="17"/>
+                <w:sz w:val="18"/>
               </w:rPr>
-              <w:t>Decelerating</w:t>
-            </w:r>
-          </w:p>
-        </w:tc>
-      </w:tr>
-      <w:tr>
-        <w:tc>
-          <w:tcPr>
-            <w:tcW w:type="dxa" w:w="1008"/>
-            <w:shd w:fill="F8FAFC"/>
-            <w:tcMar>
-              <w:top w:w="80" w:type="dxa"/>
-              <w:bottom w:w="80" w:type="dxa"/>
-              <w:left w:w="100" w:type="dxa"/>
-              <w:right w:w="100" w:type="dxa"/>
-            </w:tcMar>
-            <w:tcBorders>
-              <w:top w:val="single" w:sz="4" w:color="CBD5E1"/>
-              <w:left w:val="single" w:sz="4" w:color="CBD5E1"/>
-              <w:bottom w:val="single" w:sz="4" w:color="CBD5E1"/>
-              <w:right w:val="single" w:sz="4" w:color="CBD5E1"/>
-            </w:tcBorders>
-          </w:tcPr>
-          <w:p>
-            <w:pPr>
-              <w:jc w:val="center"/>
-            </w:pPr>
-            <w:r>
-              <w:rPr>
-                <w:rFonts w:ascii="Arial" w:hAnsi="Arial"/>
-                <w:b/>
-                <w:color w:val="0F7E9B"/>
-                <w:sz w:val="17"/>
-              </w:rPr>
-              <w:t>I</w:t>
-            </w:r>
-          </w:p>
-        </w:tc>
-        <w:tc>
-          <w:tcPr>
-            <w:tcW w:type="dxa" w:w="1728"/>
-            <w:shd w:fill="F8FAFC"/>
-            <w:tcMar>
-              <w:top w:w="80" w:type="dxa"/>
-              <w:bottom w:w="80" w:type="dxa"/>
-              <w:left w:w="100" w:type="dxa"/>
-              <w:right w:w="100" w:type="dxa"/>
-            </w:tcMar>
-            <w:tcBorders>
-              <w:top w:val="single" w:sz="4" w:color="CBD5E1"/>
-              <w:left w:val="single" w:sz="4" w:color="CBD5E1"/>
-              <w:bottom w:val="single" w:sz="4" w:color="CBD5E1"/>
-              <w:right w:val="single" w:sz="4" w:color="CBD5E1"/>
-            </w:tcBorders>
-          </w:tcPr>
-          <w:p>
-            <w:pPr>
-              <w:jc w:val="left"/>
-            </w:pPr>
-            <w:r>
-              <w:rPr>
-                <w:rFonts w:ascii="Arial" w:hAnsi="Arial"/>
-                <w:color w:val="1E293B"/>
-                <w:sz w:val="17"/>
-              </w:rPr>
-              <w:t>Position-Time</w:t>
-            </w:r>
-          </w:p>
-        </w:tc>
-        <w:tc>
-          <w:tcPr>
-            <w:tcW w:type="dxa" w:w="3744"/>
-            <w:shd w:fill="F8FAFC"/>
-            <w:tcMar>
-              <w:top w:w="80" w:type="dxa"/>
-              <w:bottom w:w="80" w:type="dxa"/>
-              <w:left w:w="100" w:type="dxa"/>
-              <w:right w:w="100" w:type="dxa"/>
-            </w:tcMar>
-            <w:tcBorders>
-              <w:top w:val="single" w:sz="4" w:color="CBD5E1"/>
-              <w:left w:val="single" w:sz="4" w:color="CBD5E1"/>
-              <w:bottom w:val="single" w:sz="4" w:color="CBD5E1"/>
-              <w:right w:val="single" w:sz="4" w:color="CBD5E1"/>
-            </w:tcBorders>
-          </w:tcPr>
-          <w:p>
-            <w:pPr>
-              <w:jc w:val="left"/>
-            </w:pPr>
-            <w:r>
-              <w:rPr>
-                <w:rFonts w:ascii="Arial" w:hAnsi="Arial"/>
-                <w:color w:val="1E293B"/>
-                <w:sz w:val="17"/>
-              </w:rPr>
-              <w:t>Spots squirrel left, accelerating from rest with increasing speed left.</w:t>
-            </w:r>
-          </w:p>
-        </w:tc>
-        <w:tc>
-          <w:tcPr>
-            <w:tcW w:type="dxa" w:w="1296"/>
-            <w:shd w:fill="F8FAFC"/>
-            <w:tcMar>
-              <w:top w:w="80" w:type="dxa"/>
-              <w:bottom w:w="80" w:type="dxa"/>
-              <w:left w:w="100" w:type="dxa"/>
-              <w:right w:w="100" w:type="dxa"/>
-            </w:tcMar>
-            <w:tcBorders>
-              <w:top w:val="single" w:sz="4" w:color="CBD5E1"/>
-              <w:left w:val="single" w:sz="4" w:color="CBD5E1"/>
-              <w:bottom w:val="single" w:sz="4" w:color="CBD5E1"/>
-              <w:right w:val="single" w:sz="4" w:color="CBD5E1"/>
-            </w:tcBorders>
-          </w:tcPr>
-          <w:p>
-            <w:pPr>
-              <w:jc w:val="center"/>
-            </w:pPr>
-            <w:r>
-              <w:rPr>
-                <w:rFonts w:ascii="Arial" w:hAnsi="Arial"/>
-                <w:color w:val="1E293B"/>
-                <w:sz w:val="17"/>
-              </w:rPr>
-              <w:t>-</w:t>
-            </w:r>
-          </w:p>
-        </w:tc>
-        <w:tc>
-          <w:tcPr>
-            <w:tcW w:type="dxa" w:w="1584"/>
-            <w:shd w:fill="F8FAFC"/>
-            <w:tcMar>
-              <w:top w:w="80" w:type="dxa"/>
-              <w:bottom w:w="80" w:type="dxa"/>
-              <w:left w:w="100" w:type="dxa"/>
-              <w:right w:w="100" w:type="dxa"/>
-            </w:tcMar>
-            <w:tcBorders>
-              <w:top w:val="single" w:sz="4" w:color="CBD5E1"/>
-              <w:left w:val="single" w:sz="4" w:color="CBD5E1"/>
-              <w:bottom w:val="single" w:sz="4" w:color="CBD5E1"/>
-              <w:right w:val="single" w:sz="4" w:color="CBD5E1"/>
-            </w:tcBorders>
-          </w:tcPr>
-          <w:p>
-            <w:pPr>
-              <w:jc w:val="center"/>
-            </w:pPr>
-            <w:r>
-              <w:rPr>
-                <w:rFonts w:ascii="Arial" w:hAnsi="Arial"/>
-                <w:color w:val="1E293B"/>
-                <w:sz w:val="17"/>
-              </w:rPr>
-              <w:t>Accelerating</w:t>
-            </w:r>
-          </w:p>
-        </w:tc>
-      </w:tr>
-      <w:tr>
-        <w:tc>
-          <w:tcPr>
-            <w:tcW w:type="dxa" w:w="1008"/>
-            <w:shd w:fill="FFFFFF"/>
-            <w:tcMar>
-              <w:top w:w="80" w:type="dxa"/>
-              <w:bottom w:w="80" w:type="dxa"/>
-              <w:left w:w="100" w:type="dxa"/>
-              <w:right w:w="100" w:type="dxa"/>
-            </w:tcMar>
-            <w:tcBorders>
-              <w:top w:val="single" w:sz="4" w:color="CBD5E1"/>
-              <w:left w:val="single" w:sz="4" w:color="CBD5E1"/>
-              <w:bottom w:val="single" w:sz="4" w:color="CBD5E1"/>
-              <w:right w:val="single" w:sz="4" w:color="CBD5E1"/>
-            </w:tcBorders>
-          </w:tcPr>
-          <w:p>
-            <w:pPr>
-              <w:jc w:val="center"/>
-            </w:pPr>
-            <w:r>
-              <w:rPr>
-                <w:rFonts w:ascii="Arial" w:hAnsi="Arial"/>
-                <w:b/>
-                <w:color w:val="0F7E9B"/>
-                <w:sz w:val="17"/>
-              </w:rPr>
-              <w:t>J</w:t>
-            </w:r>
-          </w:p>
-        </w:tc>
-        <w:tc>
-          <w:tcPr>
-            <w:tcW w:type="dxa" w:w="1728"/>
-            <w:shd w:fill="FFFFFF"/>
-            <w:tcMar>
-              <w:top w:w="80" w:type="dxa"/>
-              <w:bottom w:w="80" w:type="dxa"/>
-              <w:left w:w="100" w:type="dxa"/>
-              <w:right w:w="100" w:type="dxa"/>
-            </w:tcMar>
-            <w:tcBorders>
-              <w:top w:val="single" w:sz="4" w:color="CBD5E1"/>
-              <w:left w:val="single" w:sz="4" w:color="CBD5E1"/>
-              <w:bottom w:val="single" w:sz="4" w:color="CBD5E1"/>
-              <w:right w:val="single" w:sz="4" w:color="CBD5E1"/>
-            </w:tcBorders>
-          </w:tcPr>
-          <w:p>
-            <w:pPr>
-              <w:jc w:val="left"/>
-            </w:pPr>
-            <w:r>
-              <w:rPr>
-                <w:rFonts w:ascii="Arial" w:hAnsi="Arial"/>
-                <w:color w:val="1E293B"/>
-                <w:sz w:val="17"/>
-              </w:rPr>
-              <w:t>Position-Time</w:t>
-            </w:r>
-          </w:p>
-        </w:tc>
-        <w:tc>
-          <w:tcPr>
-            <w:tcW w:type="dxa" w:w="3744"/>
-            <w:shd w:fill="FFFFFF"/>
-            <w:tcMar>
-              <w:top w:w="80" w:type="dxa"/>
-              <w:bottom w:w="80" w:type="dxa"/>
-              <w:left w:w="100" w:type="dxa"/>
-              <w:right w:w="100" w:type="dxa"/>
-            </w:tcMar>
-            <w:tcBorders>
-              <w:top w:val="single" w:sz="4" w:color="CBD5E1"/>
-              <w:left w:val="single" w:sz="4" w:color="CBD5E1"/>
-              <w:bottom w:val="single" w:sz="4" w:color="CBD5E1"/>
-              <w:right w:val="single" w:sz="4" w:color="CBD5E1"/>
-            </w:tcBorders>
-          </w:tcPr>
-          <w:p>
-            <w:pPr>
-              <w:jc w:val="left"/>
-            </w:pPr>
-            <w:r>
-              <w:rPr>
-                <w:rFonts w:ascii="Arial" w:hAnsi="Arial"/>
-                <w:color w:val="1E293B"/>
-                <w:sz w:val="17"/>
-              </w:rPr>
-              <w:t>Walks right at steady pace → pauses → bolts forward in sprint.</w:t>
-            </w:r>
-          </w:p>
-        </w:tc>
-        <w:tc>
-          <w:tcPr>
-            <w:tcW w:type="dxa" w:w="1296"/>
-            <w:shd w:fill="FFFFFF"/>
-            <w:tcMar>
-              <w:top w:w="80" w:type="dxa"/>
-              <w:bottom w:w="80" w:type="dxa"/>
-              <w:left w:w="100" w:type="dxa"/>
-              <w:right w:w="100" w:type="dxa"/>
-            </w:tcMar>
-            <w:tcBorders>
-              <w:top w:val="single" w:sz="4" w:color="CBD5E1"/>
-              <w:left w:val="single" w:sz="4" w:color="CBD5E1"/>
-              <w:bottom w:val="single" w:sz="4" w:color="CBD5E1"/>
-              <w:right w:val="single" w:sz="4" w:color="CBD5E1"/>
-            </w:tcBorders>
-          </w:tcPr>
-          <w:p>
-            <w:pPr>
-              <w:jc w:val="center"/>
-            </w:pPr>
-            <w:r>
-              <w:rPr>
-                <w:rFonts w:ascii="Arial" w:hAnsi="Arial"/>
-                <w:color w:val="1E293B"/>
-                <w:sz w:val="17"/>
-              </w:rPr>
-              <w:t>+</w:t>
-            </w:r>
-          </w:p>
-        </w:tc>
-        <w:tc>
-          <w:tcPr>
-            <w:tcW w:type="dxa" w:w="1584"/>
-            <w:shd w:fill="FFFFFF"/>
-            <w:tcMar>
-              <w:top w:w="80" w:type="dxa"/>
-              <w:bottom w:w="80" w:type="dxa"/>
-              <w:left w:w="100" w:type="dxa"/>
-              <w:right w:w="100" w:type="dxa"/>
-            </w:tcMar>
-            <w:tcBorders>
-              <w:top w:val="single" w:sz="4" w:color="CBD5E1"/>
-              <w:left w:val="single" w:sz="4" w:color="CBD5E1"/>
-              <w:bottom w:val="single" w:sz="4" w:color="CBD5E1"/>
-              <w:right w:val="single" w:sz="4" w:color="CBD5E1"/>
-            </w:tcBorders>
-          </w:tcPr>
-          <w:p>
-            <w:pPr>
-              <w:jc w:val="center"/>
-            </w:pPr>
-            <w:r>
-              <w:rPr>
-                <w:rFonts w:ascii="Arial" w:hAnsi="Arial"/>
-                <w:color w:val="1E293B"/>
-                <w:sz w:val="17"/>
-              </w:rPr>
-              <w:t>Multi-Stage</w:t>
-            </w:r>
-          </w:p>
-        </w:tc>
-      </w:tr>
-      <w:tr>
-        <w:tc>
-          <w:tcPr>
-            <w:tcW w:type="dxa" w:w="1008"/>
-            <w:shd w:fill="F8FAFC"/>
-            <w:tcMar>
-              <w:top w:w="80" w:type="dxa"/>
-              <w:bottom w:w="80" w:type="dxa"/>
-              <w:left w:w="100" w:type="dxa"/>
-              <w:right w:w="100" w:type="dxa"/>
-            </w:tcMar>
-            <w:tcBorders>
-              <w:top w:val="single" w:sz="4" w:color="CBD5E1"/>
-              <w:left w:val="single" w:sz="4" w:color="CBD5E1"/>
-              <w:bottom w:val="single" w:sz="4" w:color="CBD5E1"/>
-              <w:right w:val="single" w:sz="4" w:color="CBD5E1"/>
-            </w:tcBorders>
-          </w:tcPr>
-          <w:p>
-            <w:pPr>
-              <w:jc w:val="center"/>
-            </w:pPr>
-            <w:r>
-              <w:rPr>
-                <w:rFonts w:ascii="Arial" w:hAnsi="Arial"/>
-                <w:b/>
-                <w:color w:val="0F7E9B"/>
-                <w:sz w:val="17"/>
-              </w:rPr>
-              <w:t>K</w:t>
-            </w:r>
-          </w:p>
-        </w:tc>
-        <w:tc>
-          <w:tcPr>
-            <w:tcW w:type="dxa" w:w="1728"/>
-            <w:shd w:fill="F8FAFC"/>
-            <w:tcMar>
-              <w:top w:w="80" w:type="dxa"/>
-              <w:bottom w:w="80" w:type="dxa"/>
-              <w:left w:w="100" w:type="dxa"/>
-              <w:right w:w="100" w:type="dxa"/>
-            </w:tcMar>
-            <w:tcBorders>
-              <w:top w:val="single" w:sz="4" w:color="CBD5E1"/>
-              <w:left w:val="single" w:sz="4" w:color="CBD5E1"/>
-              <w:bottom w:val="single" w:sz="4" w:color="CBD5E1"/>
-              <w:right w:val="single" w:sz="4" w:color="CBD5E1"/>
-            </w:tcBorders>
-          </w:tcPr>
-          <w:p>
-            <w:pPr>
-              <w:jc w:val="left"/>
-            </w:pPr>
-            <w:r>
-              <w:rPr>
-                <w:rFonts w:ascii="Arial" w:hAnsi="Arial"/>
-                <w:color w:val="1E293B"/>
-                <w:sz w:val="17"/>
-              </w:rPr>
-              <w:t>Position-Time</w:t>
-            </w:r>
-          </w:p>
-        </w:tc>
-        <w:tc>
-          <w:tcPr>
-            <w:tcW w:type="dxa" w:w="3744"/>
-            <w:shd w:fill="F8FAFC"/>
-            <w:tcMar>
-              <w:top w:w="80" w:type="dxa"/>
-              <w:bottom w:w="80" w:type="dxa"/>
-              <w:left w:w="100" w:type="dxa"/>
-              <w:right w:w="100" w:type="dxa"/>
-            </w:tcMar>
-            <w:tcBorders>
-              <w:top w:val="single" w:sz="4" w:color="CBD5E1"/>
-              <w:left w:val="single" w:sz="4" w:color="CBD5E1"/>
-              <w:bottom w:val="single" w:sz="4" w:color="CBD5E1"/>
-              <w:right w:val="single" w:sz="4" w:color="CBD5E1"/>
-            </w:tcBorders>
-          </w:tcPr>
-          <w:p>
-            <w:pPr>
-              <w:jc w:val="left"/>
-            </w:pPr>
-            <w:r>
-              <w:rPr>
-                <w:rFonts w:ascii="Arial" w:hAnsi="Arial"/>
-                <w:color w:val="1E293B"/>
-                <w:sz w:val="17"/>
-              </w:rPr>
-              <w:t>Dashes left fast, skidding with positive acceleration to a stop.</w:t>
-            </w:r>
-          </w:p>
-        </w:tc>
-        <w:tc>
-          <w:tcPr>
-            <w:tcW w:type="dxa" w:w="1296"/>
-            <w:shd w:fill="F8FAFC"/>
-            <w:tcMar>
-              <w:top w:w="80" w:type="dxa"/>
-              <w:bottom w:w="80" w:type="dxa"/>
-              <w:left w:w="100" w:type="dxa"/>
-              <w:right w:w="100" w:type="dxa"/>
-            </w:tcMar>
-            <w:tcBorders>
-              <w:top w:val="single" w:sz="4" w:color="CBD5E1"/>
-              <w:left w:val="single" w:sz="4" w:color="CBD5E1"/>
-              <w:bottom w:val="single" w:sz="4" w:color="CBD5E1"/>
-              <w:right w:val="single" w:sz="4" w:color="CBD5E1"/>
-            </w:tcBorders>
-          </w:tcPr>
-          <w:p>
-            <w:pPr>
-              <w:jc w:val="center"/>
-            </w:pPr>
-            <w:r>
-              <w:rPr>
-                <w:rFonts w:ascii="Arial" w:hAnsi="Arial"/>
-                <w:color w:val="1E293B"/>
-                <w:sz w:val="17"/>
-              </w:rPr>
-              <w:t>-</w:t>
-            </w:r>
-          </w:p>
-        </w:tc>
-        <w:tc>
-          <w:tcPr>
-            <w:tcW w:type="dxa" w:w="1584"/>
-            <w:shd w:fill="F8FAFC"/>
-            <w:tcMar>
-              <w:top w:w="80" w:type="dxa"/>
-              <w:bottom w:w="80" w:type="dxa"/>
-              <w:left w:w="100" w:type="dxa"/>
-              <w:right w:w="100" w:type="dxa"/>
-            </w:tcMar>
-            <w:tcBorders>
-              <w:top w:val="single" w:sz="4" w:color="CBD5E1"/>
-              <w:left w:val="single" w:sz="4" w:color="CBD5E1"/>
-              <w:bottom w:val="single" w:sz="4" w:color="CBD5E1"/>
-              <w:right w:val="single" w:sz="4" w:color="CBD5E1"/>
-            </w:tcBorders>
-          </w:tcPr>
-          <w:p>
-            <w:pPr>
-              <w:jc w:val="center"/>
-            </w:pPr>
-            <w:r>
-              <w:rPr>
-                <w:rFonts w:ascii="Arial" w:hAnsi="Arial"/>
-                <w:color w:val="1E293B"/>
-                <w:sz w:val="17"/>
-              </w:rPr>
-              <w:t>Decelerating</w:t>
+              <w:t>Trapezoidal</w:t>
             </w:r>
           </w:p>
         </w:tc>
@@ -2108,335 +1632,132 @@
     </w:tbl>
     <w:p>
       <w:pPr>
-        <w:spacing w:after="160"/>
-      </w:pPr>
-    </w:p>
-    <w:p>
-      <w:pPr>
         <w:keepNext/>
-        <w:spacing w:before="280" w:after="120"/>
+        <w:spacing w:before="280" w:after="80"/>
       </w:pPr>
       <w:r>
         <w:rPr>
           <w:rFonts w:ascii="Arial" w:hAnsi="Arial"/>
           <w:b/>
           <w:color w:val="0F7E9B"/>
-          <w:sz w:val="26"/>
+          <w:sz w:val="28"/>
         </w:rPr>
-        <w:t>🔍 Part 2: Guided Conceptual Analysis</w:t>
+        <w:t>🧠 Part 2: Conceptual &amp; Graphical Analysis</w:t>
       </w:r>
     </w:p>
     <w:p>
       <w:pPr>
-        <w:keepNext/>
-        <w:spacing w:before="200" w:after="80"/>
+        <w:spacing w:before="160" w:after="40"/>
       </w:pPr>
       <w:r>
         <w:rPr>
           <w:rFonts w:ascii="Arial" w:hAnsi="Arial"/>
           <w:b/>
           <w:color w:val="D67B19"/>
-          <w:sz w:val="22"/>
+          <w:sz w:val="20"/>
         </w:rPr>
-        <w:t>1. Slope vs. Position Comparison:</w:t>
+        <w:t xml:space="preserve">1. Slope Interpretation: </w:t>
+      </w:r>
+      <w:r>
+        <w:rPr>
+          <w:rFonts w:ascii="Arial" w:hAnsi="Arial"/>
+          <w:color w:val="1E293B"/>
+          <w:sz w:val="19"/>
+        </w:rPr>
+        <w:t>Compare Mission #1 (parabolic x-t curve) and Mission #3 (straight segmented x-t lines). What does a changing slope on a Position-Time graph physically indicate about Coco's speed?</w:t>
       </w:r>
     </w:p>
     <w:p>
       <w:pPr>
-        <w:spacing w:after="80"/>
+        <w:spacing w:after="160"/>
       </w:pPr>
       <w:r>
-        <w:t>Compare Graph E and Graph A. Both start at position x = 0. How do their slopes differ, and what does that tell you about the car's speed over time?</w:t>
+        <w:rPr>
+          <w:rFonts w:ascii="Arial" w:hAnsi="Arial"/>
+          <w:color w:val="64748B"/>
+          <w:sz w:val="18"/>
+        </w:rPr>
+        <w:t>Answer:</w:t>
+        <w:br/>
+        <w:br/>
+        <w:br/>
       </w:r>
     </w:p>
     <w:p>
       <w:pPr>
-        <w:spacing w:after="40"/>
-      </w:pPr>
-      <w:r>
-        <w:rPr>
-          <w:color w:val="64748B"/>
-          <w:sz w:val="19"/>
-        </w:rPr>
-        <w:t>Answer: ____________________________________________________________________________________</w:t>
-      </w:r>
-    </w:p>
-    <w:p>
-      <w:pPr>
-        <w:spacing w:after="40"/>
-      </w:pPr>
-      <w:r>
-        <w:rPr>
-          <w:color w:val="64748B"/>
-          <w:sz w:val="19"/>
-        </w:rPr>
-        <w:t>____________________________________________________________________________________________</w:t>
-      </w:r>
-    </w:p>
-    <w:p>
-      <w:pPr>
-        <w:keepNext/>
-        <w:spacing w:before="200" w:after="80"/>
+        <w:spacing w:before="160" w:after="40"/>
       </w:pPr>
       <w:r>
         <w:rPr>
           <w:rFonts w:ascii="Arial" w:hAnsi="Arial"/>
           <w:b/>
           <w:color w:val="D67B19"/>
-          <w:sz w:val="22"/>
+          <w:sz w:val="20"/>
         </w:rPr>
-        <w:t>2. Visualizing Direction Changes:</w:t>
+        <w:t xml:space="preserve">2. Direction Reversal Analysis: </w:t>
+      </w:r>
+      <w:r>
+        <w:rPr>
+          <w:rFonts w:ascii="Arial" w:hAnsi="Arial"/>
+          <w:color w:val="1E293B"/>
+          <w:sz w:val="19"/>
+        </w:rPr>
+        <w:t>In Mission #6 (The Rebound Arc), Coco reverses direction without ever coming to an extended stop. Describe what the peak (vertex) of this Position-Time parabola represents in terms of velocity.</w:t>
       </w:r>
     </w:p>
     <w:p>
       <w:pPr>
-        <w:spacing w:after="80"/>
+        <w:spacing w:after="160"/>
       </w:pPr>
       <w:r>
-        <w:t>How does a reversal of direction appear on a Position-Time graph (like Graph G) compared to a Velocity-Time graph (like Graph B)?</w:t>
+        <w:rPr>
+          <w:rFonts w:ascii="Arial" w:hAnsi="Arial"/>
+          <w:color w:val="64748B"/>
+          <w:sz w:val="18"/>
+        </w:rPr>
+        <w:t>Answer:</w:t>
+        <w:br/>
+        <w:br/>
+        <w:br/>
       </w:r>
     </w:p>
     <w:p>
       <w:pPr>
-        <w:spacing w:after="40"/>
-      </w:pPr>
-      <w:r>
-        <w:rPr>
-          <w:color w:val="64748B"/>
-          <w:sz w:val="19"/>
-        </w:rPr>
-        <w:t>Position-Time (x-t): ________________________________________________________________________</w:t>
-      </w:r>
-    </w:p>
-    <w:p>
-      <w:pPr>
-        <w:spacing w:after="40"/>
-      </w:pPr>
-      <w:r>
-        <w:rPr>
-          <w:color w:val="64748B"/>
-          <w:sz w:val="19"/>
-        </w:rPr>
-        <w:t>Velocity-Time (v-t): ________________________________________________________________________</w:t>
-      </w:r>
-    </w:p>
-    <w:p>
-      <w:pPr>
-        <w:keepNext/>
-        <w:spacing w:before="200" w:after="80"/>
+        <w:spacing w:before="160" w:after="40"/>
       </w:pPr>
       <w:r>
         <w:rPr>
           <w:rFonts w:ascii="Arial" w:hAnsi="Arial"/>
           <w:b/>
           <w:color w:val="D67B19"/>
-          <w:sz w:val="22"/>
+          <w:sz w:val="20"/>
         </w:rPr>
-        <w:t>3. Physical Meaning of Zero Velocity:</w:t>
+        <w:t xml:space="preserve">3. Velocity-Time vs. Position-Time Rest: </w:t>
+      </w:r>
+      <w:r>
+        <w:rPr>
+          <w:rFonts w:ascii="Arial" w:hAnsi="Arial"/>
+          <w:color w:val="1E293B"/>
+          <w:sz w:val="19"/>
+        </w:rPr>
+        <w:t>In Mission #4 and Mission #5, Coco comes to a complete rest (v = 0). Explain how a period of rest is represented differently on a Position-Time graph versus a Velocity-Time graph.</w:t>
       </w:r>
     </w:p>
     <w:p>
       <w:pPr>
-        <w:spacing w:after="80"/>
-      </w:pPr>
-      <w:r>
-        <w:t>When an object is stationary at rest for 1.5 seconds, describe what you see across all 3 representations:</w:t>
-      </w:r>
-    </w:p>
-    <w:p>
-      <w:pPr>
-        <w:spacing w:after="40"/>
-      </w:pPr>
-      <w:r>
-        <w:rPr>
-          <w:color w:val="64748B"/>
-          <w:sz w:val="19"/>
-        </w:rPr>
-        <w:t>• Position-Time (x-t) shape: ________________________________________________________________</w:t>
-      </w:r>
-    </w:p>
-    <w:p>
-      <w:pPr>
-        <w:spacing w:after="40"/>
-      </w:pPr>
-      <w:r>
-        <w:rPr>
-          <w:color w:val="64748B"/>
-          <w:sz w:val="19"/>
-        </w:rPr>
-        <w:t>• Velocity-Time (v-t) shape: ________________________________________________________________</w:t>
-      </w:r>
-    </w:p>
-    <w:p>
-      <w:pPr>
-        <w:spacing w:after="40"/>
-      </w:pPr>
-      <w:r>
-        <w:rPr>
-          <w:color w:val="64748B"/>
-          <w:sz w:val="19"/>
-        </w:rPr>
-        <w:t>• Motion Map dots: ________________________________________________________________________</w:t>
-      </w:r>
-    </w:p>
-    <w:p>
-      <w:pPr>
-        <w:keepNext/>
-        <w:spacing w:before="200" w:after="80"/>
+        <w:spacing w:after="160"/>
       </w:pPr>
       <w:r>
         <w:rPr>
           <w:rFonts w:ascii="Arial" w:hAnsi="Arial"/>
-          <w:b/>
-          <w:color w:val="D67B19"/>
-          <w:sz w:val="22"/>
+          <w:color w:val="64748B"/>
+          <w:sz w:val="18"/>
         </w:rPr>
-        <w:t>4. Acceleration Sign &amp; Direction:</w:t>
+        <w:t>Answer:</w:t>
+        <w:br/>
+        <w:br/>
+        <w:br/>
       </w:r>
-    </w:p>
-    <w:p>
-      <w:pPr>
-        <w:spacing w:after="80"/>
-      </w:pPr>
-      <w:r>
-        <w:t>In Graph K, the car is moving in the negative direction (left), but the graph curves upward flattening out. Is the acceleration positive or negative? Explain using Δv.</w:t>
-      </w:r>
-    </w:p>
-    <w:p>
-      <w:pPr>
-        <w:spacing w:after="40"/>
-      </w:pPr>
-      <w:r>
-        <w:rPr>
-          <w:color w:val="64748B"/>
-          <w:sz w:val="19"/>
-        </w:rPr>
-        <w:t>Answer: ____________________________________________________________________________________</w:t>
-      </w:r>
-    </w:p>
-    <w:p>
-      <w:pPr>
-        <w:spacing w:after="40"/>
-      </w:pPr>
-      <w:r>
-        <w:rPr>
-          <w:color w:val="64748B"/>
-          <w:sz w:val="19"/>
-        </w:rPr>
-        <w:t>____________________________________________________________________________________________</w:t>
-      </w:r>
-    </w:p>
-    <w:p>
-      <w:pPr>
-        <w:keepNext/>
-        <w:spacing w:before="280" w:after="120"/>
-      </w:pPr>
-      <w:r>
-        <w:rPr>
-          <w:rFonts w:ascii="Arial" w:hAnsi="Arial"/>
-          <w:b/>
-          <w:color w:val="0F7E9B"/>
-          <w:sz w:val="26"/>
-        </w:rPr>
-        <w:t>💡 Part 3: Partner Challenge (Scenario Builder)</w:t>
-      </w:r>
-    </w:p>
-    <w:p>
-      <w:pPr>
-        <w:spacing w:after="120"/>
-      </w:pPr>
-      <w:r>
-        <w:t>Open the 🛠️ Scenario Builder tab in the simulation. Design a 2-stage motion, record your input parameters below, and challenge your desk partner to predict the resulting graphs!</w:t>
-      </w:r>
-    </w:p>
-    <w:tbl>
-      <w:tblPr>
-        <w:tblW w:type="auto" w:w="0"/>
-        <w:jc w:val="center"/>
-        <w:tblLayout w:type="fixed"/>
-        <w:tblLook w:firstColumn="1" w:firstRow="1" w:lastColumn="0" w:lastRow="0" w:noHBand="0" w:noVBand="1" w:val="04A0"/>
-      </w:tblPr>
-      <w:tblGrid>
-        <w:gridCol w:w="10080"/>
-      </w:tblGrid>
-      <w:tr>
-        <w:tc>
-          <w:tcPr>
-            <w:tcW w:type="dxa" w:w="9360"/>
-            <w:shd w:fill="FDF3E8"/>
-            <w:tcBorders>
-              <w:top w:val="none"/>
-              <w:left w:val="single" w:sz="24" w:color="D67B19"/>
-              <w:bottom w:val="none"/>
-              <w:right w:val="none"/>
-            </w:tcBorders>
-            <w:tcMar>
-              <w:top w:w="140" w:type="dxa"/>
-              <w:bottom w:w="140" w:type="dxa"/>
-              <w:left w:w="200" w:type="dxa"/>
-              <w:right w:w="180" w:type="dxa"/>
-            </w:tcMar>
-          </w:tcPr>
-          <w:p>
-            <w:pPr>
-              <w:spacing w:before="0" w:after="80"/>
-            </w:pPr>
-            <w:r>
-              <w:rPr>
-                <w:rFonts w:ascii="Arial" w:hAnsi="Arial"/>
-                <w:b/>
-                <w:color w:val="D67B19"/>
-                <w:sz w:val="22"/>
-              </w:rPr>
-              <w:t>⚙️ Custom Challenge Design Parameters</w:t>
-            </w:r>
-          </w:p>
-          <w:p>
-            <w:pPr>
-              <w:spacing w:before="40" w:after="40"/>
-            </w:pPr>
-            <w:r>
-              <w:rPr>
-                <w:rFonts w:ascii="Arial" w:hAnsi="Arial"/>
-                <w:color w:val="1E293B"/>
-                <w:sz w:val="20"/>
-              </w:rPr>
-              <w:t>• Stage 1:  Start Position x₀ = _______ m | Initial Velocity v₀ = _______ m/s | Accel a₁ = _______ m/s² | Time Δt₁ = _______ s</w:t>
-            </w:r>
-          </w:p>
-          <w:p>
-            <w:pPr>
-              <w:spacing w:before="40" w:after="40"/>
-            </w:pPr>
-            <w:r>
-              <w:rPr>
-                <w:rFonts w:ascii="Arial" w:hAnsi="Arial"/>
-                <w:color w:val="1E293B"/>
-                <w:sz w:val="20"/>
-              </w:rPr>
-              <w:t>• Stage 2:  Action (Continue / Rest / Reverse): ________________ | Accel a₂ = _______ m/s² | Time Δt₂ = _______ s</w:t>
-            </w:r>
-          </w:p>
-          <w:p>
-            <w:pPr>
-              <w:spacing w:before="40" w:after="40"/>
-            </w:pPr>
-            <w:r>
-              <w:rPr>
-                <w:rFonts w:ascii="Arial" w:hAnsi="Arial"/>
-                <w:color w:val="1E293B"/>
-                <w:sz w:val="20"/>
-              </w:rPr>
-              <w:t>• Partner Prediction Verification:  Did your partner correctly identify the graph shapes?  [  ] Yes   [  ] Needs Revision</w:t>
-            </w:r>
-          </w:p>
-        </w:tc>
-      </w:tr>
-    </w:tbl>
-    <w:p>
-      <w:pPr>
-        <w:spacing w:after="80"/>
-      </w:pPr>
     </w:p>
     <w:sectPr>
       <w:pgSz w:w="12240" w:h="15840"/>

</xml_diff>

<commit_message>
Add dedicated Constant Velocity Unit (CVPM) mode with 8 uniform motion scenarios and updated curriculum docs
</commit_message>
<xml_diff>
--- a/Graph_That_Motion_Student_Handout.docx
+++ b/Graph_That_Motion_Student_Handout.docx
@@ -25,20 +25,20 @@
           <w:rFonts w:ascii="Arial" w:hAnsi="Arial"/>
           <w:b/>
           <w:color w:val="0F7E9B"/>
-          <w:sz w:val="36"/>
+          <w:sz w:val="34"/>
         </w:rPr>
         <w:t>Kinematics Studio: Coco's Motion Lab</w:t>
       </w:r>
     </w:p>
     <w:p>
       <w:pPr>
-        <w:spacing w:after="240"/>
+        <w:spacing w:after="200"/>
       </w:pPr>
       <w:r>
         <w:rPr>
           <w:rFonts w:ascii="Arial" w:hAnsi="Arial"/>
           <w:color w:val="64748B"/>
-          <w:sz w:val="20"/>
+          <w:sz w:val="19"/>
         </w:rPr>
         <w:t>Student Inquiry &amp; Graphical Analysis Worksheet</w:t>
       </w:r>
@@ -56,27 +56,27 @@
       <w:tr>
         <w:tc>
           <w:tcPr>
-            <w:tcW w:type="dxa" w:w="10080"/>
+            <w:tcW w:type="dxa" w:w="10224"/>
             <w:shd w:val="clear" w:color="auto" w:fill="E6F4F8"/>
             <w:tcMar>
-              <w:top w:w="140" w:type="dxa"/>
-              <w:bottom w:w="140" w:type="dxa"/>
-              <w:left w:w="180" w:type="dxa"/>
-              <w:right w:w="180" w:type="dxa"/>
+              <w:top w:w="120" w:type="dxa"/>
+              <w:bottom w:w="120" w:type="dxa"/>
+              <w:left w:w="160" w:type="dxa"/>
+              <w:right w:w="160" w:type="dxa"/>
             </w:tcMar>
           </w:tcPr>
           <w:p>
             <w:pPr>
-              <w:spacing w:after="80"/>
+              <w:spacing w:after="60"/>
             </w:pPr>
             <w:r>
               <w:rPr>
                 <w:rFonts w:ascii="Arial" w:hAnsi="Arial"/>
                 <w:b/>
                 <w:color w:val="0F7E9B"/>
-                <w:sz w:val="21"/>
+                <w:sz w:val="20"/>
               </w:rPr>
-              <w:t>🎯 Learning Objectives</w:t>
+              <w:t>🎯 Learning Objectives — Constant Velocity (CVPM) &amp; Acceleration (CAPM)</w:t>
             </w:r>
           </w:p>
           <w:p>
@@ -87,9 +87,9 @@
               <w:rPr>
                 <w:rFonts w:ascii="Arial" w:hAnsi="Arial"/>
                 <w:color w:val="1E293B"/>
-                <w:sz w:val="19"/>
+                <w:sz w:val="18"/>
               </w:rPr>
-              <w:t>• Translate between 1D dog motions, directional pawprint motion maps, Position-Time (x-t), and Velocity-Time (v-t) graphs.</w:t>
+              <w:t>• Translate between physical dog motions, directional pawprint trails, Position-Time (x-t), and Velocity-Time (v-t) graphs.</w:t>
             </w:r>
           </w:p>
           <w:p>
@@ -100,9 +100,9 @@
               <w:rPr>
                 <w:rFonts w:ascii="Arial" w:hAnsi="Arial"/>
                 <w:color w:val="1E293B"/>
-                <w:sz w:val="19"/>
+                <w:sz w:val="18"/>
               </w:rPr>
-              <w:t>• Apply slope rules: Slope of x-t = Velocity (v); Slope of v-t = Acceleration (a).</w:t>
+              <w:t>• Constant Velocity Rules: Slope of x-t = Velocity (v); Slope of v-t = 0 (horizontal line at v value).</w:t>
             </w:r>
           </w:p>
           <w:p>
@@ -113,9 +113,9 @@
               <w:rPr>
                 <w:rFonts w:ascii="Arial" w:hAnsi="Arial"/>
                 <w:color w:val="1E293B"/>
-                <w:sz w:val="19"/>
+                <w:sz w:val="18"/>
               </w:rPr>
-              <w:t>• Distinguish between parabolic curved trajectories (changing speed) and linear segments (constant speed).</w:t>
+              <w:t>• Understand that flat horizontal lines on x-t mean stationary at rest (v = 0), while on v-t they mean constant speed.</w:t>
             </w:r>
           </w:p>
           <w:p>
@@ -126,9 +126,9 @@
               <w:rPr>
                 <w:rFonts w:ascii="Arial" w:hAnsi="Arial"/>
                 <w:color w:val="1E293B"/>
-                <w:sz w:val="19"/>
+                <w:sz w:val="18"/>
               </w:rPr>
-              <w:t>• Relate motion map pawprint density to acceleration (widening spacing = speeding up; bunching spacing = slowing down).</w:t>
+              <w:t>• Distinguish between linear piecewise segments (uniform motion) and parabolic curves (non-zero acceleration).</w:t>
             </w:r>
           </w:p>
         </w:tc>
@@ -136,7 +136,7 @@
     </w:tbl>
     <w:p>
       <w:pPr>
-        <w:spacing w:after="120"/>
+        <w:spacing w:after="80"/>
       </w:pPr>
     </w:p>
     <w:p>
@@ -149,83 +149,17 @@
           <w:rFonts w:ascii="Arial" w:hAnsi="Arial"/>
           <w:b/>
           <w:color w:val="0F7E9B"/>
-          <w:sz w:val="28"/>
+          <w:sz w:val="27"/>
         </w:rPr>
-        <w:t>🧭 Motion Map Interpretation Key (Pawprint Trail)</w:t>
+        <w:t>🟢 Unit 1: Constant Velocity Particle Model (CVPM)</w:t>
       </w:r>
     </w:p>
     <w:p>
       <w:pPr>
-        <w:spacing w:after="160"/>
+        <w:spacing w:after="80"/>
       </w:pPr>
       <w:r>
-        <w:rPr>
-          <w:color w:val="1E293B"/>
-        </w:rPr>
-        <w:t>Coco drops an amber pawprint at fixed time intervals (Δt = 0.28 s):</w:t>
-        <w:br/>
-      </w:r>
-      <w:r>
-        <w:rPr>
-          <w:b/>
-        </w:rPr>
-        <w:t xml:space="preserve">• Constant Velocity: </w:t>
-      </w:r>
-      <w:r>
-        <w:t>Pawprints are evenly spaced along the runway.</w:t>
-        <w:br/>
-      </w:r>
-      <w:r>
-        <w:rPr>
-          <w:b/>
-        </w:rPr>
-        <w:t xml:space="preserve">• Speeding Up: </w:t>
-      </w:r>
-      <w:r>
-        <w:t>Pawprints spread progressively further apart as Coco accelerates.</w:t>
-        <w:br/>
-      </w:r>
-      <w:r>
-        <w:rPr>
-          <w:b/>
-        </w:rPr>
-        <w:t xml:space="preserve">• Slowing Down: </w:t>
-      </w:r>
-      <w:r>
-        <w:t>Pawprints bunch progressively closer together as Coco brakes.</w:t>
-        <w:br/>
-      </w:r>
-      <w:r>
-        <w:rPr>
-          <w:b/>
-        </w:rPr>
-        <w:t xml:space="preserve">• Stationary (At Rest): </w:t>
-      </w:r>
-      <w:r>
-        <w:t>Pawprints cluster and stack vertically at the exact rest position.</w:t>
-      </w:r>
-    </w:p>
-    <w:p>
-      <w:pPr>
-        <w:keepNext/>
-        <w:spacing w:before="280" w:after="80"/>
-      </w:pPr>
-      <w:r>
-        <w:rPr>
-          <w:rFonts w:ascii="Arial" w:hAnsi="Arial"/>
-          <w:b/>
-          <w:color w:val="0F7E9B"/>
-          <w:sz w:val="28"/>
-        </w:rPr>
-        <w:t>📝 Part 1: Mission Matching Reference Matrix</w:t>
-      </w:r>
-    </w:p>
-    <w:p>
-      <w:pPr>
-        <w:spacing w:after="120"/>
-      </w:pPr>
-      <w:r>
-        <w:t>Observe Coco's 10 kinematic missions in the interactive simulator. Record the motion parameters for each card below:</w:t>
+        <w:t>In the Constant Velocity tab, explore uniform motion where acceleration is zero (a = 0). Match Coco's motions to the correct graphs below:</w:t>
       </w:r>
     </w:p>
     <w:tbl>
@@ -236,151 +170,20 @@
         <w:tblLook w:firstColumn="1" w:firstRow="1" w:lastColumn="0" w:lastRow="0" w:noHBand="0" w:noVBand="1" w:val="04A0"/>
       </w:tblPr>
       <w:tblGrid>
-        <w:gridCol w:w="2016"/>
-        <w:gridCol w:w="2016"/>
-        <w:gridCol w:w="2016"/>
-        <w:gridCol w:w="2016"/>
-        <w:gridCol w:w="2016"/>
+        <w:gridCol w:w="2045"/>
+        <w:gridCol w:w="2045"/>
+        <w:gridCol w:w="2045"/>
+        <w:gridCol w:w="2045"/>
+        <w:gridCol w:w="2045"/>
       </w:tblGrid>
       <w:tr>
         <w:tc>
           <w:tcPr>
-            <w:tcW w:type="dxa" w:w="1008"/>
+            <w:tcW w:type="dxa" w:w="1152"/>
             <w:shd w:val="clear" w:color="auto" w:fill="0F7E9B"/>
             <w:tcMar>
-              <w:top w:w="100" w:type="dxa"/>
-              <w:bottom w:w="100" w:type="dxa"/>
-              <w:left w:w="100" w:type="dxa"/>
-              <w:right w:w="100" w:type="dxa"/>
-            </w:tcMar>
-          </w:tcPr>
-          <w:p>
-            <w:pPr>
-              <w:jc w:val="center"/>
-            </w:pPr>
-            <w:r>
-              <w:rPr>
-                <w:rFonts w:ascii="Arial" w:hAnsi="Arial"/>
-                <w:b/>
-                <w:color w:val="FFFFFF"/>
-                <w:sz w:val="19"/>
-              </w:rPr>
-              <w:t>Card</w:t>
-            </w:r>
-          </w:p>
-        </w:tc>
-        <w:tc>
-          <w:tcPr>
-            <w:tcW w:type="dxa" w:w="1728"/>
-            <w:shd w:val="clear" w:color="auto" w:fill="0F7E9B"/>
-            <w:tcMar>
-              <w:top w:w="100" w:type="dxa"/>
-              <w:bottom w:w="100" w:type="dxa"/>
-              <w:left w:w="100" w:type="dxa"/>
-              <w:right w:w="100" w:type="dxa"/>
-            </w:tcMar>
-          </w:tcPr>
-          <w:p>
-            <w:pPr>
-              <w:jc w:val="left"/>
-            </w:pPr>
-            <w:r>
-              <w:rPr>
-                <w:rFonts w:ascii="Arial" w:hAnsi="Arial"/>
-                <w:b/>
-                <w:color w:val="FFFFFF"/>
-                <w:sz w:val="19"/>
-              </w:rPr>
-              <w:t>Graph Type</w:t>
-            </w:r>
-          </w:p>
-        </w:tc>
-        <w:tc>
-          <w:tcPr>
-            <w:tcW w:type="dxa" w:w="3744"/>
-            <w:shd w:val="clear" w:color="auto" w:fill="0F7E9B"/>
-            <w:tcMar>
-              <w:top w:w="100" w:type="dxa"/>
-              <w:bottom w:w="100" w:type="dxa"/>
-              <w:left w:w="100" w:type="dxa"/>
-              <w:right w:w="100" w:type="dxa"/>
-            </w:tcMar>
-          </w:tcPr>
-          <w:p>
-            <w:pPr>
-              <w:jc w:val="left"/>
-            </w:pPr>
-            <w:r>
-              <w:rPr>
-                <w:rFonts w:ascii="Arial" w:hAnsi="Arial"/>
-                <w:b/>
-                <w:color w:val="FFFFFF"/>
-                <w:sz w:val="19"/>
-              </w:rPr>
-              <w:t>Mission Story &amp; Motion Description</w:t>
-            </w:r>
-          </w:p>
-        </w:tc>
-        <w:tc>
-          <w:tcPr>
-            <w:tcW w:type="dxa" w:w="1296"/>
-            <w:shd w:val="clear" w:color="auto" w:fill="0F7E9B"/>
-            <w:tcMar>
-              <w:top w:w="100" w:type="dxa"/>
-              <w:bottom w:w="100" w:type="dxa"/>
-              <w:left w:w="100" w:type="dxa"/>
-              <w:right w:w="100" w:type="dxa"/>
-            </w:tcMar>
-          </w:tcPr>
-          <w:p>
-            <w:pPr>
-              <w:jc w:val="center"/>
-            </w:pPr>
-            <w:r>
-              <w:rPr>
-                <w:rFonts w:ascii="Arial" w:hAnsi="Arial"/>
-                <w:b/>
-                <w:color w:val="FFFFFF"/>
-                <w:sz w:val="19"/>
-              </w:rPr>
-              <w:t>Initial Dir</w:t>
-            </w:r>
-          </w:p>
-        </w:tc>
-        <w:tc>
-          <w:tcPr>
-            <w:tcW w:type="dxa" w:w="1584"/>
-            <w:shd w:val="clear" w:color="auto" w:fill="0F7E9B"/>
-            <w:tcMar>
-              <w:top w:w="100" w:type="dxa"/>
-              <w:bottom w:w="100" w:type="dxa"/>
-              <w:left w:w="100" w:type="dxa"/>
-              <w:right w:w="100" w:type="dxa"/>
-            </w:tcMar>
-          </w:tcPr>
-          <w:p>
-            <w:pPr>
-              <w:jc w:val="center"/>
-            </w:pPr>
-            <w:r>
-              <w:rPr>
-                <w:rFonts w:ascii="Arial" w:hAnsi="Arial"/>
-                <w:b/>
-                <w:color w:val="FFFFFF"/>
-                <w:sz w:val="19"/>
-              </w:rPr>
-              <w:t>Kinematic State</w:t>
-            </w:r>
-          </w:p>
-        </w:tc>
-      </w:tr>
-      <w:tr>
-        <w:tc>
-          <w:tcPr>
-            <w:tcW w:type="dxa" w:w="1008"/>
-            <w:tcMar>
-              <w:top w:w="70" w:type="dxa"/>
-              <w:bottom w:w="70" w:type="dxa"/>
+              <w:top w:w="80" w:type="dxa"/>
+              <w:bottom w:w="80" w:type="dxa"/>
               <w:left w:w="90" w:type="dxa"/>
               <w:right w:w="90" w:type="dxa"/>
             </w:tcMar>
@@ -393,19 +196,20 @@
               <w:rPr>
                 <w:rFonts w:ascii="Arial" w:hAnsi="Arial"/>
                 <w:b/>
-                <w:color w:val="0F7E9B"/>
+                <w:color w:val="FFFFFF"/>
                 <w:sz w:val="18"/>
               </w:rPr>
-              <w:t>#1</w:t>
+              <w:t>Card</w:t>
             </w:r>
           </w:p>
         </w:tc>
         <w:tc>
           <w:tcPr>
-            <w:tcW w:type="dxa" w:w="1728"/>
+            <w:tcW w:type="dxa" w:w="1584"/>
+            <w:shd w:val="clear" w:color="auto" w:fill="0F7E9B"/>
             <w:tcMar>
-              <w:top w:w="70" w:type="dxa"/>
-              <w:bottom w:w="70" w:type="dxa"/>
+              <w:top w:w="80" w:type="dxa"/>
+              <w:bottom w:w="80" w:type="dxa"/>
               <w:left w:w="90" w:type="dxa"/>
               <w:right w:w="90" w:type="dxa"/>
             </w:tcMar>
@@ -417,19 +221,21 @@
             <w:r>
               <w:rPr>
                 <w:rFonts w:ascii="Arial" w:hAnsi="Arial"/>
-                <w:color w:val="1E293B"/>
+                <w:b/>
+                <w:color w:val="FFFFFF"/>
                 <w:sz w:val="18"/>
               </w:rPr>
-              <w:t>Position-Time</w:t>
+              <w:t>Type</w:t>
             </w:r>
           </w:p>
         </w:tc>
         <w:tc>
           <w:tcPr>
-            <w:tcW w:type="dxa" w:w="3744"/>
+            <w:tcW w:type="dxa" w:w="3888"/>
+            <w:shd w:val="clear" w:color="auto" w:fill="0F7E9B"/>
             <w:tcMar>
-              <w:top w:w="70" w:type="dxa"/>
-              <w:bottom w:w="70" w:type="dxa"/>
+              <w:top w:w="80" w:type="dxa"/>
+              <w:bottom w:w="80" w:type="dxa"/>
               <w:left w:w="90" w:type="dxa"/>
               <w:right w:w="90" w:type="dxa"/>
             </w:tcMar>
@@ -441,70 +247,21 @@
             <w:r>
               <w:rPr>
                 <w:rFonts w:ascii="Arial" w:hAnsi="Arial"/>
-                <w:color w:val="1E293B"/>
+                <w:b/>
+                <w:color w:val="FFFFFF"/>
                 <w:sz w:val="18"/>
               </w:rPr>
-              <w:t>The Backyard Dash: Starts from rest at x=10m, speeds up right (+a).</w:t>
+              <w:t>Motion Description (a = 0)</w:t>
             </w:r>
           </w:p>
         </w:tc>
         <w:tc>
           <w:tcPr>
             <w:tcW w:type="dxa" w:w="1296"/>
+            <w:shd w:val="clear" w:color="auto" w:fill="0F7E9B"/>
             <w:tcMar>
-              <w:top w:w="70" w:type="dxa"/>
-              <w:bottom w:w="70" w:type="dxa"/>
-              <w:left w:w="90" w:type="dxa"/>
-              <w:right w:w="90" w:type="dxa"/>
-            </w:tcMar>
-          </w:tcPr>
-          <w:p>
-            <w:pPr>
-              <w:jc w:val="center"/>
-            </w:pPr>
-            <w:r>
-              <w:rPr>
-                <w:rFonts w:ascii="Arial" w:hAnsi="Arial"/>
-                <w:color w:val="1E293B"/>
-                <w:sz w:val="18"/>
-              </w:rPr>
-              <w:t>+ Right</w:t>
-            </w:r>
-          </w:p>
-        </w:tc>
-        <w:tc>
-          <w:tcPr>
-            <w:tcW w:type="dxa" w:w="1584"/>
-            <w:tcMar>
-              <w:top w:w="70" w:type="dxa"/>
-              <w:bottom w:w="70" w:type="dxa"/>
-              <w:left w:w="90" w:type="dxa"/>
-              <w:right w:w="90" w:type="dxa"/>
-            </w:tcMar>
-          </w:tcPr>
-          <w:p>
-            <w:pPr>
-              <w:jc w:val="center"/>
-            </w:pPr>
-            <w:r>
-              <w:rPr>
-                <w:rFonts w:ascii="Arial" w:hAnsi="Arial"/>
-                <w:color w:val="1E293B"/>
-                <w:sz w:val="18"/>
-              </w:rPr>
-              <w:t>Accelerating</w:t>
-            </w:r>
-          </w:p>
-        </w:tc>
-      </w:tr>
-      <w:tr>
-        <w:tc>
-          <w:tcPr>
-            <w:tcW w:type="dxa" w:w="1008"/>
-            <w:shd w:val="clear" w:color="auto" w:fill="F8FAFC"/>
-            <w:tcMar>
-              <w:top w:w="70" w:type="dxa"/>
-              <w:bottom w:w="70" w:type="dxa"/>
+              <w:top w:w="80" w:type="dxa"/>
+              <w:bottom w:w="80" w:type="dxa"/>
               <w:left w:w="90" w:type="dxa"/>
               <w:right w:w="90" w:type="dxa"/>
             </w:tcMar>
@@ -517,121 +274,20 @@
               <w:rPr>
                 <w:rFonts w:ascii="Arial" w:hAnsi="Arial"/>
                 <w:b/>
-                <w:color w:val="0F7E9B"/>
+                <w:color w:val="FFFFFF"/>
                 <w:sz w:val="18"/>
               </w:rPr>
-              <w:t>#2</w:t>
+              <w:t>Direction</w:t>
             </w:r>
           </w:p>
         </w:tc>
         <w:tc>
           <w:tcPr>
-            <w:tcW w:type="dxa" w:w="1728"/>
-            <w:shd w:val="clear" w:color="auto" w:fill="F8FAFC"/>
+            <w:tcW w:type="dxa" w:w="1872"/>
+            <w:shd w:val="clear" w:color="auto" w:fill="0F7E9B"/>
             <w:tcMar>
-              <w:top w:w="70" w:type="dxa"/>
-              <w:bottom w:w="70" w:type="dxa"/>
-              <w:left w:w="90" w:type="dxa"/>
-              <w:right w:w="90" w:type="dxa"/>
-            </w:tcMar>
-          </w:tcPr>
-          <w:p>
-            <w:pPr>
-              <w:jc w:val="left"/>
-            </w:pPr>
-            <w:r>
-              <w:rPr>
-                <w:rFonts w:ascii="Arial" w:hAnsi="Arial"/>
-                <w:color w:val="1E293B"/>
-                <w:sz w:val="18"/>
-              </w:rPr>
-              <w:t>Velocity-Time</w:t>
-            </w:r>
-          </w:p>
-        </w:tc>
-        <w:tc>
-          <w:tcPr>
-            <w:tcW w:type="dxa" w:w="3744"/>
-            <w:shd w:val="clear" w:color="auto" w:fill="F8FAFC"/>
-            <w:tcMar>
-              <w:top w:w="70" w:type="dxa"/>
-              <w:bottom w:w="70" w:type="dxa"/>
-              <w:left w:w="90" w:type="dxa"/>
-              <w:right w:w="90" w:type="dxa"/>
-            </w:tcMar>
-          </w:tcPr>
-          <w:p>
-            <w:pPr>
-              <w:jc w:val="left"/>
-            </w:pPr>
-            <w:r>
-              <w:rPr>
-                <w:rFonts w:ascii="Arial" w:hAnsi="Arial"/>
-                <w:color w:val="1E293B"/>
-                <w:sz w:val="18"/>
-              </w:rPr>
-              <w:t>The Sudden Treat Pause: Sprints left fast, smoothly decelerating to a stop.</w:t>
-            </w:r>
-          </w:p>
-        </w:tc>
-        <w:tc>
-          <w:tcPr>
-            <w:tcW w:type="dxa" w:w="1296"/>
-            <w:shd w:val="clear" w:color="auto" w:fill="F8FAFC"/>
-            <w:tcMar>
-              <w:top w:w="70" w:type="dxa"/>
-              <w:bottom w:w="70" w:type="dxa"/>
-              <w:left w:w="90" w:type="dxa"/>
-              <w:right w:w="90" w:type="dxa"/>
-            </w:tcMar>
-          </w:tcPr>
-          <w:p>
-            <w:pPr>
-              <w:jc w:val="center"/>
-            </w:pPr>
-            <w:r>
-              <w:rPr>
-                <w:rFonts w:ascii="Arial" w:hAnsi="Arial"/>
-                <w:color w:val="1E293B"/>
-                <w:sz w:val="18"/>
-              </w:rPr>
-              <w:t>- Left</w:t>
-            </w:r>
-          </w:p>
-        </w:tc>
-        <w:tc>
-          <w:tcPr>
-            <w:tcW w:type="dxa" w:w="1584"/>
-            <w:shd w:val="clear" w:color="auto" w:fill="F8FAFC"/>
-            <w:tcMar>
-              <w:top w:w="70" w:type="dxa"/>
-              <w:bottom w:w="70" w:type="dxa"/>
-              <w:left w:w="90" w:type="dxa"/>
-              <w:right w:w="90" w:type="dxa"/>
-            </w:tcMar>
-          </w:tcPr>
-          <w:p>
-            <w:pPr>
-              <w:jc w:val="center"/>
-            </w:pPr>
-            <w:r>
-              <w:rPr>
-                <w:rFonts w:ascii="Arial" w:hAnsi="Arial"/>
-                <w:color w:val="1E293B"/>
-                <w:sz w:val="18"/>
-              </w:rPr>
-              <w:t>Decelerating</w:t>
-            </w:r>
-          </w:p>
-        </w:tc>
-      </w:tr>
-      <w:tr>
-        <w:tc>
-          <w:tcPr>
-            <w:tcW w:type="dxa" w:w="1008"/>
-            <w:tcMar>
-              <w:top w:w="70" w:type="dxa"/>
-              <w:bottom w:w="70" w:type="dxa"/>
+              <w:top w:w="80" w:type="dxa"/>
+              <w:bottom w:w="80" w:type="dxa"/>
               <w:left w:w="90" w:type="dxa"/>
               <w:right w:w="90" w:type="dxa"/>
             </w:tcMar>
@@ -644,106 +300,10 @@
               <w:rPr>
                 <w:rFonts w:ascii="Arial" w:hAnsi="Arial"/>
                 <w:b/>
-                <w:color w:val="0F7E9B"/>
+                <w:color w:val="FFFFFF"/>
                 <w:sz w:val="18"/>
               </w:rPr>
-              <w:t>#3</w:t>
-            </w:r>
-          </w:p>
-        </w:tc>
-        <w:tc>
-          <w:tcPr>
-            <w:tcW w:type="dxa" w:w="1728"/>
-            <w:tcMar>
-              <w:top w:w="70" w:type="dxa"/>
-              <w:bottom w:w="70" w:type="dxa"/>
-              <w:left w:w="90" w:type="dxa"/>
-              <w:right w:w="90" w:type="dxa"/>
-            </w:tcMar>
-          </w:tcPr>
-          <w:p>
-            <w:pPr>
-              <w:jc w:val="left"/>
-            </w:pPr>
-            <w:r>
-              <w:rPr>
-                <w:rFonts w:ascii="Arial" w:hAnsi="Arial"/>
-                <w:color w:val="1E293B"/>
-                <w:sz w:val="18"/>
-              </w:rPr>
-              <w:t>Position-Time</w:t>
-            </w:r>
-          </w:p>
-        </w:tc>
-        <w:tc>
-          <w:tcPr>
-            <w:tcW w:type="dxa" w:w="3744"/>
-            <w:tcMar>
-              <w:top w:w="70" w:type="dxa"/>
-              <w:bottom w:w="70" w:type="dxa"/>
-              <w:left w:w="90" w:type="dxa"/>
-              <w:right w:w="90" w:type="dxa"/>
-            </w:tcMar>
-          </w:tcPr>
-          <w:p>
-            <w:pPr>
-              <w:jc w:val="left"/>
-            </w:pPr>
-            <w:r>
-              <w:rPr>
-                <w:rFonts w:ascii="Arial" w:hAnsi="Arial"/>
-                <w:color w:val="1E293B"/>
-                <w:sz w:val="18"/>
-              </w:rPr>
-              <w:t>The Boundary Patrol: Trots right steadily, then doubles speed right.</w:t>
-            </w:r>
-          </w:p>
-        </w:tc>
-        <w:tc>
-          <w:tcPr>
-            <w:tcW w:type="dxa" w:w="1296"/>
-            <w:tcMar>
-              <w:top w:w="70" w:type="dxa"/>
-              <w:bottom w:w="70" w:type="dxa"/>
-              <w:left w:w="90" w:type="dxa"/>
-              <w:right w:w="90" w:type="dxa"/>
-            </w:tcMar>
-          </w:tcPr>
-          <w:p>
-            <w:pPr>
-              <w:jc w:val="center"/>
-            </w:pPr>
-            <w:r>
-              <w:rPr>
-                <w:rFonts w:ascii="Arial" w:hAnsi="Arial"/>
-                <w:color w:val="1E293B"/>
-                <w:sz w:val="18"/>
-              </w:rPr>
-              <w:t>+ Right</w:t>
-            </w:r>
-          </w:p>
-        </w:tc>
-        <w:tc>
-          <w:tcPr>
-            <w:tcW w:type="dxa" w:w="1584"/>
-            <w:tcMar>
-              <w:top w:w="70" w:type="dxa"/>
-              <w:bottom w:w="70" w:type="dxa"/>
-              <w:left w:w="90" w:type="dxa"/>
-              <w:right w:w="90" w:type="dxa"/>
-            </w:tcMar>
-          </w:tcPr>
-          <w:p>
-            <w:pPr>
-              <w:jc w:val="center"/>
-            </w:pPr>
-            <w:r>
-              <w:rPr>
-                <w:rFonts w:ascii="Arial" w:hAnsi="Arial"/>
-                <w:color w:val="1E293B"/>
-                <w:sz w:val="18"/>
-              </w:rPr>
-              <w:t>Piecewise Const</w:t>
+              <w:t>Speed Comparison</w:t>
             </w:r>
           </w:p>
         </w:tc>
@@ -751,13 +311,12 @@
       <w:tr>
         <w:tc>
           <w:tcPr>
-            <w:tcW w:type="dxa" w:w="1008"/>
-            <w:shd w:val="clear" w:color="auto" w:fill="F8FAFC"/>
+            <w:tcW w:type="dxa" w:w="1152"/>
             <w:tcMar>
-              <w:top w:w="70" w:type="dxa"/>
-              <w:bottom w:w="70" w:type="dxa"/>
-              <w:left w:w="90" w:type="dxa"/>
-              <w:right w:w="90" w:type="dxa"/>
+              <w:top w:w="60" w:type="dxa"/>
+              <w:bottom w:w="60" w:type="dxa"/>
+              <w:left w:w="80" w:type="dxa"/>
+              <w:right w:w="80" w:type="dxa"/>
             </w:tcMar>
           </w:tcPr>
           <w:p>
@@ -769,21 +328,20 @@
                 <w:rFonts w:ascii="Arial" w:hAnsi="Arial"/>
                 <w:b/>
                 <w:color w:val="0F7E9B"/>
-                <w:sz w:val="18"/>
+                <w:sz w:val="17"/>
               </w:rPr>
-              <w:t>#4</w:t>
+              <w:t>CV-1</w:t>
             </w:r>
           </w:p>
         </w:tc>
         <w:tc>
           <w:tcPr>
-            <w:tcW w:type="dxa" w:w="1728"/>
-            <w:shd w:val="clear" w:color="auto" w:fill="F8FAFC"/>
+            <w:tcW w:type="dxa" w:w="1584"/>
             <w:tcMar>
-              <w:top w:w="70" w:type="dxa"/>
-              <w:bottom w:w="70" w:type="dxa"/>
-              <w:left w:w="90" w:type="dxa"/>
-              <w:right w:w="90" w:type="dxa"/>
+              <w:top w:w="60" w:type="dxa"/>
+              <w:bottom w:w="60" w:type="dxa"/>
+              <w:left w:w="80" w:type="dxa"/>
+              <w:right w:w="80" w:type="dxa"/>
             </w:tcMar>
           </w:tcPr>
           <w:p>
@@ -794,21 +352,20 @@
               <w:rPr>
                 <w:rFonts w:ascii="Arial" w:hAnsi="Arial"/>
                 <w:color w:val="1E293B"/>
-                <w:sz w:val="18"/>
+                <w:sz w:val="17"/>
               </w:rPr>
-              <w:t>Velocity-Time</w:t>
+              <w:t>x-t</w:t>
             </w:r>
           </w:p>
         </w:tc>
         <w:tc>
           <w:tcPr>
-            <w:tcW w:type="dxa" w:w="3744"/>
-            <w:shd w:val="clear" w:color="auto" w:fill="F8FAFC"/>
+            <w:tcW w:type="dxa" w:w="3888"/>
             <w:tcMar>
-              <w:top w:w="70" w:type="dxa"/>
-              <w:bottom w:w="70" w:type="dxa"/>
-              <w:left w:w="90" w:type="dxa"/>
-              <w:right w:w="90" w:type="dxa"/>
+              <w:top w:w="60" w:type="dxa"/>
+              <w:bottom w:w="60" w:type="dxa"/>
+              <w:left w:w="80" w:type="dxa"/>
+              <w:right w:w="80" w:type="dxa"/>
             </w:tcMar>
           </w:tcPr>
           <w:p>
@@ -819,21 +376,20 @@
               <w:rPr>
                 <w:rFonts w:ascii="Arial" w:hAnsi="Arial"/>
                 <w:color w:val="1E293B"/>
-                <w:sz w:val="18"/>
+                <w:sz w:val="17"/>
               </w:rPr>
-              <w:t>The Squirrel Hesitation: Slows to rest moving right, pauses, bolts left.</w:t>
+              <w:t>Steady Rightward Trot: Starts at x=2m, trots right at +3.5 m/s.</w:t>
             </w:r>
           </w:p>
         </w:tc>
         <w:tc>
           <w:tcPr>
             <w:tcW w:type="dxa" w:w="1296"/>
-            <w:shd w:val="clear" w:color="auto" w:fill="F8FAFC"/>
             <w:tcMar>
-              <w:top w:w="70" w:type="dxa"/>
-              <w:bottom w:w="70" w:type="dxa"/>
-              <w:left w:w="90" w:type="dxa"/>
-              <w:right w:w="90" w:type="dxa"/>
+              <w:top w:w="60" w:type="dxa"/>
+              <w:bottom w:w="60" w:type="dxa"/>
+              <w:left w:w="80" w:type="dxa"/>
+              <w:right w:w="80" w:type="dxa"/>
             </w:tcMar>
           </w:tcPr>
           <w:p>
@@ -844,21 +400,20 @@
               <w:rPr>
                 <w:rFonts w:ascii="Arial" w:hAnsi="Arial"/>
                 <w:color w:val="1E293B"/>
-                <w:sz w:val="18"/>
+                <w:sz w:val="17"/>
               </w:rPr>
-              <w:t>+ then -</w:t>
+              <w:t>+ Right</w:t>
             </w:r>
           </w:p>
         </w:tc>
         <w:tc>
           <w:tcPr>
-            <w:tcW w:type="dxa" w:w="1584"/>
-            <w:shd w:val="clear" w:color="auto" w:fill="F8FAFC"/>
+            <w:tcW w:type="dxa" w:w="1872"/>
             <w:tcMar>
-              <w:top w:w="70" w:type="dxa"/>
-              <w:bottom w:w="70" w:type="dxa"/>
-              <w:left w:w="90" w:type="dxa"/>
-              <w:right w:w="90" w:type="dxa"/>
+              <w:top w:w="60" w:type="dxa"/>
+              <w:bottom w:w="60" w:type="dxa"/>
+              <w:left w:w="80" w:type="dxa"/>
+              <w:right w:w="80" w:type="dxa"/>
             </w:tcMar>
           </w:tcPr>
           <w:p>
@@ -869,9 +424,9 @@
               <w:rPr>
                 <w:rFonts w:ascii="Arial" w:hAnsi="Arial"/>
                 <w:color w:val="1E293B"/>
-                <w:sz w:val="18"/>
+                <w:sz w:val="17"/>
               </w:rPr>
-              <w:t>Multi-Stage</w:t>
+              <w:t>Uniform (+3.5 m/s)</w:t>
             </w:r>
           </w:p>
         </w:tc>
@@ -879,12 +434,13 @@
       <w:tr>
         <w:tc>
           <w:tcPr>
-            <w:tcW w:type="dxa" w:w="1008"/>
+            <w:tcW w:type="dxa" w:w="1152"/>
+            <w:shd w:val="clear" w:color="auto" w:fill="F8FAFC"/>
             <w:tcMar>
-              <w:top w:w="70" w:type="dxa"/>
-              <w:bottom w:w="70" w:type="dxa"/>
-              <w:left w:w="90" w:type="dxa"/>
-              <w:right w:w="90" w:type="dxa"/>
+              <w:top w:w="60" w:type="dxa"/>
+              <w:bottom w:w="60" w:type="dxa"/>
+              <w:left w:w="80" w:type="dxa"/>
+              <w:right w:w="80" w:type="dxa"/>
             </w:tcMar>
           </w:tcPr>
           <w:p>
@@ -896,20 +452,21 @@
                 <w:rFonts w:ascii="Arial" w:hAnsi="Arial"/>
                 <w:b/>
                 <w:color w:val="0F7E9B"/>
-                <w:sz w:val="18"/>
+                <w:sz w:val="17"/>
               </w:rPr>
-              <w:t>#5</w:t>
+              <w:t>CV-2</w:t>
             </w:r>
           </w:p>
         </w:tc>
         <w:tc>
           <w:tcPr>
-            <w:tcW w:type="dxa" w:w="1728"/>
+            <w:tcW w:type="dxa" w:w="1584"/>
+            <w:shd w:val="clear" w:color="auto" w:fill="F8FAFC"/>
             <w:tcMar>
-              <w:top w:w="70" w:type="dxa"/>
-              <w:bottom w:w="70" w:type="dxa"/>
-              <w:left w:w="90" w:type="dxa"/>
-              <w:right w:w="90" w:type="dxa"/>
+              <w:top w:w="60" w:type="dxa"/>
+              <w:bottom w:w="60" w:type="dxa"/>
+              <w:left w:w="80" w:type="dxa"/>
+              <w:right w:w="80" w:type="dxa"/>
             </w:tcMar>
           </w:tcPr>
           <w:p>
@@ -920,20 +477,21 @@
               <w:rPr>
                 <w:rFonts w:ascii="Arial" w:hAnsi="Arial"/>
                 <w:color w:val="1E293B"/>
-                <w:sz w:val="18"/>
+                <w:sz w:val="17"/>
               </w:rPr>
-              <w:t>Position-Time</w:t>
+              <w:t>v-t</w:t>
             </w:r>
           </w:p>
         </w:tc>
         <w:tc>
           <w:tcPr>
-            <w:tcW w:type="dxa" w:w="3744"/>
+            <w:tcW w:type="dxa" w:w="3888"/>
+            <w:shd w:val="clear" w:color="auto" w:fill="F8FAFC"/>
             <w:tcMar>
-              <w:top w:w="70" w:type="dxa"/>
-              <w:bottom w:w="70" w:type="dxa"/>
-              <w:left w:w="90" w:type="dxa"/>
-              <w:right w:w="90" w:type="dxa"/>
+              <w:top w:w="60" w:type="dxa"/>
+              <w:bottom w:w="60" w:type="dxa"/>
+              <w:left w:w="80" w:type="dxa"/>
+              <w:right w:w="80" w:type="dxa"/>
             </w:tcMar>
           </w:tcPr>
           <w:p>
@@ -944,20 +502,21 @@
               <w:rPr>
                 <w:rFonts w:ascii="Arial" w:hAnsi="Arial"/>
                 <w:color w:val="1E293B"/>
-                <w:sz w:val="18"/>
+                <w:sz w:val="17"/>
               </w:rPr>
-              <w:t>The Steady Sniff Tour: Trots left at const speed, stops to sniff, resumes left.</w:t>
+              <w:t>Steady Leftward Trot: Starts at x=18m, trots left at -3.5 m/s.</w:t>
             </w:r>
           </w:p>
         </w:tc>
         <w:tc>
           <w:tcPr>
             <w:tcW w:type="dxa" w:w="1296"/>
+            <w:shd w:val="clear" w:color="auto" w:fill="F8FAFC"/>
             <w:tcMar>
-              <w:top w:w="70" w:type="dxa"/>
-              <w:bottom w:w="70" w:type="dxa"/>
-              <w:left w:w="90" w:type="dxa"/>
-              <w:right w:w="90" w:type="dxa"/>
+              <w:top w:w="60" w:type="dxa"/>
+              <w:bottom w:w="60" w:type="dxa"/>
+              <w:left w:w="80" w:type="dxa"/>
+              <w:right w:w="80" w:type="dxa"/>
             </w:tcMar>
           </w:tcPr>
           <w:p>
@@ -968,7 +527,7 @@
               <w:rPr>
                 <w:rFonts w:ascii="Arial" w:hAnsi="Arial"/>
                 <w:color w:val="1E293B"/>
-                <w:sz w:val="18"/>
+                <w:sz w:val="17"/>
               </w:rPr>
               <w:t>- Left</w:t>
             </w:r>
@@ -976,12 +535,13 @@
         </w:tc>
         <w:tc>
           <w:tcPr>
-            <w:tcW w:type="dxa" w:w="1584"/>
+            <w:tcW w:type="dxa" w:w="1872"/>
+            <w:shd w:val="clear" w:color="auto" w:fill="F8FAFC"/>
             <w:tcMar>
-              <w:top w:w="70" w:type="dxa"/>
-              <w:bottom w:w="70" w:type="dxa"/>
-              <w:left w:w="90" w:type="dxa"/>
-              <w:right w:w="90" w:type="dxa"/>
+              <w:top w:w="60" w:type="dxa"/>
+              <w:bottom w:w="60" w:type="dxa"/>
+              <w:left w:w="80" w:type="dxa"/>
+              <w:right w:w="80" w:type="dxa"/>
             </w:tcMar>
           </w:tcPr>
           <w:p>
@@ -992,9 +552,9 @@
               <w:rPr>
                 <w:rFonts w:ascii="Arial" w:hAnsi="Arial"/>
                 <w:color w:val="1E293B"/>
-                <w:sz w:val="18"/>
+                <w:sz w:val="17"/>
               </w:rPr>
-              <w:t>Uniform w/ Rest</w:t>
+              <w:t>Uniform (-3.5 m/s)</w:t>
             </w:r>
           </w:p>
         </w:tc>
@@ -1002,13 +562,12 @@
       <w:tr>
         <w:tc>
           <w:tcPr>
-            <w:tcW w:type="dxa" w:w="1008"/>
-            <w:shd w:val="clear" w:color="auto" w:fill="F8FAFC"/>
+            <w:tcW w:type="dxa" w:w="1152"/>
             <w:tcMar>
-              <w:top w:w="70" w:type="dxa"/>
-              <w:bottom w:w="70" w:type="dxa"/>
-              <w:left w:w="90" w:type="dxa"/>
-              <w:right w:w="90" w:type="dxa"/>
+              <w:top w:w="60" w:type="dxa"/>
+              <w:bottom w:w="60" w:type="dxa"/>
+              <w:left w:w="80" w:type="dxa"/>
+              <w:right w:w="80" w:type="dxa"/>
             </w:tcMar>
           </w:tcPr>
           <w:p>
@@ -1020,21 +579,20 @@
                 <w:rFonts w:ascii="Arial" w:hAnsi="Arial"/>
                 <w:b/>
                 <w:color w:val="0F7E9B"/>
-                <w:sz w:val="18"/>
+                <w:sz w:val="17"/>
               </w:rPr>
-              <w:t>#6</w:t>
+              <w:t>CV-3</w:t>
             </w:r>
           </w:p>
         </w:tc>
         <w:tc>
           <w:tcPr>
-            <w:tcW w:type="dxa" w:w="1728"/>
-            <w:shd w:val="clear" w:color="auto" w:fill="F8FAFC"/>
+            <w:tcW w:type="dxa" w:w="1584"/>
             <w:tcMar>
-              <w:top w:w="70" w:type="dxa"/>
-              <w:bottom w:w="70" w:type="dxa"/>
-              <w:left w:w="90" w:type="dxa"/>
-              <w:right w:w="90" w:type="dxa"/>
+              <w:top w:w="60" w:type="dxa"/>
+              <w:bottom w:w="60" w:type="dxa"/>
+              <w:left w:w="80" w:type="dxa"/>
+              <w:right w:w="80" w:type="dxa"/>
             </w:tcMar>
           </w:tcPr>
           <w:p>
@@ -1045,21 +603,20 @@
               <w:rPr>
                 <w:rFonts w:ascii="Arial" w:hAnsi="Arial"/>
                 <w:color w:val="1E293B"/>
-                <w:sz w:val="18"/>
+                <w:sz w:val="17"/>
               </w:rPr>
-              <w:t>Position-Time</w:t>
+              <w:t>x-t</w:t>
             </w:r>
           </w:p>
         </w:tc>
         <w:tc>
           <w:tcPr>
-            <w:tcW w:type="dxa" w:w="3744"/>
-            <w:shd w:val="clear" w:color="auto" w:fill="F8FAFC"/>
+            <w:tcW w:type="dxa" w:w="3888"/>
             <w:tcMar>
-              <w:top w:w="70" w:type="dxa"/>
-              <w:bottom w:w="70" w:type="dxa"/>
-              <w:left w:w="90" w:type="dxa"/>
-              <w:right w:w="90" w:type="dxa"/>
+              <w:top w:w="60" w:type="dxa"/>
+              <w:bottom w:w="60" w:type="dxa"/>
+              <w:left w:w="80" w:type="dxa"/>
+              <w:right w:w="80" w:type="dxa"/>
             </w:tcMar>
           </w:tcPr>
           <w:p>
@@ -1070,21 +627,20 @@
               <w:rPr>
                 <w:rFonts w:ascii="Arial" w:hAnsi="Arial"/>
                 <w:color w:val="1E293B"/>
-                <w:sz w:val="18"/>
+                <w:sz w:val="17"/>
               </w:rPr>
-              <w:t>The Rebound Arc: Runs right slowing down, peaks, turns around left smoothly.</w:t>
+              <w:t>Patient Sniff: Sits at rest at x=12m sniffing a treat (v = 0).</w:t>
             </w:r>
           </w:p>
         </w:tc>
         <w:tc>
           <w:tcPr>
             <w:tcW w:type="dxa" w:w="1296"/>
-            <w:shd w:val="clear" w:color="auto" w:fill="F8FAFC"/>
             <w:tcMar>
-              <w:top w:w="70" w:type="dxa"/>
-              <w:bottom w:w="70" w:type="dxa"/>
-              <w:left w:w="90" w:type="dxa"/>
-              <w:right w:w="90" w:type="dxa"/>
+              <w:top w:w="60" w:type="dxa"/>
+              <w:bottom w:w="60" w:type="dxa"/>
+              <w:left w:w="80" w:type="dxa"/>
+              <w:right w:w="80" w:type="dxa"/>
             </w:tcMar>
           </w:tcPr>
           <w:p>
@@ -1095,21 +651,20 @@
               <w:rPr>
                 <w:rFonts w:ascii="Arial" w:hAnsi="Arial"/>
                 <w:color w:val="1E293B"/>
-                <w:sz w:val="18"/>
+                <w:sz w:val="17"/>
               </w:rPr>
-              <w:t>+ then -</w:t>
+              <w:t>Rest (0)</w:t>
             </w:r>
           </w:p>
         </w:tc>
         <w:tc>
           <w:tcPr>
-            <w:tcW w:type="dxa" w:w="1584"/>
-            <w:shd w:val="clear" w:color="auto" w:fill="F8FAFC"/>
+            <w:tcW w:type="dxa" w:w="1872"/>
             <w:tcMar>
-              <w:top w:w="70" w:type="dxa"/>
-              <w:bottom w:w="70" w:type="dxa"/>
-              <w:left w:w="90" w:type="dxa"/>
-              <w:right w:w="90" w:type="dxa"/>
+              <w:top w:w="60" w:type="dxa"/>
+              <w:bottom w:w="60" w:type="dxa"/>
+              <w:left w:w="80" w:type="dxa"/>
+              <w:right w:w="80" w:type="dxa"/>
             </w:tcMar>
           </w:tcPr>
           <w:p>
@@ -1120,9 +675,9 @@
               <w:rPr>
                 <w:rFonts w:ascii="Arial" w:hAnsi="Arial"/>
                 <w:color w:val="1E293B"/>
-                <w:sz w:val="18"/>
+                <w:sz w:val="17"/>
               </w:rPr>
-              <w:t>Continuous Turn</w:t>
+              <w:t>Zero Velocity</w:t>
             </w:r>
           </w:p>
         </w:tc>
@@ -1130,12 +685,13 @@
       <w:tr>
         <w:tc>
           <w:tcPr>
-            <w:tcW w:type="dxa" w:w="1008"/>
+            <w:tcW w:type="dxa" w:w="1152"/>
+            <w:shd w:val="clear" w:color="auto" w:fill="F8FAFC"/>
             <w:tcMar>
-              <w:top w:w="70" w:type="dxa"/>
-              <w:bottom w:w="70" w:type="dxa"/>
-              <w:left w:w="90" w:type="dxa"/>
-              <w:right w:w="90" w:type="dxa"/>
+              <w:top w:w="60" w:type="dxa"/>
+              <w:bottom w:w="60" w:type="dxa"/>
+              <w:left w:w="80" w:type="dxa"/>
+              <w:right w:w="80" w:type="dxa"/>
             </w:tcMar>
           </w:tcPr>
           <w:p>
@@ -1147,20 +703,21 @@
                 <w:rFonts w:ascii="Arial" w:hAnsi="Arial"/>
                 <w:b/>
                 <w:color w:val="0F7E9B"/>
-                <w:sz w:val="18"/>
+                <w:sz w:val="17"/>
               </w:rPr>
-              <w:t>#7</w:t>
+              <w:t>CV-4</w:t>
             </w:r>
           </w:p>
         </w:tc>
         <w:tc>
           <w:tcPr>
-            <w:tcW w:type="dxa" w:w="1728"/>
+            <w:tcW w:type="dxa" w:w="1584"/>
+            <w:shd w:val="clear" w:color="auto" w:fill="F8FAFC"/>
             <w:tcMar>
-              <w:top w:w="70" w:type="dxa"/>
-              <w:bottom w:w="70" w:type="dxa"/>
-              <w:left w:w="90" w:type="dxa"/>
-              <w:right w:w="90" w:type="dxa"/>
+              <w:top w:w="60" w:type="dxa"/>
+              <w:bottom w:w="60" w:type="dxa"/>
+              <w:left w:w="80" w:type="dxa"/>
+              <w:right w:w="80" w:type="dxa"/>
             </w:tcMar>
           </w:tcPr>
           <w:p>
@@ -1171,20 +728,21 @@
               <w:rPr>
                 <w:rFonts w:ascii="Arial" w:hAnsi="Arial"/>
                 <w:color w:val="1E293B"/>
-                <w:sz w:val="18"/>
+                <w:sz w:val="17"/>
               </w:rPr>
-              <w:t>Velocity-Time</w:t>
+              <w:t>v-t</w:t>
             </w:r>
           </w:p>
         </w:tc>
         <w:tc>
           <w:tcPr>
-            <w:tcW w:type="dxa" w:w="3744"/>
+            <w:tcW w:type="dxa" w:w="3888"/>
+            <w:shd w:val="clear" w:color="auto" w:fill="F8FAFC"/>
             <w:tcMar>
-              <w:top w:w="70" w:type="dxa"/>
-              <w:bottom w:w="70" w:type="dxa"/>
-              <w:left w:w="90" w:type="dxa"/>
-              <w:right w:w="90" w:type="dxa"/>
+              <w:top w:w="60" w:type="dxa"/>
+              <w:bottom w:w="60" w:type="dxa"/>
+              <w:left w:w="80" w:type="dxa"/>
+              <w:right w:w="80" w:type="dxa"/>
             </w:tcMar>
           </w:tcPr>
           <w:p>
@@ -1195,20 +753,21 @@
               <w:rPr>
                 <w:rFonts w:ascii="Arial" w:hAnsi="Arial"/>
                 <w:color w:val="1E293B"/>
-                <w:sz w:val="18"/>
+                <w:sz w:val="17"/>
               </w:rPr>
-              <w:t>Launch &amp; Glide: Accelerates from rest right, then cruises at const speed.</w:t>
+              <w:t>Fast Zoomie: Sprints right at high uniform velocity (+7.0 m/s).</w:t>
             </w:r>
           </w:p>
         </w:tc>
         <w:tc>
           <w:tcPr>
             <w:tcW w:type="dxa" w:w="1296"/>
+            <w:shd w:val="clear" w:color="auto" w:fill="F8FAFC"/>
             <w:tcMar>
-              <w:top w:w="70" w:type="dxa"/>
-              <w:bottom w:w="70" w:type="dxa"/>
-              <w:left w:w="90" w:type="dxa"/>
-              <w:right w:w="90" w:type="dxa"/>
+              <w:top w:w="60" w:type="dxa"/>
+              <w:bottom w:w="60" w:type="dxa"/>
+              <w:left w:w="80" w:type="dxa"/>
+              <w:right w:w="80" w:type="dxa"/>
             </w:tcMar>
           </w:tcPr>
           <w:p>
@@ -1219,7 +778,7 @@
               <w:rPr>
                 <w:rFonts w:ascii="Arial" w:hAnsi="Arial"/>
                 <w:color w:val="1E293B"/>
-                <w:sz w:val="18"/>
+                <w:sz w:val="17"/>
               </w:rPr>
               <w:t>+ Right</w:t>
             </w:r>
@@ -1227,12 +786,13 @@
         </w:tc>
         <w:tc>
           <w:tcPr>
-            <w:tcW w:type="dxa" w:w="1584"/>
+            <w:tcW w:type="dxa" w:w="1872"/>
+            <w:shd w:val="clear" w:color="auto" w:fill="F8FAFC"/>
             <w:tcMar>
-              <w:top w:w="70" w:type="dxa"/>
-              <w:bottom w:w="70" w:type="dxa"/>
-              <w:left w:w="90" w:type="dxa"/>
-              <w:right w:w="90" w:type="dxa"/>
+              <w:top w:w="60" w:type="dxa"/>
+              <w:bottom w:w="60" w:type="dxa"/>
+              <w:left w:w="80" w:type="dxa"/>
+              <w:right w:w="80" w:type="dxa"/>
             </w:tcMar>
           </w:tcPr>
           <w:p>
@@ -1243,9 +803,9 @@
               <w:rPr>
                 <w:rFonts w:ascii="Arial" w:hAnsi="Arial"/>
                 <w:color w:val="1E293B"/>
-                <w:sz w:val="18"/>
+                <w:sz w:val="17"/>
               </w:rPr>
-              <w:t>Accel to Const</w:t>
+              <w:t>Fast Uniform</w:t>
             </w:r>
           </w:p>
         </w:tc>
@@ -1253,13 +813,12 @@
       <w:tr>
         <w:tc>
           <w:tcPr>
-            <w:tcW w:type="dxa" w:w="1008"/>
-            <w:shd w:val="clear" w:color="auto" w:fill="F8FAFC"/>
+            <w:tcW w:type="dxa" w:w="1152"/>
             <w:tcMar>
-              <w:top w:w="70" w:type="dxa"/>
-              <w:bottom w:w="70" w:type="dxa"/>
-              <w:left w:w="90" w:type="dxa"/>
-              <w:right w:w="90" w:type="dxa"/>
+              <w:top w:w="60" w:type="dxa"/>
+              <w:bottom w:w="60" w:type="dxa"/>
+              <w:left w:w="80" w:type="dxa"/>
+              <w:right w:w="80" w:type="dxa"/>
             </w:tcMar>
           </w:tcPr>
           <w:p>
@@ -1271,21 +830,20 @@
                 <w:rFonts w:ascii="Arial" w:hAnsi="Arial"/>
                 <w:b/>
                 <w:color w:val="0F7E9B"/>
-                <w:sz w:val="18"/>
+                <w:sz w:val="17"/>
               </w:rPr>
-              <w:t>#8</w:t>
+              <w:t>CV-5</w:t>
             </w:r>
           </w:p>
         </w:tc>
         <w:tc>
           <w:tcPr>
-            <w:tcW w:type="dxa" w:w="1728"/>
-            <w:shd w:val="clear" w:color="auto" w:fill="F8FAFC"/>
+            <w:tcW w:type="dxa" w:w="1584"/>
             <w:tcMar>
-              <w:top w:w="70" w:type="dxa"/>
-              <w:bottom w:w="70" w:type="dxa"/>
-              <w:left w:w="90" w:type="dxa"/>
-              <w:right w:w="90" w:type="dxa"/>
+              <w:top w:w="60" w:type="dxa"/>
+              <w:bottom w:w="60" w:type="dxa"/>
+              <w:left w:w="80" w:type="dxa"/>
+              <w:right w:w="80" w:type="dxa"/>
             </w:tcMar>
           </w:tcPr>
           <w:p>
@@ -1296,21 +854,20 @@
               <w:rPr>
                 <w:rFonts w:ascii="Arial" w:hAnsi="Arial"/>
                 <w:color w:val="1E293B"/>
-                <w:sz w:val="18"/>
+                <w:sz w:val="17"/>
               </w:rPr>
-              <w:t>Velocity-Time</w:t>
+              <w:t>x-t</w:t>
             </w:r>
           </w:p>
         </w:tc>
         <w:tc>
           <w:tcPr>
-            <w:tcW w:type="dxa" w:w="3744"/>
-            <w:shd w:val="clear" w:color="auto" w:fill="F8FAFC"/>
+            <w:tcW w:type="dxa" w:w="3888"/>
             <w:tcMar>
-              <w:top w:w="70" w:type="dxa"/>
-              <w:bottom w:w="70" w:type="dxa"/>
-              <w:left w:w="90" w:type="dxa"/>
-              <w:right w:w="90" w:type="dxa"/>
+              <w:top w:w="60" w:type="dxa"/>
+              <w:bottom w:w="60" w:type="dxa"/>
+              <w:left w:w="80" w:type="dxa"/>
+              <w:right w:w="80" w:type="dxa"/>
             </w:tcMar>
           </w:tcPr>
           <w:p>
@@ -1321,21 +878,20 @@
               <w:rPr>
                 <w:rFonts w:ascii="Arial" w:hAnsi="Arial"/>
                 <w:color w:val="1E293B"/>
-                <w:sz w:val="18"/>
+                <w:sz w:val="17"/>
               </w:rPr>
-              <w:t>Leftward Zoomies: Launches from rest at right, accelerating steadily left (-a).</w:t>
+              <w:t>Trot, Sniff, Trot: Trots right (+4 m/s) → stops (v=0) → trots right (+4 m/s).</w:t>
             </w:r>
           </w:p>
         </w:tc>
         <w:tc>
           <w:tcPr>
             <w:tcW w:type="dxa" w:w="1296"/>
-            <w:shd w:val="clear" w:color="auto" w:fill="F8FAFC"/>
             <w:tcMar>
-              <w:top w:w="70" w:type="dxa"/>
-              <w:bottom w:w="70" w:type="dxa"/>
-              <w:left w:w="90" w:type="dxa"/>
-              <w:right w:w="90" w:type="dxa"/>
+              <w:top w:w="60" w:type="dxa"/>
+              <w:bottom w:w="60" w:type="dxa"/>
+              <w:left w:w="80" w:type="dxa"/>
+              <w:right w:w="80" w:type="dxa"/>
             </w:tcMar>
           </w:tcPr>
           <w:p>
@@ -1346,21 +902,20 @@
               <w:rPr>
                 <w:rFonts w:ascii="Arial" w:hAnsi="Arial"/>
                 <w:color w:val="1E293B"/>
-                <w:sz w:val="18"/>
+                <w:sz w:val="17"/>
               </w:rPr>
-              <w:t>- Left</w:t>
+              <w:t>+ Right</w:t>
             </w:r>
           </w:p>
         </w:tc>
         <w:tc>
           <w:tcPr>
-            <w:tcW w:type="dxa" w:w="1584"/>
-            <w:shd w:val="clear" w:color="auto" w:fill="F8FAFC"/>
+            <w:tcW w:type="dxa" w:w="1872"/>
             <w:tcMar>
-              <w:top w:w="70" w:type="dxa"/>
-              <w:bottom w:w="70" w:type="dxa"/>
-              <w:left w:w="90" w:type="dxa"/>
-              <w:right w:w="90" w:type="dxa"/>
+              <w:top w:w="60" w:type="dxa"/>
+              <w:bottom w:w="60" w:type="dxa"/>
+              <w:left w:w="80" w:type="dxa"/>
+              <w:right w:w="80" w:type="dxa"/>
             </w:tcMar>
           </w:tcPr>
           <w:p>
@@ -1371,9 +926,9 @@
               <w:rPr>
                 <w:rFonts w:ascii="Arial" w:hAnsi="Arial"/>
                 <w:color w:val="1E293B"/>
-                <w:sz w:val="18"/>
+                <w:sz w:val="17"/>
               </w:rPr>
-              <w:t>Accelerating</w:t>
+              <w:t>Multi-Stage w/ Rest</w:t>
             </w:r>
           </w:p>
         </w:tc>
@@ -1381,12 +936,13 @@
       <w:tr>
         <w:tc>
           <w:tcPr>
-            <w:tcW w:type="dxa" w:w="1008"/>
+            <w:tcW w:type="dxa" w:w="1152"/>
+            <w:shd w:val="clear" w:color="auto" w:fill="F8FAFC"/>
             <w:tcMar>
-              <w:top w:w="70" w:type="dxa"/>
-              <w:bottom w:w="70" w:type="dxa"/>
-              <w:left w:w="90" w:type="dxa"/>
-              <w:right w:w="90" w:type="dxa"/>
+              <w:top w:w="60" w:type="dxa"/>
+              <w:bottom w:w="60" w:type="dxa"/>
+              <w:left w:w="80" w:type="dxa"/>
+              <w:right w:w="80" w:type="dxa"/>
             </w:tcMar>
           </w:tcPr>
           <w:p>
@@ -1398,20 +954,21 @@
                 <w:rFonts w:ascii="Arial" w:hAnsi="Arial"/>
                 <w:b/>
                 <w:color w:val="0F7E9B"/>
-                <w:sz w:val="18"/>
+                <w:sz w:val="17"/>
               </w:rPr>
-              <w:t>#9</w:t>
+              <w:t>CV-6</w:t>
             </w:r>
           </w:p>
         </w:tc>
         <w:tc>
           <w:tcPr>
-            <w:tcW w:type="dxa" w:w="1728"/>
+            <w:tcW w:type="dxa" w:w="1584"/>
+            <w:shd w:val="clear" w:color="auto" w:fill="F8FAFC"/>
             <w:tcMar>
-              <w:top w:w="70" w:type="dxa"/>
-              <w:bottom w:w="70" w:type="dxa"/>
-              <w:left w:w="90" w:type="dxa"/>
-              <w:right w:w="90" w:type="dxa"/>
+              <w:top w:w="60" w:type="dxa"/>
+              <w:bottom w:w="60" w:type="dxa"/>
+              <w:left w:w="80" w:type="dxa"/>
+              <w:right w:w="80" w:type="dxa"/>
             </w:tcMar>
           </w:tcPr>
           <w:p>
@@ -1422,20 +979,21 @@
               <w:rPr>
                 <w:rFonts w:ascii="Arial" w:hAnsi="Arial"/>
                 <w:color w:val="1E293B"/>
-                <w:sz w:val="18"/>
+                <w:sz w:val="17"/>
               </w:rPr>
-              <w:t>Position-Time</w:t>
+              <w:t>x-t</w:t>
             </w:r>
           </w:p>
         </w:tc>
         <w:tc>
           <w:tcPr>
-            <w:tcW w:type="dxa" w:w="3744"/>
+            <w:tcW w:type="dxa" w:w="3888"/>
+            <w:shd w:val="clear" w:color="auto" w:fill="F8FAFC"/>
             <w:tcMar>
-              <w:top w:w="70" w:type="dxa"/>
-              <w:bottom w:w="70" w:type="dxa"/>
-              <w:left w:w="90" w:type="dxa"/>
-              <w:right w:w="90" w:type="dxa"/>
+              <w:top w:w="60" w:type="dxa"/>
+              <w:bottom w:w="60" w:type="dxa"/>
+              <w:left w:w="80" w:type="dxa"/>
+              <w:right w:w="80" w:type="dxa"/>
             </w:tcMar>
           </w:tcPr>
           <w:p>
@@ -1446,20 +1004,21 @@
               <w:rPr>
                 <w:rFonts w:ascii="Arial" w:hAnsi="Arial"/>
                 <w:color w:val="1E293B"/>
-                <w:sz w:val="18"/>
+                <w:sz w:val="17"/>
               </w:rPr>
-              <w:t>The Zig-Zag Search: Const speed right → turns const speed left → turns right.</w:t>
+              <w:t>Fetch &amp; Return: Jogs right (+4.5 m/s) → grabs ball → runs back left (-4.5 m/s).</w:t>
             </w:r>
           </w:p>
         </w:tc>
         <w:tc>
           <w:tcPr>
             <w:tcW w:type="dxa" w:w="1296"/>
+            <w:shd w:val="clear" w:color="auto" w:fill="F8FAFC"/>
             <w:tcMar>
-              <w:top w:w="70" w:type="dxa"/>
-              <w:bottom w:w="70" w:type="dxa"/>
-              <w:left w:w="90" w:type="dxa"/>
-              <w:right w:w="90" w:type="dxa"/>
+              <w:top w:w="60" w:type="dxa"/>
+              <w:bottom w:w="60" w:type="dxa"/>
+              <w:left w:w="80" w:type="dxa"/>
+              <w:right w:w="80" w:type="dxa"/>
             </w:tcMar>
           </w:tcPr>
           <w:p>
@@ -1470,20 +1029,21 @@
               <w:rPr>
                 <w:rFonts w:ascii="Arial" w:hAnsi="Arial"/>
                 <w:color w:val="1E293B"/>
-                <w:sz w:val="18"/>
+                <w:sz w:val="17"/>
               </w:rPr>
-              <w:t>+ / - / +</w:t>
+              <w:t>+ then -</w:t>
             </w:r>
           </w:p>
         </w:tc>
         <w:tc>
           <w:tcPr>
-            <w:tcW w:type="dxa" w:w="1584"/>
+            <w:tcW w:type="dxa" w:w="1872"/>
+            <w:shd w:val="clear" w:color="auto" w:fill="F8FAFC"/>
             <w:tcMar>
-              <w:top w:w="70" w:type="dxa"/>
-              <w:bottom w:w="70" w:type="dxa"/>
-              <w:left w:w="90" w:type="dxa"/>
-              <w:right w:w="90" w:type="dxa"/>
+              <w:top w:w="60" w:type="dxa"/>
+              <w:bottom w:w="60" w:type="dxa"/>
+              <w:left w:w="80" w:type="dxa"/>
+              <w:right w:w="80" w:type="dxa"/>
             </w:tcMar>
           </w:tcPr>
           <w:p>
@@ -1494,9 +1054,9 @@
               <w:rPr>
                 <w:rFonts w:ascii="Arial" w:hAnsi="Arial"/>
                 <w:color w:val="1E293B"/>
-                <w:sz w:val="18"/>
+                <w:sz w:val="17"/>
               </w:rPr>
-              <w:t>Piecewise 3-Stage</w:t>
+              <w:t>Direction Reversal</w:t>
             </w:r>
           </w:p>
         </w:tc>
@@ -1504,13 +1064,12 @@
       <w:tr>
         <w:tc>
           <w:tcPr>
-            <w:tcW w:type="dxa" w:w="1008"/>
-            <w:shd w:val="clear" w:color="auto" w:fill="F8FAFC"/>
+            <w:tcW w:type="dxa" w:w="1152"/>
             <w:tcMar>
-              <w:top w:w="70" w:type="dxa"/>
-              <w:bottom w:w="70" w:type="dxa"/>
-              <w:left w:w="90" w:type="dxa"/>
-              <w:right w:w="90" w:type="dxa"/>
+              <w:top w:w="60" w:type="dxa"/>
+              <w:bottom w:w="60" w:type="dxa"/>
+              <w:left w:w="80" w:type="dxa"/>
+              <w:right w:w="80" w:type="dxa"/>
             </w:tcMar>
           </w:tcPr>
           <w:p>
@@ -1522,21 +1081,20 @@
                 <w:rFonts w:ascii="Arial" w:hAnsi="Arial"/>
                 <w:b/>
                 <w:color w:val="0F7E9B"/>
-                <w:sz w:val="18"/>
+                <w:sz w:val="17"/>
               </w:rPr>
-              <w:t>#10</w:t>
+              <w:t>CV-7</w:t>
             </w:r>
           </w:p>
         </w:tc>
         <w:tc>
           <w:tcPr>
-            <w:tcW w:type="dxa" w:w="1728"/>
-            <w:shd w:val="clear" w:color="auto" w:fill="F8FAFC"/>
+            <w:tcW w:type="dxa" w:w="1584"/>
             <w:tcMar>
-              <w:top w:w="70" w:type="dxa"/>
-              <w:bottom w:w="70" w:type="dxa"/>
-              <w:left w:w="90" w:type="dxa"/>
-              <w:right w:w="90" w:type="dxa"/>
+              <w:top w:w="60" w:type="dxa"/>
+              <w:bottom w:w="60" w:type="dxa"/>
+              <w:left w:w="80" w:type="dxa"/>
+              <w:right w:w="80" w:type="dxa"/>
             </w:tcMar>
           </w:tcPr>
           <w:p>
@@ -1547,21 +1105,20 @@
               <w:rPr>
                 <w:rFonts w:ascii="Arial" w:hAnsi="Arial"/>
                 <w:color w:val="1E293B"/>
-                <w:sz w:val="18"/>
+                <w:sz w:val="17"/>
               </w:rPr>
-              <w:t>Velocity-Time</w:t>
+              <w:t>v-t</w:t>
             </w:r>
           </w:p>
         </w:tc>
         <w:tc>
           <w:tcPr>
-            <w:tcW w:type="dxa" w:w="3744"/>
-            <w:shd w:val="clear" w:color="auto" w:fill="F8FAFC"/>
+            <w:tcW w:type="dxa" w:w="3888"/>
             <w:tcMar>
-              <w:top w:w="70" w:type="dxa"/>
-              <w:bottom w:w="70" w:type="dxa"/>
-              <w:left w:w="90" w:type="dxa"/>
-              <w:right w:w="90" w:type="dxa"/>
+              <w:top w:w="60" w:type="dxa"/>
+              <w:bottom w:w="60" w:type="dxa"/>
+              <w:left w:w="80" w:type="dxa"/>
+              <w:right w:w="80" w:type="dxa"/>
             </w:tcMar>
           </w:tcPr>
           <w:p>
@@ -1572,21 +1129,20 @@
               <w:rPr>
                 <w:rFonts w:ascii="Arial" w:hAnsi="Arial"/>
                 <w:color w:val="1E293B"/>
-                <w:sz w:val="18"/>
+                <w:sz w:val="17"/>
               </w:rPr>
-              <w:t>The Bell-Curve Trot: Accelerates right from rest → cruises → decelerates to rest.</w:t>
+              <w:t>Left Trot w/ Pause: Walks left (-3.5 m/s) → pauses (v=0) → walks left.</w:t>
             </w:r>
           </w:p>
         </w:tc>
         <w:tc>
           <w:tcPr>
             <w:tcW w:type="dxa" w:w="1296"/>
-            <w:shd w:val="clear" w:color="auto" w:fill="F8FAFC"/>
             <w:tcMar>
-              <w:top w:w="70" w:type="dxa"/>
-              <w:bottom w:w="70" w:type="dxa"/>
-              <w:left w:w="90" w:type="dxa"/>
-              <w:right w:w="90" w:type="dxa"/>
+              <w:top w:w="60" w:type="dxa"/>
+              <w:bottom w:w="60" w:type="dxa"/>
+              <w:left w:w="80" w:type="dxa"/>
+              <w:right w:w="80" w:type="dxa"/>
             </w:tcMar>
           </w:tcPr>
           <w:p>
@@ -1597,21 +1153,20 @@
               <w:rPr>
                 <w:rFonts w:ascii="Arial" w:hAnsi="Arial"/>
                 <w:color w:val="1E293B"/>
-                <w:sz w:val="18"/>
+                <w:sz w:val="17"/>
               </w:rPr>
-              <w:t>+ Right</w:t>
+              <w:t>- Left</w:t>
             </w:r>
           </w:p>
         </w:tc>
         <w:tc>
           <w:tcPr>
-            <w:tcW w:type="dxa" w:w="1584"/>
-            <w:shd w:val="clear" w:color="auto" w:fill="F8FAFC"/>
+            <w:tcW w:type="dxa" w:w="1872"/>
             <w:tcMar>
-              <w:top w:w="70" w:type="dxa"/>
-              <w:bottom w:w="70" w:type="dxa"/>
-              <w:left w:w="90" w:type="dxa"/>
-              <w:right w:w="90" w:type="dxa"/>
+              <w:top w:w="60" w:type="dxa"/>
+              <w:bottom w:w="60" w:type="dxa"/>
+              <w:left w:w="80" w:type="dxa"/>
+              <w:right w:w="80" w:type="dxa"/>
             </w:tcMar>
           </w:tcPr>
           <w:p>
@@ -1622,9 +1177,137 @@
               <w:rPr>
                 <w:rFonts w:ascii="Arial" w:hAnsi="Arial"/>
                 <w:color w:val="1E293B"/>
-                <w:sz w:val="18"/>
+                <w:sz w:val="17"/>
               </w:rPr>
-              <w:t>Trapezoidal</w:t>
+              <w:t>Multi-Stage (-v)</w:t>
+            </w:r>
+          </w:p>
+        </w:tc>
+      </w:tr>
+      <w:tr>
+        <w:tc>
+          <w:tcPr>
+            <w:tcW w:type="dxa" w:w="1152"/>
+            <w:shd w:val="clear" w:color="auto" w:fill="F8FAFC"/>
+            <w:tcMar>
+              <w:top w:w="60" w:type="dxa"/>
+              <w:bottom w:w="60" w:type="dxa"/>
+              <w:left w:w="80" w:type="dxa"/>
+              <w:right w:w="80" w:type="dxa"/>
+            </w:tcMar>
+          </w:tcPr>
+          <w:p>
+            <w:pPr>
+              <w:jc w:val="center"/>
+            </w:pPr>
+            <w:r>
+              <w:rPr>
+                <w:rFonts w:ascii="Arial" w:hAnsi="Arial"/>
+                <w:b/>
+                <w:color w:val="0F7E9B"/>
+                <w:sz w:val="17"/>
+              </w:rPr>
+              <w:t>CV-8</w:t>
+            </w:r>
+          </w:p>
+        </w:tc>
+        <w:tc>
+          <w:tcPr>
+            <w:tcW w:type="dxa" w:w="1584"/>
+            <w:shd w:val="clear" w:color="auto" w:fill="F8FAFC"/>
+            <w:tcMar>
+              <w:top w:w="60" w:type="dxa"/>
+              <w:bottom w:w="60" w:type="dxa"/>
+              <w:left w:w="80" w:type="dxa"/>
+              <w:right w:w="80" w:type="dxa"/>
+            </w:tcMar>
+          </w:tcPr>
+          <w:p>
+            <w:pPr>
+              <w:jc w:val="left"/>
+            </w:pPr>
+            <w:r>
+              <w:rPr>
+                <w:rFonts w:ascii="Arial" w:hAnsi="Arial"/>
+                <w:color w:val="1E293B"/>
+                <w:sz w:val="17"/>
+              </w:rPr>
+              <w:t>x-t</w:t>
+            </w:r>
+          </w:p>
+        </w:tc>
+        <w:tc>
+          <w:tcPr>
+            <w:tcW w:type="dxa" w:w="3888"/>
+            <w:shd w:val="clear" w:color="auto" w:fill="F8FAFC"/>
+            <w:tcMar>
+              <w:top w:w="60" w:type="dxa"/>
+              <w:bottom w:w="60" w:type="dxa"/>
+              <w:left w:w="80" w:type="dxa"/>
+              <w:right w:w="80" w:type="dxa"/>
+            </w:tcMar>
+          </w:tcPr>
+          <w:p>
+            <w:pPr>
+              <w:jc w:val="left"/>
+            </w:pPr>
+            <w:r>
+              <w:rPr>
+                <w:rFonts w:ascii="Arial" w:hAnsi="Arial"/>
+                <w:color w:val="1E293B"/>
+                <w:sz w:val="17"/>
+              </w:rPr>
+              <w:t>Speed Shift: Walks right at +2.5 m/s, then shifts to fast +6.0 m/s sprint.</w:t>
+            </w:r>
+          </w:p>
+        </w:tc>
+        <w:tc>
+          <w:tcPr>
+            <w:tcW w:type="dxa" w:w="1296"/>
+            <w:shd w:val="clear" w:color="auto" w:fill="F8FAFC"/>
+            <w:tcMar>
+              <w:top w:w="60" w:type="dxa"/>
+              <w:bottom w:w="60" w:type="dxa"/>
+              <w:left w:w="80" w:type="dxa"/>
+              <w:right w:w="80" w:type="dxa"/>
+            </w:tcMar>
+          </w:tcPr>
+          <w:p>
+            <w:pPr>
+              <w:jc w:val="center"/>
+            </w:pPr>
+            <w:r>
+              <w:rPr>
+                <w:rFonts w:ascii="Arial" w:hAnsi="Arial"/>
+                <w:color w:val="1E293B"/>
+                <w:sz w:val="17"/>
+              </w:rPr>
+              <w:t>+ Right</w:t>
+            </w:r>
+          </w:p>
+        </w:tc>
+        <w:tc>
+          <w:tcPr>
+            <w:tcW w:type="dxa" w:w="1872"/>
+            <w:shd w:val="clear" w:color="auto" w:fill="F8FAFC"/>
+            <w:tcMar>
+              <w:top w:w="60" w:type="dxa"/>
+              <w:bottom w:w="60" w:type="dxa"/>
+              <w:left w:w="80" w:type="dxa"/>
+              <w:right w:w="80" w:type="dxa"/>
+            </w:tcMar>
+          </w:tcPr>
+          <w:p>
+            <w:pPr>
+              <w:jc w:val="center"/>
+            </w:pPr>
+            <w:r>
+              <w:rPr>
+                <w:rFonts w:ascii="Arial" w:hAnsi="Arial"/>
+                <w:color w:val="1E293B"/>
+                <w:sz w:val="17"/>
+              </w:rPr>
+              <w:t>Shallow to Steep Slope</w:t>
             </w:r>
           </w:p>
         </w:tc>
@@ -1640,128 +1323,1152 @@
           <w:rFonts w:ascii="Arial" w:hAnsi="Arial"/>
           <w:b/>
           <w:color w:val="0F7E9B"/>
-          <w:sz w:val="28"/>
+          <w:sz w:val="27"/>
         </w:rPr>
-        <w:t>🧠 Part 2: Conceptual &amp; Graphical Analysis</w:t>
+        <w:t>🚀 Unit 2: Constant Acceleration Model (CAPM)</w:t>
       </w:r>
     </w:p>
     <w:p>
       <w:pPr>
-        <w:spacing w:before="160" w:after="40"/>
+        <w:spacing w:after="80"/>
       </w:pPr>
       <w:r>
-        <w:rPr>
-          <w:rFonts w:ascii="Arial" w:hAnsi="Arial"/>
-          <w:b/>
-          <w:color w:val="D67B19"/>
-          <w:sz w:val="20"/>
-        </w:rPr>
-        <w:t xml:space="preserve">1. Slope Interpretation: </w:t>
-      </w:r>
-      <w:r>
-        <w:rPr>
-          <w:rFonts w:ascii="Arial" w:hAnsi="Arial"/>
-          <w:color w:val="1E293B"/>
-          <w:sz w:val="19"/>
-        </w:rPr>
-        <w:t>Compare Mission #1 (parabolic x-t curve) and Mission #3 (straight segmented x-t lines). What does a changing slope on a Position-Time graph physically indicate about Coco's speed?</w:t>
+        <w:t>In the Full Kinematics tab, explore non-zero acceleration (a ≠ 0) involving curved Position graphs and sloping Velocity graphs:</w:t>
       </w:r>
     </w:p>
-    <w:p>
-      <w:pPr>
-        <w:spacing w:after="160"/>
-      </w:pPr>
-      <w:r>
-        <w:rPr>
-          <w:rFonts w:ascii="Arial" w:hAnsi="Arial"/>
-          <w:color w:val="64748B"/>
-          <w:sz w:val="18"/>
-        </w:rPr>
-        <w:t>Answer:</w:t>
-        <w:br/>
-        <w:br/>
-        <w:br/>
-      </w:r>
-    </w:p>
-    <w:p>
-      <w:pPr>
-        <w:spacing w:before="160" w:after="40"/>
-      </w:pPr>
-      <w:r>
-        <w:rPr>
-          <w:rFonts w:ascii="Arial" w:hAnsi="Arial"/>
-          <w:b/>
-          <w:color w:val="D67B19"/>
-          <w:sz w:val="20"/>
-        </w:rPr>
-        <w:t xml:space="preserve">2. Direction Reversal Analysis: </w:t>
-      </w:r>
-      <w:r>
-        <w:rPr>
-          <w:rFonts w:ascii="Arial" w:hAnsi="Arial"/>
-          <w:color w:val="1E293B"/>
-          <w:sz w:val="19"/>
-        </w:rPr>
-        <w:t>In Mission #6 (The Rebound Arc), Coco reverses direction without ever coming to an extended stop. Describe what the peak (vertex) of this Position-Time parabola represents in terms of velocity.</w:t>
-      </w:r>
-    </w:p>
-    <w:p>
-      <w:pPr>
-        <w:spacing w:after="160"/>
-      </w:pPr>
-      <w:r>
-        <w:rPr>
-          <w:rFonts w:ascii="Arial" w:hAnsi="Arial"/>
-          <w:color w:val="64748B"/>
-          <w:sz w:val="18"/>
-        </w:rPr>
-        <w:t>Answer:</w:t>
-        <w:br/>
-        <w:br/>
-        <w:br/>
-      </w:r>
-    </w:p>
-    <w:p>
-      <w:pPr>
-        <w:spacing w:before="160" w:after="40"/>
-      </w:pPr>
-      <w:r>
-        <w:rPr>
-          <w:rFonts w:ascii="Arial" w:hAnsi="Arial"/>
-          <w:b/>
-          <w:color w:val="D67B19"/>
-          <w:sz w:val="20"/>
-        </w:rPr>
-        <w:t xml:space="preserve">3. Velocity-Time vs. Position-Time Rest: </w:t>
-      </w:r>
-      <w:r>
-        <w:rPr>
-          <w:rFonts w:ascii="Arial" w:hAnsi="Arial"/>
-          <w:color w:val="1E293B"/>
-          <w:sz w:val="19"/>
-        </w:rPr>
-        <w:t>In Mission #4 and Mission #5, Coco comes to a complete rest (v = 0). Explain how a period of rest is represented differently on a Position-Time graph versus a Velocity-Time graph.</w:t>
-      </w:r>
-    </w:p>
-    <w:p>
-      <w:pPr>
-        <w:spacing w:after="160"/>
-      </w:pPr>
-      <w:r>
-        <w:rPr>
-          <w:rFonts w:ascii="Arial" w:hAnsi="Arial"/>
-          <w:color w:val="64748B"/>
-          <w:sz w:val="18"/>
-        </w:rPr>
-        <w:t>Answer:</w:t>
-        <w:br/>
-        <w:br/>
-        <w:br/>
-      </w:r>
-    </w:p>
+    <w:tbl>
+      <w:tblPr>
+        <w:tblW w:type="auto" w:w="0"/>
+        <w:jc w:val="center"/>
+        <w:tblLayout w:type="fixed"/>
+        <w:tblLook w:firstColumn="1" w:firstRow="1" w:lastColumn="0" w:lastRow="0" w:noHBand="0" w:noVBand="1" w:val="04A0"/>
+      </w:tblPr>
+      <w:tblGrid>
+        <w:gridCol w:w="2556"/>
+        <w:gridCol w:w="2556"/>
+        <w:gridCol w:w="2556"/>
+        <w:gridCol w:w="2556"/>
+      </w:tblGrid>
+      <w:tr>
+        <w:tc>
+          <w:tcPr>
+            <w:tcW w:type="dxa" w:w="1296"/>
+            <w:shd w:val="clear" w:color="auto" w:fill="D67B19"/>
+            <w:tcMar>
+              <w:top w:w="80" w:type="dxa"/>
+              <w:bottom w:w="80" w:type="dxa"/>
+              <w:left w:w="90" w:type="dxa"/>
+              <w:right w:w="90" w:type="dxa"/>
+            </w:tcMar>
+          </w:tcPr>
+          <w:p>
+            <w:pPr>
+              <w:jc w:val="center"/>
+            </w:pPr>
+            <w:r>
+              <w:rPr>
+                <w:rFonts w:ascii="Arial" w:hAnsi="Arial"/>
+                <w:b/>
+                <w:color w:val="FFFFFF"/>
+                <w:sz w:val="18"/>
+              </w:rPr>
+              <w:t>Mission</w:t>
+            </w:r>
+          </w:p>
+        </w:tc>
+        <w:tc>
+          <w:tcPr>
+            <w:tcW w:type="dxa" w:w="1584"/>
+            <w:shd w:val="clear" w:color="auto" w:fill="D67B19"/>
+            <w:tcMar>
+              <w:top w:w="80" w:type="dxa"/>
+              <w:bottom w:w="80" w:type="dxa"/>
+              <w:left w:w="90" w:type="dxa"/>
+              <w:right w:w="90" w:type="dxa"/>
+            </w:tcMar>
+          </w:tcPr>
+          <w:p>
+            <w:pPr>
+              <w:jc w:val="center"/>
+            </w:pPr>
+            <w:r>
+              <w:rPr>
+                <w:rFonts w:ascii="Arial" w:hAnsi="Arial"/>
+                <w:b/>
+                <w:color w:val="FFFFFF"/>
+                <w:sz w:val="18"/>
+              </w:rPr>
+              <w:t>Type</w:t>
+            </w:r>
+          </w:p>
+        </w:tc>
+        <w:tc>
+          <w:tcPr>
+            <w:tcW w:type="dxa" w:w="4608"/>
+            <w:shd w:val="clear" w:color="auto" w:fill="D67B19"/>
+            <w:tcMar>
+              <w:top w:w="80" w:type="dxa"/>
+              <w:bottom w:w="80" w:type="dxa"/>
+              <w:left w:w="90" w:type="dxa"/>
+              <w:right w:w="90" w:type="dxa"/>
+            </w:tcMar>
+          </w:tcPr>
+          <w:p>
+            <w:pPr>
+              <w:jc w:val="left"/>
+            </w:pPr>
+            <w:r>
+              <w:rPr>
+                <w:rFonts w:ascii="Arial" w:hAnsi="Arial"/>
+                <w:b/>
+                <w:color w:val="FFFFFF"/>
+                <w:sz w:val="18"/>
+              </w:rPr>
+              <w:t>Motion Description (a ≠ 0)</w:t>
+            </w:r>
+          </w:p>
+        </w:tc>
+        <w:tc>
+          <w:tcPr>
+            <w:tcW w:type="dxa" w:w="2304"/>
+            <w:shd w:val="clear" w:color="auto" w:fill="D67B19"/>
+            <w:tcMar>
+              <w:top w:w="80" w:type="dxa"/>
+              <w:bottom w:w="80" w:type="dxa"/>
+              <w:left w:w="90" w:type="dxa"/>
+              <w:right w:w="90" w:type="dxa"/>
+            </w:tcMar>
+          </w:tcPr>
+          <w:p>
+            <w:pPr>
+              <w:jc w:val="center"/>
+            </w:pPr>
+            <w:r>
+              <w:rPr>
+                <w:rFonts w:ascii="Arial" w:hAnsi="Arial"/>
+                <w:b/>
+                <w:color w:val="FFFFFF"/>
+                <w:sz w:val="18"/>
+              </w:rPr>
+              <w:t>Acceleration State</w:t>
+            </w:r>
+          </w:p>
+        </w:tc>
+      </w:tr>
+      <w:tr>
+        <w:tc>
+          <w:tcPr>
+            <w:tcW w:type="dxa" w:w="1296"/>
+            <w:tcMar>
+              <w:top w:w="60" w:type="dxa"/>
+              <w:bottom w:w="60" w:type="dxa"/>
+              <w:left w:w="80" w:type="dxa"/>
+              <w:right w:w="80" w:type="dxa"/>
+            </w:tcMar>
+          </w:tcPr>
+          <w:p>
+            <w:pPr>
+              <w:jc w:val="center"/>
+            </w:pPr>
+            <w:r>
+              <w:rPr>
+                <w:rFonts w:ascii="Arial" w:hAnsi="Arial"/>
+                <w:b/>
+                <w:color w:val="D67B19"/>
+                <w:sz w:val="17"/>
+              </w:rPr>
+              <w:t>#1</w:t>
+            </w:r>
+          </w:p>
+        </w:tc>
+        <w:tc>
+          <w:tcPr>
+            <w:tcW w:type="dxa" w:w="1584"/>
+            <w:tcMar>
+              <w:top w:w="60" w:type="dxa"/>
+              <w:bottom w:w="60" w:type="dxa"/>
+              <w:left w:w="80" w:type="dxa"/>
+              <w:right w:w="80" w:type="dxa"/>
+            </w:tcMar>
+          </w:tcPr>
+          <w:p>
+            <w:pPr>
+              <w:jc w:val="center"/>
+            </w:pPr>
+            <w:r>
+              <w:rPr>
+                <w:rFonts w:ascii="Arial" w:hAnsi="Arial"/>
+                <w:color w:val="1E293B"/>
+                <w:sz w:val="17"/>
+              </w:rPr>
+              <w:t>x-t</w:t>
+            </w:r>
+          </w:p>
+        </w:tc>
+        <w:tc>
+          <w:tcPr>
+            <w:tcW w:type="dxa" w:w="4608"/>
+            <w:tcMar>
+              <w:top w:w="60" w:type="dxa"/>
+              <w:bottom w:w="60" w:type="dxa"/>
+              <w:left w:w="80" w:type="dxa"/>
+              <w:right w:w="80" w:type="dxa"/>
+            </w:tcMar>
+          </w:tcPr>
+          <w:p>
+            <w:pPr>
+              <w:jc w:val="left"/>
+            </w:pPr>
+            <w:r>
+              <w:rPr>
+                <w:rFonts w:ascii="Arial" w:hAnsi="Arial"/>
+                <w:color w:val="1E293B"/>
+                <w:sz w:val="17"/>
+              </w:rPr>
+              <w:t>The Backyard Dash: Starts from rest at x=10m, speeds up right (+a).</w:t>
+            </w:r>
+          </w:p>
+        </w:tc>
+        <w:tc>
+          <w:tcPr>
+            <w:tcW w:type="dxa" w:w="2304"/>
+            <w:tcMar>
+              <w:top w:w="60" w:type="dxa"/>
+              <w:bottom w:w="60" w:type="dxa"/>
+              <w:left w:w="80" w:type="dxa"/>
+              <w:right w:w="80" w:type="dxa"/>
+            </w:tcMar>
+          </w:tcPr>
+          <w:p>
+            <w:pPr>
+              <w:jc w:val="center"/>
+            </w:pPr>
+            <w:r>
+              <w:rPr>
+                <w:rFonts w:ascii="Arial" w:hAnsi="Arial"/>
+                <w:color w:val="1E293B"/>
+                <w:sz w:val="17"/>
+              </w:rPr>
+              <w:t>+a (Parabolic Curve)</w:t>
+            </w:r>
+          </w:p>
+        </w:tc>
+      </w:tr>
+      <w:tr>
+        <w:tc>
+          <w:tcPr>
+            <w:tcW w:type="dxa" w:w="1296"/>
+            <w:shd w:val="clear" w:color="auto" w:fill="FDF3E8"/>
+            <w:tcMar>
+              <w:top w:w="60" w:type="dxa"/>
+              <w:bottom w:w="60" w:type="dxa"/>
+              <w:left w:w="80" w:type="dxa"/>
+              <w:right w:w="80" w:type="dxa"/>
+            </w:tcMar>
+          </w:tcPr>
+          <w:p>
+            <w:pPr>
+              <w:jc w:val="center"/>
+            </w:pPr>
+            <w:r>
+              <w:rPr>
+                <w:rFonts w:ascii="Arial" w:hAnsi="Arial"/>
+                <w:b/>
+                <w:color w:val="D67B19"/>
+                <w:sz w:val="17"/>
+              </w:rPr>
+              <w:t>#2</w:t>
+            </w:r>
+          </w:p>
+        </w:tc>
+        <w:tc>
+          <w:tcPr>
+            <w:tcW w:type="dxa" w:w="1584"/>
+            <w:shd w:val="clear" w:color="auto" w:fill="FDF3E8"/>
+            <w:tcMar>
+              <w:top w:w="60" w:type="dxa"/>
+              <w:bottom w:w="60" w:type="dxa"/>
+              <w:left w:w="80" w:type="dxa"/>
+              <w:right w:w="80" w:type="dxa"/>
+            </w:tcMar>
+          </w:tcPr>
+          <w:p>
+            <w:pPr>
+              <w:jc w:val="center"/>
+            </w:pPr>
+            <w:r>
+              <w:rPr>
+                <w:rFonts w:ascii="Arial" w:hAnsi="Arial"/>
+                <w:color w:val="1E293B"/>
+                <w:sz w:val="17"/>
+              </w:rPr>
+              <w:t>v-t</w:t>
+            </w:r>
+          </w:p>
+        </w:tc>
+        <w:tc>
+          <w:tcPr>
+            <w:tcW w:type="dxa" w:w="4608"/>
+            <w:shd w:val="clear" w:color="auto" w:fill="FDF3E8"/>
+            <w:tcMar>
+              <w:top w:w="60" w:type="dxa"/>
+              <w:bottom w:w="60" w:type="dxa"/>
+              <w:left w:w="80" w:type="dxa"/>
+              <w:right w:w="80" w:type="dxa"/>
+            </w:tcMar>
+          </w:tcPr>
+          <w:p>
+            <w:pPr>
+              <w:jc w:val="left"/>
+            </w:pPr>
+            <w:r>
+              <w:rPr>
+                <w:rFonts w:ascii="Arial" w:hAnsi="Arial"/>
+                <w:color w:val="1E293B"/>
+                <w:sz w:val="17"/>
+              </w:rPr>
+              <w:t>The Sudden Treat Pause: Sprints left fast, smoothly decelerating to rest.</w:t>
+            </w:r>
+          </w:p>
+        </w:tc>
+        <w:tc>
+          <w:tcPr>
+            <w:tcW w:type="dxa" w:w="2304"/>
+            <w:shd w:val="clear" w:color="auto" w:fill="FDF3E8"/>
+            <w:tcMar>
+              <w:top w:w="60" w:type="dxa"/>
+              <w:bottom w:w="60" w:type="dxa"/>
+              <w:left w:w="80" w:type="dxa"/>
+              <w:right w:w="80" w:type="dxa"/>
+            </w:tcMar>
+          </w:tcPr>
+          <w:p>
+            <w:pPr>
+              <w:jc w:val="center"/>
+            </w:pPr>
+            <w:r>
+              <w:rPr>
+                <w:rFonts w:ascii="Arial" w:hAnsi="Arial"/>
+                <w:color w:val="1E293B"/>
+                <w:sz w:val="17"/>
+              </w:rPr>
+              <w:t>+a Deceleration</w:t>
+            </w:r>
+          </w:p>
+        </w:tc>
+      </w:tr>
+      <w:tr>
+        <w:tc>
+          <w:tcPr>
+            <w:tcW w:type="dxa" w:w="1296"/>
+            <w:tcMar>
+              <w:top w:w="60" w:type="dxa"/>
+              <w:bottom w:w="60" w:type="dxa"/>
+              <w:left w:w="80" w:type="dxa"/>
+              <w:right w:w="80" w:type="dxa"/>
+            </w:tcMar>
+          </w:tcPr>
+          <w:p>
+            <w:pPr>
+              <w:jc w:val="center"/>
+            </w:pPr>
+            <w:r>
+              <w:rPr>
+                <w:rFonts w:ascii="Arial" w:hAnsi="Arial"/>
+                <w:b/>
+                <w:color w:val="D67B19"/>
+                <w:sz w:val="17"/>
+              </w:rPr>
+              <w:t>#3</w:t>
+            </w:r>
+          </w:p>
+        </w:tc>
+        <w:tc>
+          <w:tcPr>
+            <w:tcW w:type="dxa" w:w="1584"/>
+            <w:tcMar>
+              <w:top w:w="60" w:type="dxa"/>
+              <w:bottom w:w="60" w:type="dxa"/>
+              <w:left w:w="80" w:type="dxa"/>
+              <w:right w:w="80" w:type="dxa"/>
+            </w:tcMar>
+          </w:tcPr>
+          <w:p>
+            <w:pPr>
+              <w:jc w:val="center"/>
+            </w:pPr>
+            <w:r>
+              <w:rPr>
+                <w:rFonts w:ascii="Arial" w:hAnsi="Arial"/>
+                <w:color w:val="1E293B"/>
+                <w:sz w:val="17"/>
+              </w:rPr>
+              <w:t>x-t</w:t>
+            </w:r>
+          </w:p>
+        </w:tc>
+        <w:tc>
+          <w:tcPr>
+            <w:tcW w:type="dxa" w:w="4608"/>
+            <w:tcMar>
+              <w:top w:w="60" w:type="dxa"/>
+              <w:bottom w:w="60" w:type="dxa"/>
+              <w:left w:w="80" w:type="dxa"/>
+              <w:right w:w="80" w:type="dxa"/>
+            </w:tcMar>
+          </w:tcPr>
+          <w:p>
+            <w:pPr>
+              <w:jc w:val="left"/>
+            </w:pPr>
+            <w:r>
+              <w:rPr>
+                <w:rFonts w:ascii="Arial" w:hAnsi="Arial"/>
+                <w:color w:val="1E293B"/>
+                <w:sz w:val="17"/>
+              </w:rPr>
+              <w:t>The Boundary Patrol: Trots right steadily, then doubles speed right.</w:t>
+            </w:r>
+          </w:p>
+        </w:tc>
+        <w:tc>
+          <w:tcPr>
+            <w:tcW w:type="dxa" w:w="2304"/>
+            <w:tcMar>
+              <w:top w:w="60" w:type="dxa"/>
+              <w:bottom w:w="60" w:type="dxa"/>
+              <w:left w:w="80" w:type="dxa"/>
+              <w:right w:w="80" w:type="dxa"/>
+            </w:tcMar>
+          </w:tcPr>
+          <w:p>
+            <w:pPr>
+              <w:jc w:val="center"/>
+            </w:pPr>
+            <w:r>
+              <w:rPr>
+                <w:rFonts w:ascii="Arial" w:hAnsi="Arial"/>
+                <w:color w:val="1E293B"/>
+                <w:sz w:val="17"/>
+              </w:rPr>
+              <w:t>Piecewise Constant</w:t>
+            </w:r>
+          </w:p>
+        </w:tc>
+      </w:tr>
+      <w:tr>
+        <w:tc>
+          <w:tcPr>
+            <w:tcW w:type="dxa" w:w="1296"/>
+            <w:shd w:val="clear" w:color="auto" w:fill="FDF3E8"/>
+            <w:tcMar>
+              <w:top w:w="60" w:type="dxa"/>
+              <w:bottom w:w="60" w:type="dxa"/>
+              <w:left w:w="80" w:type="dxa"/>
+              <w:right w:w="80" w:type="dxa"/>
+            </w:tcMar>
+          </w:tcPr>
+          <w:p>
+            <w:pPr>
+              <w:jc w:val="center"/>
+            </w:pPr>
+            <w:r>
+              <w:rPr>
+                <w:rFonts w:ascii="Arial" w:hAnsi="Arial"/>
+                <w:b/>
+                <w:color w:val="D67B19"/>
+                <w:sz w:val="17"/>
+              </w:rPr>
+              <w:t>#4</w:t>
+            </w:r>
+          </w:p>
+        </w:tc>
+        <w:tc>
+          <w:tcPr>
+            <w:tcW w:type="dxa" w:w="1584"/>
+            <w:shd w:val="clear" w:color="auto" w:fill="FDF3E8"/>
+            <w:tcMar>
+              <w:top w:w="60" w:type="dxa"/>
+              <w:bottom w:w="60" w:type="dxa"/>
+              <w:left w:w="80" w:type="dxa"/>
+              <w:right w:w="80" w:type="dxa"/>
+            </w:tcMar>
+          </w:tcPr>
+          <w:p>
+            <w:pPr>
+              <w:jc w:val="center"/>
+            </w:pPr>
+            <w:r>
+              <w:rPr>
+                <w:rFonts w:ascii="Arial" w:hAnsi="Arial"/>
+                <w:color w:val="1E293B"/>
+                <w:sz w:val="17"/>
+              </w:rPr>
+              <w:t>v-t</w:t>
+            </w:r>
+          </w:p>
+        </w:tc>
+        <w:tc>
+          <w:tcPr>
+            <w:tcW w:type="dxa" w:w="4608"/>
+            <w:shd w:val="clear" w:color="auto" w:fill="FDF3E8"/>
+            <w:tcMar>
+              <w:top w:w="60" w:type="dxa"/>
+              <w:bottom w:w="60" w:type="dxa"/>
+              <w:left w:w="80" w:type="dxa"/>
+              <w:right w:w="80" w:type="dxa"/>
+            </w:tcMar>
+          </w:tcPr>
+          <w:p>
+            <w:pPr>
+              <w:jc w:val="left"/>
+            </w:pPr>
+            <w:r>
+              <w:rPr>
+                <w:rFonts w:ascii="Arial" w:hAnsi="Arial"/>
+                <w:color w:val="1E293B"/>
+                <w:sz w:val="17"/>
+              </w:rPr>
+              <w:t>The Squirrel Hesitation: Slows to rest moving right, pauses, bolts left.</w:t>
+            </w:r>
+          </w:p>
+        </w:tc>
+        <w:tc>
+          <w:tcPr>
+            <w:tcW w:type="dxa" w:w="2304"/>
+            <w:shd w:val="clear" w:color="auto" w:fill="FDF3E8"/>
+            <w:tcMar>
+              <w:top w:w="60" w:type="dxa"/>
+              <w:bottom w:w="60" w:type="dxa"/>
+              <w:left w:w="80" w:type="dxa"/>
+              <w:right w:w="80" w:type="dxa"/>
+            </w:tcMar>
+          </w:tcPr>
+          <w:p>
+            <w:pPr>
+              <w:jc w:val="center"/>
+            </w:pPr>
+            <w:r>
+              <w:rPr>
+                <w:rFonts w:ascii="Arial" w:hAnsi="Arial"/>
+                <w:color w:val="1E293B"/>
+                <w:sz w:val="17"/>
+              </w:rPr>
+              <w:t>Changing Sign (+ to -)</w:t>
+            </w:r>
+          </w:p>
+        </w:tc>
+      </w:tr>
+      <w:tr>
+        <w:tc>
+          <w:tcPr>
+            <w:tcW w:type="dxa" w:w="1296"/>
+            <w:tcMar>
+              <w:top w:w="60" w:type="dxa"/>
+              <w:bottom w:w="60" w:type="dxa"/>
+              <w:left w:w="80" w:type="dxa"/>
+              <w:right w:w="80" w:type="dxa"/>
+            </w:tcMar>
+          </w:tcPr>
+          <w:p>
+            <w:pPr>
+              <w:jc w:val="center"/>
+            </w:pPr>
+            <w:r>
+              <w:rPr>
+                <w:rFonts w:ascii="Arial" w:hAnsi="Arial"/>
+                <w:b/>
+                <w:color w:val="D67B19"/>
+                <w:sz w:val="17"/>
+              </w:rPr>
+              <w:t>#5</w:t>
+            </w:r>
+          </w:p>
+        </w:tc>
+        <w:tc>
+          <w:tcPr>
+            <w:tcW w:type="dxa" w:w="1584"/>
+            <w:tcMar>
+              <w:top w:w="60" w:type="dxa"/>
+              <w:bottom w:w="60" w:type="dxa"/>
+              <w:left w:w="80" w:type="dxa"/>
+              <w:right w:w="80" w:type="dxa"/>
+            </w:tcMar>
+          </w:tcPr>
+          <w:p>
+            <w:pPr>
+              <w:jc w:val="center"/>
+            </w:pPr>
+            <w:r>
+              <w:rPr>
+                <w:rFonts w:ascii="Arial" w:hAnsi="Arial"/>
+                <w:color w:val="1E293B"/>
+                <w:sz w:val="17"/>
+              </w:rPr>
+              <w:t>x-t</w:t>
+            </w:r>
+          </w:p>
+        </w:tc>
+        <w:tc>
+          <w:tcPr>
+            <w:tcW w:type="dxa" w:w="4608"/>
+            <w:tcMar>
+              <w:top w:w="60" w:type="dxa"/>
+              <w:bottom w:w="60" w:type="dxa"/>
+              <w:left w:w="80" w:type="dxa"/>
+              <w:right w:w="80" w:type="dxa"/>
+            </w:tcMar>
+          </w:tcPr>
+          <w:p>
+            <w:pPr>
+              <w:jc w:val="left"/>
+            </w:pPr>
+            <w:r>
+              <w:rPr>
+                <w:rFonts w:ascii="Arial" w:hAnsi="Arial"/>
+                <w:color w:val="1E293B"/>
+                <w:sz w:val="17"/>
+              </w:rPr>
+              <w:t>The Steady Sniff Tour: Trots left at const speed, stops to sniff, resumes left.</w:t>
+            </w:r>
+          </w:p>
+        </w:tc>
+        <w:tc>
+          <w:tcPr>
+            <w:tcW w:type="dxa" w:w="2304"/>
+            <w:tcMar>
+              <w:top w:w="60" w:type="dxa"/>
+              <w:bottom w:w="60" w:type="dxa"/>
+              <w:left w:w="80" w:type="dxa"/>
+              <w:right w:w="80" w:type="dxa"/>
+            </w:tcMar>
+          </w:tcPr>
+          <w:p>
+            <w:pPr>
+              <w:jc w:val="center"/>
+            </w:pPr>
+            <w:r>
+              <w:rPr>
+                <w:rFonts w:ascii="Arial" w:hAnsi="Arial"/>
+                <w:color w:val="1E293B"/>
+                <w:sz w:val="17"/>
+              </w:rPr>
+              <w:t>Uniform w/ Rest Plateau</w:t>
+            </w:r>
+          </w:p>
+        </w:tc>
+      </w:tr>
+      <w:tr>
+        <w:tc>
+          <w:tcPr>
+            <w:tcW w:type="dxa" w:w="1296"/>
+            <w:shd w:val="clear" w:color="auto" w:fill="FDF3E8"/>
+            <w:tcMar>
+              <w:top w:w="60" w:type="dxa"/>
+              <w:bottom w:w="60" w:type="dxa"/>
+              <w:left w:w="80" w:type="dxa"/>
+              <w:right w:w="80" w:type="dxa"/>
+            </w:tcMar>
+          </w:tcPr>
+          <w:p>
+            <w:pPr>
+              <w:jc w:val="center"/>
+            </w:pPr>
+            <w:r>
+              <w:rPr>
+                <w:rFonts w:ascii="Arial" w:hAnsi="Arial"/>
+                <w:b/>
+                <w:color w:val="D67B19"/>
+                <w:sz w:val="17"/>
+              </w:rPr>
+              <w:t>#6</w:t>
+            </w:r>
+          </w:p>
+        </w:tc>
+        <w:tc>
+          <w:tcPr>
+            <w:tcW w:type="dxa" w:w="1584"/>
+            <w:shd w:val="clear" w:color="auto" w:fill="FDF3E8"/>
+            <w:tcMar>
+              <w:top w:w="60" w:type="dxa"/>
+              <w:bottom w:w="60" w:type="dxa"/>
+              <w:left w:w="80" w:type="dxa"/>
+              <w:right w:w="80" w:type="dxa"/>
+            </w:tcMar>
+          </w:tcPr>
+          <w:p>
+            <w:pPr>
+              <w:jc w:val="center"/>
+            </w:pPr>
+            <w:r>
+              <w:rPr>
+                <w:rFonts w:ascii="Arial" w:hAnsi="Arial"/>
+                <w:color w:val="1E293B"/>
+                <w:sz w:val="17"/>
+              </w:rPr>
+              <w:t>x-t</w:t>
+            </w:r>
+          </w:p>
+        </w:tc>
+        <w:tc>
+          <w:tcPr>
+            <w:tcW w:type="dxa" w:w="4608"/>
+            <w:shd w:val="clear" w:color="auto" w:fill="FDF3E8"/>
+            <w:tcMar>
+              <w:top w:w="60" w:type="dxa"/>
+              <w:bottom w:w="60" w:type="dxa"/>
+              <w:left w:w="80" w:type="dxa"/>
+              <w:right w:w="80" w:type="dxa"/>
+            </w:tcMar>
+          </w:tcPr>
+          <w:p>
+            <w:pPr>
+              <w:jc w:val="left"/>
+            </w:pPr>
+            <w:r>
+              <w:rPr>
+                <w:rFonts w:ascii="Arial" w:hAnsi="Arial"/>
+                <w:color w:val="1E293B"/>
+                <w:sz w:val="17"/>
+              </w:rPr>
+              <w:t>The Rebound Arc: Runs right slowing down, peaks, turns around left smoothly.</w:t>
+            </w:r>
+          </w:p>
+        </w:tc>
+        <w:tc>
+          <w:tcPr>
+            <w:tcW w:type="dxa" w:w="2304"/>
+            <w:shd w:val="clear" w:color="auto" w:fill="FDF3E8"/>
+            <w:tcMar>
+              <w:top w:w="60" w:type="dxa"/>
+              <w:bottom w:w="60" w:type="dxa"/>
+              <w:left w:w="80" w:type="dxa"/>
+              <w:right w:w="80" w:type="dxa"/>
+            </w:tcMar>
+          </w:tcPr>
+          <w:p>
+            <w:pPr>
+              <w:jc w:val="center"/>
+            </w:pPr>
+            <w:r>
+              <w:rPr>
+                <w:rFonts w:ascii="Arial" w:hAnsi="Arial"/>
+                <w:color w:val="1E293B"/>
+                <w:sz w:val="17"/>
+              </w:rPr>
+              <w:t>Continuous Apex Reversal</w:t>
+            </w:r>
+          </w:p>
+        </w:tc>
+      </w:tr>
+      <w:tr>
+        <w:tc>
+          <w:tcPr>
+            <w:tcW w:type="dxa" w:w="1296"/>
+            <w:tcMar>
+              <w:top w:w="60" w:type="dxa"/>
+              <w:bottom w:w="60" w:type="dxa"/>
+              <w:left w:w="80" w:type="dxa"/>
+              <w:right w:w="80" w:type="dxa"/>
+            </w:tcMar>
+          </w:tcPr>
+          <w:p>
+            <w:pPr>
+              <w:jc w:val="center"/>
+            </w:pPr>
+            <w:r>
+              <w:rPr>
+                <w:rFonts w:ascii="Arial" w:hAnsi="Arial"/>
+                <w:b/>
+                <w:color w:val="D67B19"/>
+                <w:sz w:val="17"/>
+              </w:rPr>
+              <w:t>#7</w:t>
+            </w:r>
+          </w:p>
+        </w:tc>
+        <w:tc>
+          <w:tcPr>
+            <w:tcW w:type="dxa" w:w="1584"/>
+            <w:tcMar>
+              <w:top w:w="60" w:type="dxa"/>
+              <w:bottom w:w="60" w:type="dxa"/>
+              <w:left w:w="80" w:type="dxa"/>
+              <w:right w:w="80" w:type="dxa"/>
+            </w:tcMar>
+          </w:tcPr>
+          <w:p>
+            <w:pPr>
+              <w:jc w:val="center"/>
+            </w:pPr>
+            <w:r>
+              <w:rPr>
+                <w:rFonts w:ascii="Arial" w:hAnsi="Arial"/>
+                <w:color w:val="1E293B"/>
+                <w:sz w:val="17"/>
+              </w:rPr>
+              <w:t>v-t</w:t>
+            </w:r>
+          </w:p>
+        </w:tc>
+        <w:tc>
+          <w:tcPr>
+            <w:tcW w:type="dxa" w:w="4608"/>
+            <w:tcMar>
+              <w:top w:w="60" w:type="dxa"/>
+              <w:bottom w:w="60" w:type="dxa"/>
+              <w:left w:w="80" w:type="dxa"/>
+              <w:right w:w="80" w:type="dxa"/>
+            </w:tcMar>
+          </w:tcPr>
+          <w:p>
+            <w:pPr>
+              <w:jc w:val="left"/>
+            </w:pPr>
+            <w:r>
+              <w:rPr>
+                <w:rFonts w:ascii="Arial" w:hAnsi="Arial"/>
+                <w:color w:val="1E293B"/>
+                <w:sz w:val="17"/>
+              </w:rPr>
+              <w:t>Launch &amp; Glide: Accelerates from rest right, then cruises at const speed.</w:t>
+            </w:r>
+          </w:p>
+        </w:tc>
+        <w:tc>
+          <w:tcPr>
+            <w:tcW w:type="dxa" w:w="2304"/>
+            <w:tcMar>
+              <w:top w:w="60" w:type="dxa"/>
+              <w:bottom w:w="60" w:type="dxa"/>
+              <w:left w:w="80" w:type="dxa"/>
+              <w:right w:w="80" w:type="dxa"/>
+            </w:tcMar>
+          </w:tcPr>
+          <w:p>
+            <w:pPr>
+              <w:jc w:val="center"/>
+            </w:pPr>
+            <w:r>
+              <w:rPr>
+                <w:rFonts w:ascii="Arial" w:hAnsi="Arial"/>
+                <w:color w:val="1E293B"/>
+                <w:sz w:val="17"/>
+              </w:rPr>
+              <w:t>Acceleration to Cruise</w:t>
+            </w:r>
+          </w:p>
+        </w:tc>
+      </w:tr>
+      <w:tr>
+        <w:tc>
+          <w:tcPr>
+            <w:tcW w:type="dxa" w:w="1296"/>
+            <w:shd w:val="clear" w:color="auto" w:fill="FDF3E8"/>
+            <w:tcMar>
+              <w:top w:w="60" w:type="dxa"/>
+              <w:bottom w:w="60" w:type="dxa"/>
+              <w:left w:w="80" w:type="dxa"/>
+              <w:right w:w="80" w:type="dxa"/>
+            </w:tcMar>
+          </w:tcPr>
+          <w:p>
+            <w:pPr>
+              <w:jc w:val="center"/>
+            </w:pPr>
+            <w:r>
+              <w:rPr>
+                <w:rFonts w:ascii="Arial" w:hAnsi="Arial"/>
+                <w:b/>
+                <w:color w:val="D67B19"/>
+                <w:sz w:val="17"/>
+              </w:rPr>
+              <w:t>#8</w:t>
+            </w:r>
+          </w:p>
+        </w:tc>
+        <w:tc>
+          <w:tcPr>
+            <w:tcW w:type="dxa" w:w="1584"/>
+            <w:shd w:val="clear" w:color="auto" w:fill="FDF3E8"/>
+            <w:tcMar>
+              <w:top w:w="60" w:type="dxa"/>
+              <w:bottom w:w="60" w:type="dxa"/>
+              <w:left w:w="80" w:type="dxa"/>
+              <w:right w:w="80" w:type="dxa"/>
+            </w:tcMar>
+          </w:tcPr>
+          <w:p>
+            <w:pPr>
+              <w:jc w:val="center"/>
+            </w:pPr>
+            <w:r>
+              <w:rPr>
+                <w:rFonts w:ascii="Arial" w:hAnsi="Arial"/>
+                <w:color w:val="1E293B"/>
+                <w:sz w:val="17"/>
+              </w:rPr>
+              <w:t>v-t</w:t>
+            </w:r>
+          </w:p>
+        </w:tc>
+        <w:tc>
+          <w:tcPr>
+            <w:tcW w:type="dxa" w:w="4608"/>
+            <w:shd w:val="clear" w:color="auto" w:fill="FDF3E8"/>
+            <w:tcMar>
+              <w:top w:w="60" w:type="dxa"/>
+              <w:bottom w:w="60" w:type="dxa"/>
+              <w:left w:w="80" w:type="dxa"/>
+              <w:right w:w="80" w:type="dxa"/>
+            </w:tcMar>
+          </w:tcPr>
+          <w:p>
+            <w:pPr>
+              <w:jc w:val="left"/>
+            </w:pPr>
+            <w:r>
+              <w:rPr>
+                <w:rFonts w:ascii="Arial" w:hAnsi="Arial"/>
+                <w:color w:val="1E293B"/>
+                <w:sz w:val="17"/>
+              </w:rPr>
+              <w:t>Leftward Zoomies: Launches from rest at right, accelerating steadily left.</w:t>
+            </w:r>
+          </w:p>
+        </w:tc>
+        <w:tc>
+          <w:tcPr>
+            <w:tcW w:type="dxa" w:w="2304"/>
+            <w:shd w:val="clear" w:color="auto" w:fill="FDF3E8"/>
+            <w:tcMar>
+              <w:top w:w="60" w:type="dxa"/>
+              <w:bottom w:w="60" w:type="dxa"/>
+              <w:left w:w="80" w:type="dxa"/>
+              <w:right w:w="80" w:type="dxa"/>
+            </w:tcMar>
+          </w:tcPr>
+          <w:p>
+            <w:pPr>
+              <w:jc w:val="center"/>
+            </w:pPr>
+            <w:r>
+              <w:rPr>
+                <w:rFonts w:ascii="Arial" w:hAnsi="Arial"/>
+                <w:color w:val="1E293B"/>
+                <w:sz w:val="17"/>
+              </w:rPr>
+              <w:t>-a (Negative Slope)</w:t>
+            </w:r>
+          </w:p>
+        </w:tc>
+      </w:tr>
+      <w:tr>
+        <w:tc>
+          <w:tcPr>
+            <w:tcW w:type="dxa" w:w="1296"/>
+            <w:tcMar>
+              <w:top w:w="60" w:type="dxa"/>
+              <w:bottom w:w="60" w:type="dxa"/>
+              <w:left w:w="80" w:type="dxa"/>
+              <w:right w:w="80" w:type="dxa"/>
+            </w:tcMar>
+          </w:tcPr>
+          <w:p>
+            <w:pPr>
+              <w:jc w:val="center"/>
+            </w:pPr>
+            <w:r>
+              <w:rPr>
+                <w:rFonts w:ascii="Arial" w:hAnsi="Arial"/>
+                <w:b/>
+                <w:color w:val="D67B19"/>
+                <w:sz w:val="17"/>
+              </w:rPr>
+              <w:t>#9</w:t>
+            </w:r>
+          </w:p>
+        </w:tc>
+        <w:tc>
+          <w:tcPr>
+            <w:tcW w:type="dxa" w:w="1584"/>
+            <w:tcMar>
+              <w:top w:w="60" w:type="dxa"/>
+              <w:bottom w:w="60" w:type="dxa"/>
+              <w:left w:w="80" w:type="dxa"/>
+              <w:right w:w="80" w:type="dxa"/>
+            </w:tcMar>
+          </w:tcPr>
+          <w:p>
+            <w:pPr>
+              <w:jc w:val="center"/>
+            </w:pPr>
+            <w:r>
+              <w:rPr>
+                <w:rFonts w:ascii="Arial" w:hAnsi="Arial"/>
+                <w:color w:val="1E293B"/>
+                <w:sz w:val="17"/>
+              </w:rPr>
+              <w:t>x-t</w:t>
+            </w:r>
+          </w:p>
+        </w:tc>
+        <w:tc>
+          <w:tcPr>
+            <w:tcW w:type="dxa" w:w="4608"/>
+            <w:tcMar>
+              <w:top w:w="60" w:type="dxa"/>
+              <w:bottom w:w="60" w:type="dxa"/>
+              <w:left w:w="80" w:type="dxa"/>
+              <w:right w:w="80" w:type="dxa"/>
+            </w:tcMar>
+          </w:tcPr>
+          <w:p>
+            <w:pPr>
+              <w:jc w:val="left"/>
+            </w:pPr>
+            <w:r>
+              <w:rPr>
+                <w:rFonts w:ascii="Arial" w:hAnsi="Arial"/>
+                <w:color w:val="1E293B"/>
+                <w:sz w:val="17"/>
+              </w:rPr>
+              <w:t>The Zig-Zag Search: Const speed right → turns const speed left → turns right.</w:t>
+            </w:r>
+          </w:p>
+        </w:tc>
+        <w:tc>
+          <w:tcPr>
+            <w:tcW w:type="dxa" w:w="2304"/>
+            <w:tcMar>
+              <w:top w:w="60" w:type="dxa"/>
+              <w:bottom w:w="60" w:type="dxa"/>
+              <w:left w:w="80" w:type="dxa"/>
+              <w:right w:w="80" w:type="dxa"/>
+            </w:tcMar>
+          </w:tcPr>
+          <w:p>
+            <w:pPr>
+              <w:jc w:val="center"/>
+            </w:pPr>
+            <w:r>
+              <w:rPr>
+                <w:rFonts w:ascii="Arial" w:hAnsi="Arial"/>
+                <w:color w:val="1E293B"/>
+                <w:sz w:val="17"/>
+              </w:rPr>
+              <w:t>Piecewise 3-Stage</w:t>
+            </w:r>
+          </w:p>
+        </w:tc>
+      </w:tr>
+      <w:tr>
+        <w:tc>
+          <w:tcPr>
+            <w:tcW w:type="dxa" w:w="1296"/>
+            <w:shd w:val="clear" w:color="auto" w:fill="FDF3E8"/>
+            <w:tcMar>
+              <w:top w:w="60" w:type="dxa"/>
+              <w:bottom w:w="60" w:type="dxa"/>
+              <w:left w:w="80" w:type="dxa"/>
+              <w:right w:w="80" w:type="dxa"/>
+            </w:tcMar>
+          </w:tcPr>
+          <w:p>
+            <w:pPr>
+              <w:jc w:val="center"/>
+            </w:pPr>
+            <w:r>
+              <w:rPr>
+                <w:rFonts w:ascii="Arial" w:hAnsi="Arial"/>
+                <w:b/>
+                <w:color w:val="D67B19"/>
+                <w:sz w:val="17"/>
+              </w:rPr>
+              <w:t>#10</w:t>
+            </w:r>
+          </w:p>
+        </w:tc>
+        <w:tc>
+          <w:tcPr>
+            <w:tcW w:type="dxa" w:w="1584"/>
+            <w:shd w:val="clear" w:color="auto" w:fill="FDF3E8"/>
+            <w:tcMar>
+              <w:top w:w="60" w:type="dxa"/>
+              <w:bottom w:w="60" w:type="dxa"/>
+              <w:left w:w="80" w:type="dxa"/>
+              <w:right w:w="80" w:type="dxa"/>
+            </w:tcMar>
+          </w:tcPr>
+          <w:p>
+            <w:pPr>
+              <w:jc w:val="center"/>
+            </w:pPr>
+            <w:r>
+              <w:rPr>
+                <w:rFonts w:ascii="Arial" w:hAnsi="Arial"/>
+                <w:color w:val="1E293B"/>
+                <w:sz w:val="17"/>
+              </w:rPr>
+              <w:t>v-t</w:t>
+            </w:r>
+          </w:p>
+        </w:tc>
+        <w:tc>
+          <w:tcPr>
+            <w:tcW w:type="dxa" w:w="4608"/>
+            <w:shd w:val="clear" w:color="auto" w:fill="FDF3E8"/>
+            <w:tcMar>
+              <w:top w:w="60" w:type="dxa"/>
+              <w:bottom w:w="60" w:type="dxa"/>
+              <w:left w:w="80" w:type="dxa"/>
+              <w:right w:w="80" w:type="dxa"/>
+            </w:tcMar>
+          </w:tcPr>
+          <w:p>
+            <w:pPr>
+              <w:jc w:val="left"/>
+            </w:pPr>
+            <w:r>
+              <w:rPr>
+                <w:rFonts w:ascii="Arial" w:hAnsi="Arial"/>
+                <w:color w:val="1E293B"/>
+                <w:sz w:val="17"/>
+              </w:rPr>
+              <w:t>The Bell-Curve Trot: Accelerates right from rest → cruises → decelerates to rest.</w:t>
+            </w:r>
+          </w:p>
+        </w:tc>
+        <w:tc>
+          <w:tcPr>
+            <w:tcW w:type="dxa" w:w="2304"/>
+            <w:shd w:val="clear" w:color="auto" w:fill="FDF3E8"/>
+            <w:tcMar>
+              <w:top w:w="60" w:type="dxa"/>
+              <w:bottom w:w="60" w:type="dxa"/>
+              <w:left w:w="80" w:type="dxa"/>
+              <w:right w:w="80" w:type="dxa"/>
+            </w:tcMar>
+          </w:tcPr>
+          <w:p>
+            <w:pPr>
+              <w:jc w:val="center"/>
+            </w:pPr>
+            <w:r>
+              <w:rPr>
+                <w:rFonts w:ascii="Arial" w:hAnsi="Arial"/>
+                <w:color w:val="1E293B"/>
+                <w:sz w:val="17"/>
+              </w:rPr>
+              <w:t>Trapezoidal Profile</w:t>
+            </w:r>
+          </w:p>
+        </w:tc>
+      </w:tr>
+    </w:tbl>
     <w:sectPr>
       <w:pgSz w:w="12240" w:h="15840"/>
-      <w:pgMar w:top="1080" w:right="1080" w:bottom="1080" w:left="1080" w:header="720" w:footer="720" w:gutter="0"/>
+      <w:pgMar w:top="1008" w:right="1008" w:bottom="1008" w:left="1008" w:header="720" w:footer="720" w:gutter="0"/>
       <w:cols w:space="720"/>
       <w:docGrid w:linePitch="360"/>
     </w:sectPr>

</xml_diff>